<commit_message>
Day 3: Added PV model updates and irradiance sweep results
</commit_message>
<xml_diff>
--- a/docs/Solar Audio Amplifier d2d track.docx
+++ b/docs/Solar Audio Amplifier d2d track.docx
@@ -13,7 +13,15 @@
       </w:r>
     </w:p>
     <w:p>
+      <w:pPr>
+        <w:rPr>
+          <w:ins w:id="0" w:author="Lenovo" w:date="2026-06-17T21:07:00Z" w16du:dateUtc="2026-06-17T15:37:00Z"/>
+        </w:rPr>
+      </w:pPr>
       <w:r>
+        <w:rPr>
+          <w:noProof/>
+        </w:rPr>
         <w:drawing>
           <wp:inline distT="0" distB="0" distL="0" distR="0" wp14:anchorId="61262D9B" wp14:editId="34504197">
             <wp:extent cx="5731510" cy="2997200"/>
@@ -30,7 +38,7 @@
                     <pic:cNvPicPr/>
                   </pic:nvPicPr>
                   <pic:blipFill>
-                    <a:blip r:embed="rId4"/>
+                    <a:blip r:embed="rId5"/>
                     <a:stretch>
                       <a:fillRect/>
                     </a:stretch>
@@ -51,6 +59,9 @@
         </w:drawing>
       </w:r>
       <w:r>
+        <w:rPr>
+          <w:noProof/>
+        </w:rPr>
         <w:drawing>
           <wp:inline distT="0" distB="0" distL="0" distR="0" wp14:anchorId="0978BC40" wp14:editId="773E43E4">
             <wp:extent cx="5731510" cy="3014980"/>
@@ -67,7 +78,7 @@
                     <pic:cNvPicPr/>
                   </pic:nvPicPr>
                   <pic:blipFill>
-                    <a:blip r:embed="rId5"/>
+                    <a:blip r:embed="rId6"/>
                     <a:stretch>
                       <a:fillRect/>
                     </a:stretch>
@@ -88,6 +99,605 @@
         </w:drawing>
       </w:r>
     </w:p>
+    <w:p>
+      <w:pPr>
+        <w:rPr>
+          <w:ins w:id="1" w:author="Lenovo" w:date="2026-06-17T21:07:00Z" w16du:dateUtc="2026-06-17T15:37:00Z"/>
+        </w:rPr>
+      </w:pPr>
+      <w:ins w:id="2" w:author="Lenovo" w:date="2026-06-17T21:07:00Z" w16du:dateUtc="2026-06-17T15:37:00Z">
+        <w:r>
+          <w:t>DAY2</w:t>
+        </w:r>
+      </w:ins>
+    </w:p>
+    <w:p>
+      <w:pPr>
+        <w:rPr>
+          <w:ins w:id="3" w:author="Lenovo" w:date="2026-06-17T21:07:00Z" w16du:dateUtc="2026-06-17T15:37:00Z"/>
+        </w:rPr>
+      </w:pPr>
+      <w:ins w:id="4" w:author="Lenovo" w:date="2026-06-17T21:07:00Z" w16du:dateUtc="2026-06-17T15:37:00Z">
+        <w:r>
+          <w:t>## June 16</w:t>
+        </w:r>
+      </w:ins>
+    </w:p>
+    <w:p>
+      <w:pPr>
+        <w:rPr>
+          <w:ins w:id="5" w:author="Lenovo" w:date="2026-06-17T21:07:00Z" w16du:dateUtc="2026-06-17T15:37:00Z"/>
+        </w:rPr>
+      </w:pPr>
+      <w:ins w:id="6" w:author="Lenovo" w:date="2026-06-17T21:07:00Z" w16du:dateUtc="2026-06-17T15:37:00Z">
+        <w:r>
+          <w:t>Built and simulated a silicon diode in PSpice.</w:t>
+        </w:r>
+      </w:ins>
+    </w:p>
+    <w:p>
+      <w:pPr>
+        <w:rPr>
+          <w:ins w:id="7" w:author="Lenovo" w:date="2026-06-17T21:07:00Z" w16du:dateUtc="2026-06-17T15:37:00Z"/>
+        </w:rPr>
+      </w:pPr>
+      <w:ins w:id="8" w:author="Lenovo" w:date="2026-06-17T21:07:00Z" w16du:dateUtc="2026-06-17T15:37:00Z">
+        <w:r>
+          <w:t xml:space="preserve">Performed a DC voltage </w:t>
+        </w:r>
+        <w:proofErr w:type="gramStart"/>
+        <w:r>
+          <w:t>sweep</w:t>
+        </w:r>
+        <w:proofErr w:type="gramEnd"/>
+        <w:r>
+          <w:t xml:space="preserve"> and obtained the diode I-V characteristic.</w:t>
+        </w:r>
+      </w:ins>
+    </w:p>
+    <w:p>
+      <w:pPr>
+        <w:rPr>
+          <w:ins w:id="9" w:author="Lenovo" w:date="2026-06-17T21:07:00Z" w16du:dateUtc="2026-06-17T15:37:00Z"/>
+        </w:rPr>
+      </w:pPr>
+      <w:ins w:id="10" w:author="Lenovo" w:date="2026-06-17T21:07:00Z" w16du:dateUtc="2026-06-17T15:37:00Z">
+        <w:r>
+          <w:t>Observed exponential current growth with increasing forward bias.</w:t>
+        </w:r>
+      </w:ins>
+    </w:p>
+    <w:p>
+      <w:pPr>
+        <w:rPr>
+          <w:ins w:id="11" w:author="Lenovo" w:date="2026-06-17T21:07:00Z" w16du:dateUtc="2026-06-17T15:37:00Z"/>
+        </w:rPr>
+      </w:pPr>
+      <w:ins w:id="12" w:author="Lenovo" w:date="2026-06-17T21:07:00Z" w16du:dateUtc="2026-06-17T15:37:00Z">
+        <w:r>
+          <w:t xml:space="preserve">This serves as a precursor to photovoltaic cell </w:t>
+        </w:r>
+        <w:proofErr w:type="spellStart"/>
+        <w:r>
+          <w:t>modeling</w:t>
+        </w:r>
+        <w:proofErr w:type="spellEnd"/>
+        <w:r>
+          <w:t>, since the solar-cell equivalent circuit is fundamentally diode-based.</w:t>
+        </w:r>
+      </w:ins>
+    </w:p>
+    <w:p>
+      <w:pPr>
+        <w:rPr>
+          <w:ins w:id="13" w:author="Lenovo" w:date="2026-06-17T21:07:00Z" w16du:dateUtc="2026-06-17T15:37:00Z"/>
+        </w:rPr>
+      </w:pPr>
+      <w:ins w:id="14" w:author="Lenovo" w:date="2026-06-17T21:07:00Z" w16du:dateUtc="2026-06-17T15:37:00Z">
+        <w:r>
+          <w:rPr>
+            <w:noProof/>
+          </w:rPr>
+          <w:drawing>
+            <wp:inline distT="0" distB="0" distL="0" distR="0" wp14:anchorId="5351B764" wp14:editId="00F553DE">
+              <wp:extent cx="2883048" cy="1670136"/>
+              <wp:effectExtent l="0" t="0" r="0" b="6350"/>
+              <wp:docPr id="1332377184" name="Picture 1"/>
+              <wp:cNvGraphicFramePr>
+                <a:graphicFrameLocks xmlns:a="http://schemas.openxmlformats.org/drawingml/2006/main" noChangeAspect="1"/>
+              </wp:cNvGraphicFramePr>
+              <a:graphic xmlns:a="http://schemas.openxmlformats.org/drawingml/2006/main">
+                <a:graphicData uri="http://schemas.openxmlformats.org/drawingml/2006/picture">
+                  <pic:pic xmlns:pic="http://schemas.openxmlformats.org/drawingml/2006/picture">
+                    <pic:nvPicPr>
+                      <pic:cNvPr id="1332377184" name=""/>
+                      <pic:cNvPicPr/>
+                    </pic:nvPicPr>
+                    <pic:blipFill>
+                      <a:blip r:embed="rId7"/>
+                      <a:stretch>
+                        <a:fillRect/>
+                      </a:stretch>
+                    </pic:blipFill>
+                    <pic:spPr>
+                      <a:xfrm>
+                        <a:off x="0" y="0"/>
+                        <a:ext cx="2883048" cy="1670136"/>
+                      </a:xfrm>
+                      <a:prstGeom prst="rect">
+                        <a:avLst/>
+                      </a:prstGeom>
+                    </pic:spPr>
+                  </pic:pic>
+                </a:graphicData>
+              </a:graphic>
+            </wp:inline>
+          </w:drawing>
+        </w:r>
+      </w:ins>
+    </w:p>
+    <w:p>
+      <w:pPr>
+        <w:rPr>
+          <w:ins w:id="15" w:author="Lenovo" w:date="2026-06-17T21:07:00Z" w16du:dateUtc="2026-06-17T15:37:00Z"/>
+        </w:rPr>
+      </w:pPr>
+      <w:ins w:id="16" w:author="Lenovo" w:date="2026-06-17T21:07:00Z" w16du:dateUtc="2026-06-17T15:37:00Z">
+        <w:r>
+          <w:rPr>
+            <w:noProof/>
+          </w:rPr>
+          <w:drawing>
+            <wp:inline distT="0" distB="0" distL="0" distR="0" wp14:anchorId="5E9F2BA3" wp14:editId="1B59EAB4">
+              <wp:extent cx="5731510" cy="3006090"/>
+              <wp:effectExtent l="0" t="0" r="2540" b="3810"/>
+              <wp:docPr id="2036786483" name="Picture 1"/>
+              <wp:cNvGraphicFramePr>
+                <a:graphicFrameLocks xmlns:a="http://schemas.openxmlformats.org/drawingml/2006/main" noChangeAspect="1"/>
+              </wp:cNvGraphicFramePr>
+              <a:graphic xmlns:a="http://schemas.openxmlformats.org/drawingml/2006/main">
+                <a:graphicData uri="http://schemas.openxmlformats.org/drawingml/2006/picture">
+                  <pic:pic xmlns:pic="http://schemas.openxmlformats.org/drawingml/2006/picture">
+                    <pic:nvPicPr>
+                      <pic:cNvPr id="2036786483" name=""/>
+                      <pic:cNvPicPr/>
+                    </pic:nvPicPr>
+                    <pic:blipFill>
+                      <a:blip r:embed="rId8"/>
+                      <a:stretch>
+                        <a:fillRect/>
+                      </a:stretch>
+                    </pic:blipFill>
+                    <pic:spPr>
+                      <a:xfrm>
+                        <a:off x="0" y="0"/>
+                        <a:ext cx="5731510" cy="3006090"/>
+                      </a:xfrm>
+                      <a:prstGeom prst="rect">
+                        <a:avLst/>
+                      </a:prstGeom>
+                    </pic:spPr>
+                  </pic:pic>
+                </a:graphicData>
+              </a:graphic>
+            </wp:inline>
+          </w:drawing>
+        </w:r>
+      </w:ins>
+    </w:p>
+    <w:p>
+      <w:pPr>
+        <w:rPr>
+          <w:ins w:id="17" w:author="Lenovo" w:date="2026-06-17T21:07:00Z" w16du:dateUtc="2026-06-17T15:37:00Z"/>
+        </w:rPr>
+      </w:pPr>
+      <w:ins w:id="18" w:author="Lenovo" w:date="2026-06-17T21:07:00Z" w16du:dateUtc="2026-06-17T15:37:00Z">
+        <w:r>
+          <w:t>On removing the Resistance and adding a current source instead</w:t>
+        </w:r>
+      </w:ins>
+    </w:p>
+    <w:p>
+      <w:pPr>
+        <w:rPr>
+          <w:ins w:id="19" w:author="Lenovo" w:date="2026-06-17T21:07:00Z" w16du:dateUtc="2026-06-17T15:37:00Z"/>
+        </w:rPr>
+      </w:pPr>
+      <w:ins w:id="20" w:author="Lenovo" w:date="2026-06-17T21:07:00Z" w16du:dateUtc="2026-06-17T15:37:00Z">
+        <w:r>
+          <w:rPr>
+            <w:noProof/>
+          </w:rPr>
+          <w:drawing>
+            <wp:inline distT="0" distB="0" distL="0" distR="0" wp14:anchorId="638DBC34" wp14:editId="4F79F54D">
+              <wp:extent cx="2603634" cy="1803493"/>
+              <wp:effectExtent l="0" t="0" r="6350" b="6350"/>
+              <wp:docPr id="1659308948" name="Picture 1"/>
+              <wp:cNvGraphicFramePr>
+                <a:graphicFrameLocks xmlns:a="http://schemas.openxmlformats.org/drawingml/2006/main" noChangeAspect="1"/>
+              </wp:cNvGraphicFramePr>
+              <a:graphic xmlns:a="http://schemas.openxmlformats.org/drawingml/2006/main">
+                <a:graphicData uri="http://schemas.openxmlformats.org/drawingml/2006/picture">
+                  <pic:pic xmlns:pic="http://schemas.openxmlformats.org/drawingml/2006/picture">
+                    <pic:nvPicPr>
+                      <pic:cNvPr id="1659308948" name=""/>
+                      <pic:cNvPicPr/>
+                    </pic:nvPicPr>
+                    <pic:blipFill>
+                      <a:blip r:embed="rId9"/>
+                      <a:stretch>
+                        <a:fillRect/>
+                      </a:stretch>
+                    </pic:blipFill>
+                    <pic:spPr>
+                      <a:xfrm>
+                        <a:off x="0" y="0"/>
+                        <a:ext cx="2603634" cy="1803493"/>
+                      </a:xfrm>
+                      <a:prstGeom prst="rect">
+                        <a:avLst/>
+                      </a:prstGeom>
+                    </pic:spPr>
+                  </pic:pic>
+                </a:graphicData>
+              </a:graphic>
+            </wp:inline>
+          </w:drawing>
+        </w:r>
+      </w:ins>
+    </w:p>
+    <w:p>
+      <w:pPr>
+        <w:rPr>
+          <w:ins w:id="21" w:author="Lenovo" w:date="2026-06-17T21:07:00Z" w16du:dateUtc="2026-06-17T15:37:00Z"/>
+        </w:rPr>
+      </w:pPr>
+      <w:ins w:id="22" w:author="Lenovo" w:date="2026-06-17T21:07:00Z" w16du:dateUtc="2026-06-17T15:37:00Z">
+        <w:r>
+          <w:rPr>
+            <w:noProof/>
+          </w:rPr>
+          <w:drawing>
+            <wp:inline distT="0" distB="0" distL="0" distR="0" wp14:anchorId="14C45FB8" wp14:editId="4C98DA07">
+              <wp:extent cx="5731510" cy="3021330"/>
+              <wp:effectExtent l="0" t="0" r="2540" b="7620"/>
+              <wp:docPr id="1162972182" name="Picture 1"/>
+              <wp:cNvGraphicFramePr>
+                <a:graphicFrameLocks xmlns:a="http://schemas.openxmlformats.org/drawingml/2006/main" noChangeAspect="1"/>
+              </wp:cNvGraphicFramePr>
+              <a:graphic xmlns:a="http://schemas.openxmlformats.org/drawingml/2006/main">
+                <a:graphicData uri="http://schemas.openxmlformats.org/drawingml/2006/picture">
+                  <pic:pic xmlns:pic="http://schemas.openxmlformats.org/drawingml/2006/picture">
+                    <pic:nvPicPr>
+                      <pic:cNvPr id="1162972182" name=""/>
+                      <pic:cNvPicPr/>
+                    </pic:nvPicPr>
+                    <pic:blipFill>
+                      <a:blip r:embed="rId10"/>
+                      <a:stretch>
+                        <a:fillRect/>
+                      </a:stretch>
+                    </pic:blipFill>
+                    <pic:spPr>
+                      <a:xfrm>
+                        <a:off x="0" y="0"/>
+                        <a:ext cx="5731510" cy="3021330"/>
+                      </a:xfrm>
+                      <a:prstGeom prst="rect">
+                        <a:avLst/>
+                      </a:prstGeom>
+                    </pic:spPr>
+                  </pic:pic>
+                </a:graphicData>
+              </a:graphic>
+            </wp:inline>
+          </w:drawing>
+        </w:r>
+      </w:ins>
+    </w:p>
+    <w:p>
+      <w:pPr>
+        <w:rPr>
+          <w:ins w:id="23" w:author="Lenovo" w:date="2026-06-17T21:07:00Z" w16du:dateUtc="2026-06-17T15:37:00Z"/>
+        </w:rPr>
+      </w:pPr>
+      <w:ins w:id="24" w:author="Lenovo" w:date="2026-06-17T21:07:00Z" w16du:dateUtc="2026-06-17T15:37:00Z">
+        <w:r>
+          <w:t>DAY-3</w:t>
+        </w:r>
+      </w:ins>
+    </w:p>
+    <w:p>
+      <w:pPr>
+        <w:rPr>
+          <w:ins w:id="25" w:author="Lenovo" w:date="2026-06-17T21:07:00Z" w16du:dateUtc="2026-06-17T15:37:00Z"/>
+        </w:rPr>
+      </w:pPr>
+      <w:ins w:id="26" w:author="Lenovo" w:date="2026-06-17T21:07:00Z" w16du:dateUtc="2026-06-17T15:37:00Z">
+        <w:r>
+          <w:t>Day 3 – PV Model Improvement</w:t>
+        </w:r>
+      </w:ins>
+    </w:p>
+    <w:p>
+      <w:pPr>
+        <w:numPr>
+          <w:ilvl w:val="0"/>
+          <w:numId w:val="1"/>
+        </w:numPr>
+        <w:rPr>
+          <w:ins w:id="27" w:author="Lenovo" w:date="2026-06-17T21:07:00Z" w16du:dateUtc="2026-06-17T15:37:00Z"/>
+        </w:rPr>
+      </w:pPr>
+      <w:ins w:id="28" w:author="Lenovo" w:date="2026-06-17T21:07:00Z" w16du:dateUtc="2026-06-17T15:37:00Z">
+        <w:r>
+          <w:t>Added series resistance (Rs) and shunt resistance (</w:t>
+        </w:r>
+        <w:proofErr w:type="spellStart"/>
+        <w:r>
+          <w:t>Rsh</w:t>
+        </w:r>
+        <w:proofErr w:type="spellEnd"/>
+        <w:r>
+          <w:t>) to the single-diode PV model.</w:t>
+        </w:r>
+      </w:ins>
+    </w:p>
+    <w:p>
+      <w:pPr>
+        <w:numPr>
+          <w:ilvl w:val="0"/>
+          <w:numId w:val="1"/>
+        </w:numPr>
+        <w:rPr>
+          <w:ins w:id="29" w:author="Lenovo" w:date="2026-06-17T21:07:00Z" w16du:dateUtc="2026-06-17T15:37:00Z"/>
+        </w:rPr>
+      </w:pPr>
+      <w:ins w:id="30" w:author="Lenovo" w:date="2026-06-17T21:07:00Z" w16du:dateUtc="2026-06-17T15:37:00Z">
+        <w:r>
+          <w:t xml:space="preserve">Tested different Rs and </w:t>
+        </w:r>
+        <w:proofErr w:type="spellStart"/>
+        <w:r>
+          <w:t>Rsh</w:t>
+        </w:r>
+        <w:proofErr w:type="spellEnd"/>
+        <w:r>
+          <w:t xml:space="preserve"> values in PSpice.</w:t>
+        </w:r>
+      </w:ins>
+    </w:p>
+    <w:p>
+      <w:pPr>
+        <w:numPr>
+          <w:ilvl w:val="0"/>
+          <w:numId w:val="1"/>
+        </w:numPr>
+        <w:rPr>
+          <w:ins w:id="31" w:author="Lenovo" w:date="2026-06-17T21:07:00Z" w16du:dateUtc="2026-06-17T15:37:00Z"/>
+        </w:rPr>
+      </w:pPr>
+      <w:ins w:id="32" w:author="Lenovo" w:date="2026-06-17T21:07:00Z" w16du:dateUtc="2026-06-17T15:37:00Z">
+        <w:r>
+          <w:t>Learned that circuit topology affects simulation results significantly.</w:t>
+        </w:r>
+      </w:ins>
+    </w:p>
+    <w:p>
+      <w:pPr>
+        <w:numPr>
+          <w:ilvl w:val="0"/>
+          <w:numId w:val="1"/>
+        </w:numPr>
+        <w:rPr>
+          <w:ins w:id="33" w:author="Lenovo" w:date="2026-06-17T21:07:00Z" w16du:dateUtc="2026-06-17T15:37:00Z"/>
+        </w:rPr>
+      </w:pPr>
+      <w:ins w:id="34" w:author="Lenovo" w:date="2026-06-17T21:07:00Z" w16du:dateUtc="2026-06-17T15:37:00Z">
+        <w:r>
+          <w:t>Connected a load resistor (RL) and obtained a stable output voltage.</w:t>
+        </w:r>
+      </w:ins>
+    </w:p>
+    <w:p>
+      <w:pPr>
+        <w:numPr>
+          <w:ilvl w:val="0"/>
+          <w:numId w:val="1"/>
+        </w:numPr>
+        <w:rPr>
+          <w:ins w:id="35" w:author="Lenovo" w:date="2026-06-17T21:07:00Z" w16du:dateUtc="2026-06-17T15:37:00Z"/>
+        </w:rPr>
+      </w:pPr>
+      <w:ins w:id="36" w:author="Lenovo" w:date="2026-06-17T21:07:00Z" w16du:dateUtc="2026-06-17T15:37:00Z">
+        <w:r>
+          <w:t>Performed an irradiance (</w:t>
+        </w:r>
+        <w:proofErr w:type="spellStart"/>
+        <w:r>
+          <w:t>Iph</w:t>
+        </w:r>
+        <w:proofErr w:type="spellEnd"/>
+        <w:r>
+          <w:t>) sweep from 0.1 A to 1.0 A.</w:t>
+        </w:r>
+      </w:ins>
+    </w:p>
+    <w:p>
+      <w:pPr>
+        <w:numPr>
+          <w:ilvl w:val="0"/>
+          <w:numId w:val="1"/>
+        </w:numPr>
+        <w:rPr>
+          <w:ins w:id="37" w:author="Lenovo" w:date="2026-06-17T21:07:00Z" w16du:dateUtc="2026-06-17T15:37:00Z"/>
+        </w:rPr>
+      </w:pPr>
+      <w:ins w:id="38" w:author="Lenovo" w:date="2026-06-17T21:07:00Z" w16du:dateUtc="2026-06-17T15:37:00Z">
+        <w:r>
+          <w:t>Observed output voltage increase from approximately 0.81 V to 0.96 V with increasing irradiance.</w:t>
+        </w:r>
+      </w:ins>
+    </w:p>
+    <w:p>
+      <w:pPr>
+        <w:rPr>
+          <w:ins w:id="39" w:author="Lenovo" w:date="2026-06-17T21:07:00Z" w16du:dateUtc="2026-06-17T15:37:00Z"/>
+        </w:rPr>
+      </w:pPr>
+      <w:ins w:id="40" w:author="Lenovo" w:date="2026-06-17T21:07:00Z" w16du:dateUtc="2026-06-17T15:37:00Z">
+        <w:r>
+          <w:rPr>
+            <w:noProof/>
+          </w:rPr>
+          <w:drawing>
+            <wp:inline distT="0" distB="0" distL="0" distR="0" wp14:anchorId="1EF123A0" wp14:editId="23F065E0">
+              <wp:extent cx="4515082" cy="1994002"/>
+              <wp:effectExtent l="0" t="0" r="0" b="6350"/>
+              <wp:docPr id="1235556243" name="Picture 1"/>
+              <wp:cNvGraphicFramePr>
+                <a:graphicFrameLocks xmlns:a="http://schemas.openxmlformats.org/drawingml/2006/main" noChangeAspect="1"/>
+              </wp:cNvGraphicFramePr>
+              <a:graphic xmlns:a="http://schemas.openxmlformats.org/drawingml/2006/main">
+                <a:graphicData uri="http://schemas.openxmlformats.org/drawingml/2006/picture">
+                  <pic:pic xmlns:pic="http://schemas.openxmlformats.org/drawingml/2006/picture">
+                    <pic:nvPicPr>
+                      <pic:cNvPr id="1235556243" name=""/>
+                      <pic:cNvPicPr/>
+                    </pic:nvPicPr>
+                    <pic:blipFill>
+                      <a:blip r:embed="rId11"/>
+                      <a:stretch>
+                        <a:fillRect/>
+                      </a:stretch>
+                    </pic:blipFill>
+                    <pic:spPr>
+                      <a:xfrm>
+                        <a:off x="0" y="0"/>
+                        <a:ext cx="4515082" cy="1994002"/>
+                      </a:xfrm>
+                      <a:prstGeom prst="rect">
+                        <a:avLst/>
+                      </a:prstGeom>
+                    </pic:spPr>
+                  </pic:pic>
+                </a:graphicData>
+              </a:graphic>
+            </wp:inline>
+          </w:drawing>
+        </w:r>
+      </w:ins>
+    </w:p>
+    <w:p>
+      <w:pPr>
+        <w:rPr>
+          <w:ins w:id="41" w:author="Lenovo" w:date="2026-06-17T21:07:00Z" w16du:dateUtc="2026-06-17T15:37:00Z"/>
+        </w:rPr>
+      </w:pPr>
+      <w:ins w:id="42" w:author="Lenovo" w:date="2026-06-17T21:07:00Z" w16du:dateUtc="2026-06-17T15:37:00Z">
+        <w:r>
+          <w:t>Circuit used</w:t>
+        </w:r>
+      </w:ins>
+    </w:p>
+    <w:p>
+      <w:pPr>
+        <w:rPr>
+          <w:ins w:id="43" w:author="Lenovo" w:date="2026-06-17T21:07:00Z" w16du:dateUtc="2026-06-17T15:37:00Z"/>
+        </w:rPr>
+      </w:pPr>
+      <w:ins w:id="44" w:author="Lenovo" w:date="2026-06-17T21:07:00Z" w16du:dateUtc="2026-06-17T15:37:00Z">
+        <w:r>
+          <w:rPr>
+            <w:noProof/>
+          </w:rPr>
+          <w:drawing>
+            <wp:inline distT="0" distB="0" distL="0" distR="0" wp14:anchorId="5881176B" wp14:editId="6B6C43ED">
+              <wp:extent cx="5731510" cy="1818640"/>
+              <wp:effectExtent l="0" t="0" r="2540" b="0"/>
+              <wp:docPr id="557308909" name="Picture 1"/>
+              <wp:cNvGraphicFramePr>
+                <a:graphicFrameLocks xmlns:a="http://schemas.openxmlformats.org/drawingml/2006/main" noChangeAspect="1"/>
+              </wp:cNvGraphicFramePr>
+              <a:graphic xmlns:a="http://schemas.openxmlformats.org/drawingml/2006/main">
+                <a:graphicData uri="http://schemas.openxmlformats.org/drawingml/2006/picture">
+                  <pic:pic xmlns:pic="http://schemas.openxmlformats.org/drawingml/2006/picture">
+                    <pic:nvPicPr>
+                      <pic:cNvPr id="557308909" name=""/>
+                      <pic:cNvPicPr/>
+                    </pic:nvPicPr>
+                    <pic:blipFill>
+                      <a:blip r:embed="rId12"/>
+                      <a:stretch>
+                        <a:fillRect/>
+                      </a:stretch>
+                    </pic:blipFill>
+                    <pic:spPr>
+                      <a:xfrm>
+                        <a:off x="0" y="0"/>
+                        <a:ext cx="5731510" cy="1818640"/>
+                      </a:xfrm>
+                      <a:prstGeom prst="rect">
+                        <a:avLst/>
+                      </a:prstGeom>
+                    </pic:spPr>
+                  </pic:pic>
+                </a:graphicData>
+              </a:graphic>
+            </wp:inline>
+          </w:drawing>
+        </w:r>
+      </w:ins>
+    </w:p>
+    <w:p>
+      <w:pPr>
+        <w:rPr>
+          <w:ins w:id="45" w:author="Lenovo" w:date="2026-06-17T21:07:00Z" w16du:dateUtc="2026-06-17T15:37:00Z"/>
+        </w:rPr>
+      </w:pPr>
+      <w:ins w:id="46" w:author="Lenovo" w:date="2026-06-17T21:07:00Z" w16du:dateUtc="2026-06-17T15:37:00Z">
+        <w:r>
+          <w:t xml:space="preserve">Irradiance </w:t>
+        </w:r>
+        <w:proofErr w:type="gramStart"/>
+        <w:r>
+          <w:t xml:space="preserve">( </w:t>
+        </w:r>
+        <w:proofErr w:type="spellStart"/>
+        <w:r>
+          <w:t>Iph</w:t>
+        </w:r>
+        <w:proofErr w:type="spellEnd"/>
+        <w:proofErr w:type="gramEnd"/>
+        <w:r>
+          <w:t xml:space="preserve"> ) sweep</w:t>
+        </w:r>
+      </w:ins>
+    </w:p>
+    <w:p>
+      <w:pPr>
+        <w:rPr>
+          <w:ins w:id="47" w:author="Lenovo" w:date="2026-06-17T21:07:00Z" w16du:dateUtc="2026-06-17T15:37:00Z"/>
+        </w:rPr>
+      </w:pPr>
+      <w:ins w:id="48" w:author="Lenovo" w:date="2026-06-17T21:07:00Z" w16du:dateUtc="2026-06-17T15:37:00Z">
+        <w:r>
+          <w:t>Conclusion:</w:t>
+        </w:r>
+        <w:r>
+          <w:br/>
+          <w:t>The PV model responds correctly to changes in illumination. Higher irradiance produces higher output voltage, indicating increased power generation capability.</w:t>
+        </w:r>
+      </w:ins>
+    </w:p>
+    <w:p>
+      <w:pPr>
+        <w:rPr>
+          <w:ins w:id="49" w:author="Lenovo" w:date="2026-06-17T21:07:00Z" w16du:dateUtc="2026-06-17T15:37:00Z"/>
+        </w:rPr>
+      </w:pPr>
+    </w:p>
+    <w:p/>
     <w:sectPr>
       <w:pgSz w:w="11906" w:h="16838"/>
       <w:pgMar w:top="1440" w:right="1440" w:bottom="1440" w:left="1440" w:header="708" w:footer="708" w:gutter="0"/>
@@ -96,6 +706,171 @@
     </w:sectPr>
   </w:body>
 </w:document>
+</file>
+
+<file path=word/numbering.xml><?xml version="1.0" encoding="utf-8"?>
+<w:numbering xmlns:wpc="http://schemas.microsoft.com/office/word/2010/wordprocessingCanvas" xmlns:cx="http://schemas.microsoft.com/office/drawing/2014/chartex" xmlns:cx1="http://schemas.microsoft.com/office/drawing/2015/9/8/chartex" xmlns:cx2="http://schemas.microsoft.com/office/drawing/2015/10/21/chartex" xmlns:cx3="http://schemas.microsoft.com/office/drawing/2016/5/9/chartex" xmlns:cx4="http://schemas.microsoft.com/office/drawing/2016/5/10/chartex" xmlns:cx5="http://schemas.microsoft.com/office/drawing/2016/5/11/chartex" xmlns:cx6="http://schemas.microsoft.com/office/drawing/2016/5/12/chartex" xmlns:cx7="http://schemas.microsoft.com/office/drawing/2016/5/13/chartex" xmlns:cx8="http://schemas.microsoft.com/office/drawing/2016/5/14/chartex" xmlns:mc="http://schemas.openxmlformats.org/markup-compatibility/2006" xmlns:aink="http://schemas.microsoft.com/office/drawing/2016/ink" xmlns:am3d="http://schemas.microsoft.com/office/drawing/2017/model3d" xmlns:o="urn:schemas-microsoft-com:office:office" xmlns:oel="http://schemas.microsoft.com/office/2019/extlst" xmlns:r="http://schemas.openxmlformats.org/officeDocument/2006/relationships" xmlns:m="http://schemas.openxmlformats.org/officeDocument/2006/math" xmlns:v="urn:schemas-microsoft-com:vml" xmlns:wp14="http://schemas.microsoft.com/office/word/2010/wordprocessingDrawing" xmlns:wp="http://schemas.openxmlformats.org/drawingml/2006/wordprocessingDrawing" xmlns:w10="urn:schemas-microsoft-com:office:word" xmlns:w="http://schemas.openxmlformats.org/wordprocessingml/2006/main" xmlns:w14="http://schemas.microsoft.com/office/word/2010/wordml" xmlns:w15="http://schemas.microsoft.com/office/word/2012/wordml" xmlns:w16cex="http://schemas.microsoft.com/office/word/2018/wordml/cex" xmlns:w16cid="http://schemas.microsoft.com/office/word/2016/wordml/cid" xmlns:w16="http://schemas.microsoft.com/office/word/2018/wordml" xmlns:w16du="http://schemas.microsoft.com/office/word/2023/wordml/word16du" xmlns:w16sdtdh="http://schemas.microsoft.com/office/word/2020/wordml/sdtdatahash" xmlns:w16sdtfl="http://schemas.microsoft.com/office/word/2024/wordml/sdtformatlock" xmlns:w16se="http://schemas.microsoft.com/office/word/2015/wordml/symex" xmlns:wpg="http://schemas.microsoft.com/office/word/2010/wordprocessingGroup" xmlns:wpi="http://schemas.microsoft.com/office/word/2010/wordprocessingInk" xmlns:wne="http://schemas.microsoft.com/office/word/2006/wordml" xmlns:wps="http://schemas.microsoft.com/office/word/2010/wordprocessingShape" mc:Ignorable="w14 w15 w16se w16cid w16 w16cex w16sdtdh w16sdtfl w16du wp14">
+  <w:abstractNum w:abstractNumId="0" w15:restartNumberingAfterBreak="0">
+    <w:nsid w:val="211E4489"/>
+    <w:multiLevelType w:val="multilevel"/>
+    <w:tmpl w:val="01580EFC"/>
+    <w:lvl w:ilvl="0">
+      <w:start w:val="1"/>
+      <w:numFmt w:val="bullet"/>
+      <w:lvlText w:val=""/>
+      <w:lvlJc w:val="left"/>
+      <w:pPr>
+        <w:tabs>
+          <w:tab w:val="num" w:pos="720"/>
+        </w:tabs>
+        <w:ind w:left="720" w:hanging="360"/>
+      </w:pPr>
+      <w:rPr>
+        <w:rFonts w:ascii="Symbol" w:hAnsi="Symbol" w:hint="default"/>
+        <w:sz w:val="20"/>
+      </w:rPr>
+    </w:lvl>
+    <w:lvl w:ilvl="1" w:tentative="1">
+      <w:start w:val="1"/>
+      <w:numFmt w:val="bullet"/>
+      <w:lvlText w:val="o"/>
+      <w:lvlJc w:val="left"/>
+      <w:pPr>
+        <w:tabs>
+          <w:tab w:val="num" w:pos="1440"/>
+        </w:tabs>
+        <w:ind w:left="1440" w:hanging="360"/>
+      </w:pPr>
+      <w:rPr>
+        <w:rFonts w:ascii="Courier New" w:hAnsi="Courier New" w:hint="default"/>
+        <w:sz w:val="20"/>
+      </w:rPr>
+    </w:lvl>
+    <w:lvl w:ilvl="2" w:tentative="1">
+      <w:start w:val="1"/>
+      <w:numFmt w:val="bullet"/>
+      <w:lvlText w:val=""/>
+      <w:lvlJc w:val="left"/>
+      <w:pPr>
+        <w:tabs>
+          <w:tab w:val="num" w:pos="2160"/>
+        </w:tabs>
+        <w:ind w:left="2160" w:hanging="360"/>
+      </w:pPr>
+      <w:rPr>
+        <w:rFonts w:ascii="Wingdings" w:hAnsi="Wingdings" w:hint="default"/>
+        <w:sz w:val="20"/>
+      </w:rPr>
+    </w:lvl>
+    <w:lvl w:ilvl="3" w:tentative="1">
+      <w:start w:val="1"/>
+      <w:numFmt w:val="bullet"/>
+      <w:lvlText w:val=""/>
+      <w:lvlJc w:val="left"/>
+      <w:pPr>
+        <w:tabs>
+          <w:tab w:val="num" w:pos="2880"/>
+        </w:tabs>
+        <w:ind w:left="2880" w:hanging="360"/>
+      </w:pPr>
+      <w:rPr>
+        <w:rFonts w:ascii="Wingdings" w:hAnsi="Wingdings" w:hint="default"/>
+        <w:sz w:val="20"/>
+      </w:rPr>
+    </w:lvl>
+    <w:lvl w:ilvl="4" w:tentative="1">
+      <w:start w:val="1"/>
+      <w:numFmt w:val="bullet"/>
+      <w:lvlText w:val=""/>
+      <w:lvlJc w:val="left"/>
+      <w:pPr>
+        <w:tabs>
+          <w:tab w:val="num" w:pos="3600"/>
+        </w:tabs>
+        <w:ind w:left="3600" w:hanging="360"/>
+      </w:pPr>
+      <w:rPr>
+        <w:rFonts w:ascii="Wingdings" w:hAnsi="Wingdings" w:hint="default"/>
+        <w:sz w:val="20"/>
+      </w:rPr>
+    </w:lvl>
+    <w:lvl w:ilvl="5" w:tentative="1">
+      <w:start w:val="1"/>
+      <w:numFmt w:val="bullet"/>
+      <w:lvlText w:val=""/>
+      <w:lvlJc w:val="left"/>
+      <w:pPr>
+        <w:tabs>
+          <w:tab w:val="num" w:pos="4320"/>
+        </w:tabs>
+        <w:ind w:left="4320" w:hanging="360"/>
+      </w:pPr>
+      <w:rPr>
+        <w:rFonts w:ascii="Wingdings" w:hAnsi="Wingdings" w:hint="default"/>
+        <w:sz w:val="20"/>
+      </w:rPr>
+    </w:lvl>
+    <w:lvl w:ilvl="6" w:tentative="1">
+      <w:start w:val="1"/>
+      <w:numFmt w:val="bullet"/>
+      <w:lvlText w:val=""/>
+      <w:lvlJc w:val="left"/>
+      <w:pPr>
+        <w:tabs>
+          <w:tab w:val="num" w:pos="5040"/>
+        </w:tabs>
+        <w:ind w:left="5040" w:hanging="360"/>
+      </w:pPr>
+      <w:rPr>
+        <w:rFonts w:ascii="Wingdings" w:hAnsi="Wingdings" w:hint="default"/>
+        <w:sz w:val="20"/>
+      </w:rPr>
+    </w:lvl>
+    <w:lvl w:ilvl="7" w:tentative="1">
+      <w:start w:val="1"/>
+      <w:numFmt w:val="bullet"/>
+      <w:lvlText w:val=""/>
+      <w:lvlJc w:val="left"/>
+      <w:pPr>
+        <w:tabs>
+          <w:tab w:val="num" w:pos="5760"/>
+        </w:tabs>
+        <w:ind w:left="5760" w:hanging="360"/>
+      </w:pPr>
+      <w:rPr>
+        <w:rFonts w:ascii="Wingdings" w:hAnsi="Wingdings" w:hint="default"/>
+        <w:sz w:val="20"/>
+      </w:rPr>
+    </w:lvl>
+    <w:lvl w:ilvl="8" w:tentative="1">
+      <w:start w:val="1"/>
+      <w:numFmt w:val="bullet"/>
+      <w:lvlText w:val=""/>
+      <w:lvlJc w:val="left"/>
+      <w:pPr>
+        <w:tabs>
+          <w:tab w:val="num" w:pos="6480"/>
+        </w:tabs>
+        <w:ind w:left="6480" w:hanging="360"/>
+      </w:pPr>
+      <w:rPr>
+        <w:rFonts w:ascii="Wingdings" w:hAnsi="Wingdings" w:hint="default"/>
+        <w:sz w:val="20"/>
+      </w:rPr>
+    </w:lvl>
+  </w:abstractNum>
+  <w:num w:numId="1" w16cid:durableId="350884524">
+    <w:abstractNumId w:val="0"/>
+  </w:num>
+</w:numbering>
+</file>
+
+<file path=word/people.xml><?xml version="1.0" encoding="utf-8"?>
+<w15:people xmlns:wpc="http://schemas.microsoft.com/office/word/2010/wordprocessingCanvas" xmlns:cx="http://schemas.microsoft.com/office/drawing/2014/chartex" xmlns:cx1="http://schemas.microsoft.com/office/drawing/2015/9/8/chartex" xmlns:cx2="http://schemas.microsoft.com/office/drawing/2015/10/21/chartex" xmlns:cx3="http://schemas.microsoft.com/office/drawing/2016/5/9/chartex" xmlns:cx4="http://schemas.microsoft.com/office/drawing/2016/5/10/chartex" xmlns:cx5="http://schemas.microsoft.com/office/drawing/2016/5/11/chartex" xmlns:cx6="http://schemas.microsoft.com/office/drawing/2016/5/12/chartex" xmlns:cx7="http://schemas.microsoft.com/office/drawing/2016/5/13/chartex" xmlns:cx8="http://schemas.microsoft.com/office/drawing/2016/5/14/chartex" xmlns:mc="http://schemas.openxmlformats.org/markup-compatibility/2006" xmlns:aink="http://schemas.microsoft.com/office/drawing/2016/ink" xmlns:am3d="http://schemas.microsoft.com/office/drawing/2017/model3d" xmlns:o="urn:schemas-microsoft-com:office:office" xmlns:oel="http://schemas.microsoft.com/office/2019/extlst" xmlns:r="http://schemas.openxmlformats.org/officeDocument/2006/relationships" xmlns:m="http://schemas.openxmlformats.org/officeDocument/2006/math" xmlns:v="urn:schemas-microsoft-com:vml" xmlns:wp14="http://schemas.microsoft.com/office/word/2010/wordprocessingDrawing" xmlns:wp="http://schemas.openxmlformats.org/drawingml/2006/wordprocessingDrawing" xmlns:w10="urn:schemas-microsoft-com:office:word" xmlns:w="http://schemas.openxmlformats.org/wordprocessingml/2006/main" xmlns:w14="http://schemas.microsoft.com/office/word/2010/wordml" xmlns:w15="http://schemas.microsoft.com/office/word/2012/wordml" xmlns:w16cex="http://schemas.microsoft.com/office/word/2018/wordml/cex" xmlns:w16cid="http://schemas.microsoft.com/office/word/2016/wordml/cid" xmlns:w16="http://schemas.microsoft.com/office/word/2018/wordml" xmlns:w16du="http://schemas.microsoft.com/office/word/2023/wordml/word16du" xmlns:w16sdtdh="http://schemas.microsoft.com/office/word/2020/wordml/sdtdatahash" xmlns:w16sdtfl="http://schemas.microsoft.com/office/word/2024/wordml/sdtformatlock" xmlns:w16se="http://schemas.microsoft.com/office/word/2015/wordml/symex" xmlns:wpg="http://schemas.microsoft.com/office/word/2010/wordprocessingGroup" xmlns:wpi="http://schemas.microsoft.com/office/word/2010/wordprocessingInk" xmlns:wne="http://schemas.microsoft.com/office/word/2006/wordml" xmlns:wps="http://schemas.microsoft.com/office/word/2010/wordprocessingShape" mc:Ignorable="w14 w15 w16se w16cid w16 w16cex w16sdtdh w16sdtfl w16du wp14">
+  <w15:person w15:author="Lenovo">
+    <w15:presenceInfo w15:providerId="None" w15:userId="Lenovo"/>
+  </w15:person>
+</w15:people>
 </file>
 
 <file path=word/styles.xml><?xml version="1.0" encoding="utf-8"?>
@@ -1015,6 +1790,16 @@
       <w:spacing w:val="5"/>
     </w:rPr>
   </w:style>
+  <w:style w:type="paragraph" w:styleId="Revision">
+    <w:name w:val="Revision"/>
+    <w:hidden/>
+    <w:uiPriority w:val="99"/>
+    <w:semiHidden/>
+    <w:rsid w:val="00280B97"/>
+    <w:pPr>
+      <w:spacing w:after="0" w:line="240" w:lineRule="auto"/>
+    </w:pPr>
+  </w:style>
 </w:styles>
 </file>
 

</xml_diff>

<commit_message>
Day 5: Added power conditioning and boost converter progress
</commit_message>
<xml_diff>
--- a/docs/Solar Audio Amplifier d2d track.docx
+++ b/docs/Solar Audio Amplifier d2d track.docx
@@ -13,20 +13,15 @@
       </w:r>
     </w:p>
     <w:p>
-      <w:pPr>
-        <w:rPr>
-          <w:ins w:id="0" w:author="Lenovo" w:date="2026-06-17T21:07:00Z" w16du:dateUtc="2026-06-17T15:37:00Z"/>
-        </w:rPr>
-      </w:pPr>
       <w:r>
         <w:rPr>
           <w:noProof/>
         </w:rPr>
         <w:drawing>
-          <wp:inline distT="0" distB="0" distL="0" distR="0" wp14:anchorId="61262D9B" wp14:editId="34504197">
-            <wp:extent cx="5731510" cy="2997200"/>
-            <wp:effectExtent l="0" t="0" r="2540" b="0"/>
-            <wp:docPr id="519216990" name="Picture 1"/>
+          <wp:inline distT="0" distB="0" distL="0" distR="0" wp14:anchorId="3BC2E915" wp14:editId="3F74AE82">
+            <wp:extent cx="2889398" cy="1720938"/>
+            <wp:effectExtent l="0" t="0" r="6350" b="0"/>
+            <wp:docPr id="755589999" name="Picture 1"/>
             <wp:cNvGraphicFramePr>
               <a:graphicFrameLocks xmlns:a="http://schemas.openxmlformats.org/drawingml/2006/main" noChangeAspect="1"/>
             </wp:cNvGraphicFramePr>
@@ -34,7 +29,7 @@
               <a:graphicData uri="http://schemas.openxmlformats.org/drawingml/2006/picture">
                 <pic:pic xmlns:pic="http://schemas.openxmlformats.org/drawingml/2006/picture">
                   <pic:nvPicPr>
-                    <pic:cNvPr id="519216990" name=""/>
+                    <pic:cNvPr id="755589999" name=""/>
                     <pic:cNvPicPr/>
                   </pic:nvPicPr>
                   <pic:blipFill>
@@ -46,7 +41,7 @@
                   <pic:spPr>
                     <a:xfrm>
                       <a:off x="0" y="0"/>
-                      <a:ext cx="5731510" cy="2997200"/>
+                      <a:ext cx="2889398" cy="1720938"/>
                     </a:xfrm>
                     <a:prstGeom prst="rect">
                       <a:avLst/>
@@ -58,15 +53,17 @@
           </wp:inline>
         </w:drawing>
       </w:r>
+    </w:p>
+    <w:p>
       <w:r>
         <w:rPr>
           <w:noProof/>
         </w:rPr>
         <w:drawing>
-          <wp:inline distT="0" distB="0" distL="0" distR="0" wp14:anchorId="0978BC40" wp14:editId="773E43E4">
-            <wp:extent cx="5731510" cy="3014980"/>
-            <wp:effectExtent l="0" t="0" r="2540" b="0"/>
-            <wp:docPr id="1377907079" name="Picture 1"/>
+          <wp:inline distT="0" distB="0" distL="0" distR="0" wp14:anchorId="7A578FEF" wp14:editId="0C39B472">
+            <wp:extent cx="5731510" cy="3009265"/>
+            <wp:effectExtent l="0" t="0" r="2540" b="635"/>
+            <wp:docPr id="422996098" name="Picture 1"/>
             <wp:cNvGraphicFramePr>
               <a:graphicFrameLocks xmlns:a="http://schemas.openxmlformats.org/drawingml/2006/main" noChangeAspect="1"/>
             </wp:cNvGraphicFramePr>
@@ -74,7 +71,7 @@
               <a:graphicData uri="http://schemas.openxmlformats.org/drawingml/2006/picture">
                 <pic:pic xmlns:pic="http://schemas.openxmlformats.org/drawingml/2006/picture">
                   <pic:nvPicPr>
-                    <pic:cNvPr id="1377907079" name=""/>
+                    <pic:cNvPr id="422996098" name=""/>
                     <pic:cNvPicPr/>
                   </pic:nvPicPr>
                   <pic:blipFill>
@@ -86,7 +83,7 @@
                   <pic:spPr>
                     <a:xfrm>
                       <a:off x="0" y="0"/>
-                      <a:ext cx="5731510" cy="3014980"/>
+                      <a:ext cx="5731510" cy="3009265"/>
                     </a:xfrm>
                     <a:prstGeom prst="rect">
                       <a:avLst/>
@@ -100,324 +97,235 @@
       </w:r>
     </w:p>
     <w:p>
-      <w:pPr>
+      <w:r>
+        <w:t>DAY2</w:t>
+      </w:r>
+    </w:p>
+    <w:p>
+      <w:r>
+        <w:t>## June 16</w:t>
+      </w:r>
+    </w:p>
+    <w:p>
+      <w:r>
+        <w:t>Built and simulated a silicon diode in PSpice.</w:t>
+      </w:r>
+    </w:p>
+    <w:p>
+      <w:r>
+        <w:t xml:space="preserve">Performed a DC voltage </w:t>
+      </w:r>
+      <w:proofErr w:type="gramStart"/>
+      <w:r>
+        <w:t>sweep</w:t>
+      </w:r>
+      <w:proofErr w:type="gramEnd"/>
+      <w:r>
+        <w:t xml:space="preserve"> and obtained the diode I-V characteristic.</w:t>
+      </w:r>
+    </w:p>
+    <w:p>
+      <w:r>
+        <w:t>Observed exponential current growth with increasing forward bias.</w:t>
+      </w:r>
+    </w:p>
+    <w:p>
+      <w:r>
+        <w:t xml:space="preserve">This serves as a precursor to photovoltaic cell </w:t>
+      </w:r>
+      <w:proofErr w:type="spellStart"/>
+      <w:r>
+        <w:t>modeling</w:t>
+      </w:r>
+      <w:proofErr w:type="spellEnd"/>
+      <w:r>
+        <w:t>, since the solar-cell equivalent circuit is fundamentally diode-based.</w:t>
+      </w:r>
+    </w:p>
+    <w:p>
+      <w:r>
         <w:rPr>
-          <w:ins w:id="1" w:author="Lenovo" w:date="2026-06-17T21:07:00Z" w16du:dateUtc="2026-06-17T15:37:00Z"/>
+          <w:noProof/>
         </w:rPr>
-      </w:pPr>
-      <w:ins w:id="2" w:author="Lenovo" w:date="2026-06-17T21:07:00Z" w16du:dateUtc="2026-06-17T15:37:00Z">
-        <w:r>
-          <w:t>DAY2</w:t>
-        </w:r>
-      </w:ins>
-    </w:p>
-    <w:p>
-      <w:pPr>
+        <w:lastRenderedPageBreak/>
+        <w:drawing>
+          <wp:inline distT="0" distB="0" distL="0" distR="0" wp14:anchorId="1CCC2D31" wp14:editId="5FEE77FB">
+            <wp:extent cx="2883048" cy="1670136"/>
+            <wp:effectExtent l="0" t="0" r="0" b="6350"/>
+            <wp:docPr id="1332377184" name="Picture 1"/>
+            <wp:cNvGraphicFramePr>
+              <a:graphicFrameLocks xmlns:a="http://schemas.openxmlformats.org/drawingml/2006/main" noChangeAspect="1"/>
+            </wp:cNvGraphicFramePr>
+            <a:graphic xmlns:a="http://schemas.openxmlformats.org/drawingml/2006/main">
+              <a:graphicData uri="http://schemas.openxmlformats.org/drawingml/2006/picture">
+                <pic:pic xmlns:pic="http://schemas.openxmlformats.org/drawingml/2006/picture">
+                  <pic:nvPicPr>
+                    <pic:cNvPr id="1332377184" name=""/>
+                    <pic:cNvPicPr/>
+                  </pic:nvPicPr>
+                  <pic:blipFill>
+                    <a:blip r:embed="rId7"/>
+                    <a:stretch>
+                      <a:fillRect/>
+                    </a:stretch>
+                  </pic:blipFill>
+                  <pic:spPr>
+                    <a:xfrm>
+                      <a:off x="0" y="0"/>
+                      <a:ext cx="2883048" cy="1670136"/>
+                    </a:xfrm>
+                    <a:prstGeom prst="rect">
+                      <a:avLst/>
+                    </a:prstGeom>
+                  </pic:spPr>
+                </pic:pic>
+              </a:graphicData>
+            </a:graphic>
+          </wp:inline>
+        </w:drawing>
+      </w:r>
+    </w:p>
+    <w:p>
+      <w:r>
         <w:rPr>
-          <w:ins w:id="3" w:author="Lenovo" w:date="2026-06-17T21:07:00Z" w16du:dateUtc="2026-06-17T15:37:00Z"/>
+          <w:noProof/>
         </w:rPr>
-      </w:pPr>
-      <w:ins w:id="4" w:author="Lenovo" w:date="2026-06-17T21:07:00Z" w16du:dateUtc="2026-06-17T15:37:00Z">
-        <w:r>
-          <w:t>## June 16</w:t>
-        </w:r>
-      </w:ins>
-    </w:p>
-    <w:p>
-      <w:pPr>
+        <w:drawing>
+          <wp:inline distT="0" distB="0" distL="0" distR="0" wp14:anchorId="5A7DC773" wp14:editId="26597CDE">
+            <wp:extent cx="5731510" cy="3006090"/>
+            <wp:effectExtent l="0" t="0" r="2540" b="3810"/>
+            <wp:docPr id="2036786483" name="Picture 1"/>
+            <wp:cNvGraphicFramePr>
+              <a:graphicFrameLocks xmlns:a="http://schemas.openxmlformats.org/drawingml/2006/main" noChangeAspect="1"/>
+            </wp:cNvGraphicFramePr>
+            <a:graphic xmlns:a="http://schemas.openxmlformats.org/drawingml/2006/main">
+              <a:graphicData uri="http://schemas.openxmlformats.org/drawingml/2006/picture">
+                <pic:pic xmlns:pic="http://schemas.openxmlformats.org/drawingml/2006/picture">
+                  <pic:nvPicPr>
+                    <pic:cNvPr id="2036786483" name=""/>
+                    <pic:cNvPicPr/>
+                  </pic:nvPicPr>
+                  <pic:blipFill>
+                    <a:blip r:embed="rId8"/>
+                    <a:stretch>
+                      <a:fillRect/>
+                    </a:stretch>
+                  </pic:blipFill>
+                  <pic:spPr>
+                    <a:xfrm>
+                      <a:off x="0" y="0"/>
+                      <a:ext cx="5731510" cy="3006090"/>
+                    </a:xfrm>
+                    <a:prstGeom prst="rect">
+                      <a:avLst/>
+                    </a:prstGeom>
+                  </pic:spPr>
+                </pic:pic>
+              </a:graphicData>
+            </a:graphic>
+          </wp:inline>
+        </w:drawing>
+      </w:r>
+    </w:p>
+    <w:p>
+      <w:r>
+        <w:t>On removing the Resistance and adding a current source instead</w:t>
+      </w:r>
+    </w:p>
+    <w:p>
+      <w:r>
         <w:rPr>
-          <w:ins w:id="5" w:author="Lenovo" w:date="2026-06-17T21:07:00Z" w16du:dateUtc="2026-06-17T15:37:00Z"/>
+          <w:noProof/>
         </w:rPr>
-      </w:pPr>
-      <w:ins w:id="6" w:author="Lenovo" w:date="2026-06-17T21:07:00Z" w16du:dateUtc="2026-06-17T15:37:00Z">
-        <w:r>
-          <w:t>Built and simulated a silicon diode in PSpice.</w:t>
-        </w:r>
-      </w:ins>
-    </w:p>
-    <w:p>
-      <w:pPr>
+        <w:drawing>
+          <wp:inline distT="0" distB="0" distL="0" distR="0" wp14:anchorId="52180E50" wp14:editId="7FE9FFB4">
+            <wp:extent cx="2603634" cy="1803493"/>
+            <wp:effectExtent l="0" t="0" r="6350" b="6350"/>
+            <wp:docPr id="1659308948" name="Picture 1"/>
+            <wp:cNvGraphicFramePr>
+              <a:graphicFrameLocks xmlns:a="http://schemas.openxmlformats.org/drawingml/2006/main" noChangeAspect="1"/>
+            </wp:cNvGraphicFramePr>
+            <a:graphic xmlns:a="http://schemas.openxmlformats.org/drawingml/2006/main">
+              <a:graphicData uri="http://schemas.openxmlformats.org/drawingml/2006/picture">
+                <pic:pic xmlns:pic="http://schemas.openxmlformats.org/drawingml/2006/picture">
+                  <pic:nvPicPr>
+                    <pic:cNvPr id="1659308948" name=""/>
+                    <pic:cNvPicPr/>
+                  </pic:nvPicPr>
+                  <pic:blipFill>
+                    <a:blip r:embed="rId9"/>
+                    <a:stretch>
+                      <a:fillRect/>
+                    </a:stretch>
+                  </pic:blipFill>
+                  <pic:spPr>
+                    <a:xfrm>
+                      <a:off x="0" y="0"/>
+                      <a:ext cx="2603634" cy="1803493"/>
+                    </a:xfrm>
+                    <a:prstGeom prst="rect">
+                      <a:avLst/>
+                    </a:prstGeom>
+                  </pic:spPr>
+                </pic:pic>
+              </a:graphicData>
+            </a:graphic>
+          </wp:inline>
+        </w:drawing>
+      </w:r>
+    </w:p>
+    <w:p>
+      <w:r>
         <w:rPr>
-          <w:ins w:id="7" w:author="Lenovo" w:date="2026-06-17T21:07:00Z" w16du:dateUtc="2026-06-17T15:37:00Z"/>
+          <w:noProof/>
         </w:rPr>
-      </w:pPr>
-      <w:ins w:id="8" w:author="Lenovo" w:date="2026-06-17T21:07:00Z" w16du:dateUtc="2026-06-17T15:37:00Z">
-        <w:r>
-          <w:t xml:space="preserve">Performed a DC voltage </w:t>
-        </w:r>
-        <w:proofErr w:type="gramStart"/>
-        <w:r>
-          <w:t>sweep</w:t>
-        </w:r>
-        <w:proofErr w:type="gramEnd"/>
-        <w:r>
-          <w:t xml:space="preserve"> and obtained the diode I-V characteristic.</w:t>
-        </w:r>
-      </w:ins>
-    </w:p>
-    <w:p>
-      <w:pPr>
-        <w:rPr>
-          <w:ins w:id="9" w:author="Lenovo" w:date="2026-06-17T21:07:00Z" w16du:dateUtc="2026-06-17T15:37:00Z"/>
-        </w:rPr>
-      </w:pPr>
-      <w:ins w:id="10" w:author="Lenovo" w:date="2026-06-17T21:07:00Z" w16du:dateUtc="2026-06-17T15:37:00Z">
-        <w:r>
-          <w:t>Observed exponential current growth with increasing forward bias.</w:t>
-        </w:r>
-      </w:ins>
-    </w:p>
-    <w:p>
-      <w:pPr>
-        <w:rPr>
-          <w:ins w:id="11" w:author="Lenovo" w:date="2026-06-17T21:07:00Z" w16du:dateUtc="2026-06-17T15:37:00Z"/>
-        </w:rPr>
-      </w:pPr>
-      <w:ins w:id="12" w:author="Lenovo" w:date="2026-06-17T21:07:00Z" w16du:dateUtc="2026-06-17T15:37:00Z">
-        <w:r>
-          <w:t xml:space="preserve">This serves as a precursor to photovoltaic cell </w:t>
-        </w:r>
-        <w:proofErr w:type="spellStart"/>
-        <w:r>
-          <w:t>modeling</w:t>
-        </w:r>
-        <w:proofErr w:type="spellEnd"/>
-        <w:r>
-          <w:t>, since the solar-cell equivalent circuit is fundamentally diode-based.</w:t>
-        </w:r>
-      </w:ins>
-    </w:p>
-    <w:p>
-      <w:pPr>
-        <w:rPr>
-          <w:ins w:id="13" w:author="Lenovo" w:date="2026-06-17T21:07:00Z" w16du:dateUtc="2026-06-17T15:37:00Z"/>
-        </w:rPr>
-      </w:pPr>
-      <w:ins w:id="14" w:author="Lenovo" w:date="2026-06-17T21:07:00Z" w16du:dateUtc="2026-06-17T15:37:00Z">
-        <w:r>
-          <w:rPr>
-            <w:noProof/>
-          </w:rPr>
-          <w:drawing>
-            <wp:inline distT="0" distB="0" distL="0" distR="0" wp14:anchorId="5351B764" wp14:editId="00F553DE">
-              <wp:extent cx="2883048" cy="1670136"/>
-              <wp:effectExtent l="0" t="0" r="0" b="6350"/>
-              <wp:docPr id="1332377184" name="Picture 1"/>
-              <wp:cNvGraphicFramePr>
-                <a:graphicFrameLocks xmlns:a="http://schemas.openxmlformats.org/drawingml/2006/main" noChangeAspect="1"/>
-              </wp:cNvGraphicFramePr>
-              <a:graphic xmlns:a="http://schemas.openxmlformats.org/drawingml/2006/main">
-                <a:graphicData uri="http://schemas.openxmlformats.org/drawingml/2006/picture">
-                  <pic:pic xmlns:pic="http://schemas.openxmlformats.org/drawingml/2006/picture">
-                    <pic:nvPicPr>
-                      <pic:cNvPr id="1332377184" name=""/>
-                      <pic:cNvPicPr/>
-                    </pic:nvPicPr>
-                    <pic:blipFill>
-                      <a:blip r:embed="rId7"/>
-                      <a:stretch>
-                        <a:fillRect/>
-                      </a:stretch>
-                    </pic:blipFill>
-                    <pic:spPr>
-                      <a:xfrm>
-                        <a:off x="0" y="0"/>
-                        <a:ext cx="2883048" cy="1670136"/>
-                      </a:xfrm>
-                      <a:prstGeom prst="rect">
-                        <a:avLst/>
-                      </a:prstGeom>
-                    </pic:spPr>
-                  </pic:pic>
-                </a:graphicData>
-              </a:graphic>
-            </wp:inline>
-          </w:drawing>
-        </w:r>
-      </w:ins>
-    </w:p>
-    <w:p>
-      <w:pPr>
-        <w:rPr>
-          <w:ins w:id="15" w:author="Lenovo" w:date="2026-06-17T21:07:00Z" w16du:dateUtc="2026-06-17T15:37:00Z"/>
-        </w:rPr>
-      </w:pPr>
-      <w:ins w:id="16" w:author="Lenovo" w:date="2026-06-17T21:07:00Z" w16du:dateUtc="2026-06-17T15:37:00Z">
-        <w:r>
-          <w:rPr>
-            <w:noProof/>
-          </w:rPr>
-          <w:drawing>
-            <wp:inline distT="0" distB="0" distL="0" distR="0" wp14:anchorId="5E9F2BA3" wp14:editId="1B59EAB4">
-              <wp:extent cx="5731510" cy="3006090"/>
-              <wp:effectExtent l="0" t="0" r="2540" b="3810"/>
-              <wp:docPr id="2036786483" name="Picture 1"/>
-              <wp:cNvGraphicFramePr>
-                <a:graphicFrameLocks xmlns:a="http://schemas.openxmlformats.org/drawingml/2006/main" noChangeAspect="1"/>
-              </wp:cNvGraphicFramePr>
-              <a:graphic xmlns:a="http://schemas.openxmlformats.org/drawingml/2006/main">
-                <a:graphicData uri="http://schemas.openxmlformats.org/drawingml/2006/picture">
-                  <pic:pic xmlns:pic="http://schemas.openxmlformats.org/drawingml/2006/picture">
-                    <pic:nvPicPr>
-                      <pic:cNvPr id="2036786483" name=""/>
-                      <pic:cNvPicPr/>
-                    </pic:nvPicPr>
-                    <pic:blipFill>
-                      <a:blip r:embed="rId8"/>
-                      <a:stretch>
-                        <a:fillRect/>
-                      </a:stretch>
-                    </pic:blipFill>
-                    <pic:spPr>
-                      <a:xfrm>
-                        <a:off x="0" y="0"/>
-                        <a:ext cx="5731510" cy="3006090"/>
-                      </a:xfrm>
-                      <a:prstGeom prst="rect">
-                        <a:avLst/>
-                      </a:prstGeom>
-                    </pic:spPr>
-                  </pic:pic>
-                </a:graphicData>
-              </a:graphic>
-            </wp:inline>
-          </w:drawing>
-        </w:r>
-      </w:ins>
-    </w:p>
-    <w:p>
-      <w:pPr>
-        <w:rPr>
-          <w:ins w:id="17" w:author="Lenovo" w:date="2026-06-17T21:07:00Z" w16du:dateUtc="2026-06-17T15:37:00Z"/>
-        </w:rPr>
-      </w:pPr>
-      <w:ins w:id="18" w:author="Lenovo" w:date="2026-06-17T21:07:00Z" w16du:dateUtc="2026-06-17T15:37:00Z">
-        <w:r>
-          <w:t>On removing the Resistance and adding a current source instead</w:t>
-        </w:r>
-      </w:ins>
-    </w:p>
-    <w:p>
-      <w:pPr>
-        <w:rPr>
-          <w:ins w:id="19" w:author="Lenovo" w:date="2026-06-17T21:07:00Z" w16du:dateUtc="2026-06-17T15:37:00Z"/>
-        </w:rPr>
-      </w:pPr>
-      <w:ins w:id="20" w:author="Lenovo" w:date="2026-06-17T21:07:00Z" w16du:dateUtc="2026-06-17T15:37:00Z">
-        <w:r>
-          <w:rPr>
-            <w:noProof/>
-          </w:rPr>
-          <w:drawing>
-            <wp:inline distT="0" distB="0" distL="0" distR="0" wp14:anchorId="638DBC34" wp14:editId="4F79F54D">
-              <wp:extent cx="2603634" cy="1803493"/>
-              <wp:effectExtent l="0" t="0" r="6350" b="6350"/>
-              <wp:docPr id="1659308948" name="Picture 1"/>
-              <wp:cNvGraphicFramePr>
-                <a:graphicFrameLocks xmlns:a="http://schemas.openxmlformats.org/drawingml/2006/main" noChangeAspect="1"/>
-              </wp:cNvGraphicFramePr>
-              <a:graphic xmlns:a="http://schemas.openxmlformats.org/drawingml/2006/main">
-                <a:graphicData uri="http://schemas.openxmlformats.org/drawingml/2006/picture">
-                  <pic:pic xmlns:pic="http://schemas.openxmlformats.org/drawingml/2006/picture">
-                    <pic:nvPicPr>
-                      <pic:cNvPr id="1659308948" name=""/>
-                      <pic:cNvPicPr/>
-                    </pic:nvPicPr>
-                    <pic:blipFill>
-                      <a:blip r:embed="rId9"/>
-                      <a:stretch>
-                        <a:fillRect/>
-                      </a:stretch>
-                    </pic:blipFill>
-                    <pic:spPr>
-                      <a:xfrm>
-                        <a:off x="0" y="0"/>
-                        <a:ext cx="2603634" cy="1803493"/>
-                      </a:xfrm>
-                      <a:prstGeom prst="rect">
-                        <a:avLst/>
-                      </a:prstGeom>
-                    </pic:spPr>
-                  </pic:pic>
-                </a:graphicData>
-              </a:graphic>
-            </wp:inline>
-          </w:drawing>
-        </w:r>
-      </w:ins>
-    </w:p>
-    <w:p>
-      <w:pPr>
-        <w:rPr>
-          <w:ins w:id="21" w:author="Lenovo" w:date="2026-06-17T21:07:00Z" w16du:dateUtc="2026-06-17T15:37:00Z"/>
-        </w:rPr>
-      </w:pPr>
-      <w:ins w:id="22" w:author="Lenovo" w:date="2026-06-17T21:07:00Z" w16du:dateUtc="2026-06-17T15:37:00Z">
-        <w:r>
-          <w:rPr>
-            <w:noProof/>
-          </w:rPr>
-          <w:drawing>
-            <wp:inline distT="0" distB="0" distL="0" distR="0" wp14:anchorId="14C45FB8" wp14:editId="4C98DA07">
-              <wp:extent cx="5731510" cy="3021330"/>
-              <wp:effectExtent l="0" t="0" r="2540" b="7620"/>
-              <wp:docPr id="1162972182" name="Picture 1"/>
-              <wp:cNvGraphicFramePr>
-                <a:graphicFrameLocks xmlns:a="http://schemas.openxmlformats.org/drawingml/2006/main" noChangeAspect="1"/>
-              </wp:cNvGraphicFramePr>
-              <a:graphic xmlns:a="http://schemas.openxmlformats.org/drawingml/2006/main">
-                <a:graphicData uri="http://schemas.openxmlformats.org/drawingml/2006/picture">
-                  <pic:pic xmlns:pic="http://schemas.openxmlformats.org/drawingml/2006/picture">
-                    <pic:nvPicPr>
-                      <pic:cNvPr id="1162972182" name=""/>
-                      <pic:cNvPicPr/>
-                    </pic:nvPicPr>
-                    <pic:blipFill>
-                      <a:blip r:embed="rId10"/>
-                      <a:stretch>
-                        <a:fillRect/>
-                      </a:stretch>
-                    </pic:blipFill>
-                    <pic:spPr>
-                      <a:xfrm>
-                        <a:off x="0" y="0"/>
-                        <a:ext cx="5731510" cy="3021330"/>
-                      </a:xfrm>
-                      <a:prstGeom prst="rect">
-                        <a:avLst/>
-                      </a:prstGeom>
-                    </pic:spPr>
-                  </pic:pic>
-                </a:graphicData>
-              </a:graphic>
-            </wp:inline>
-          </w:drawing>
-        </w:r>
-      </w:ins>
-    </w:p>
-    <w:p>
-      <w:pPr>
-        <w:rPr>
-          <w:ins w:id="23" w:author="Lenovo" w:date="2026-06-17T21:07:00Z" w16du:dateUtc="2026-06-17T15:37:00Z"/>
-        </w:rPr>
-      </w:pPr>
-      <w:ins w:id="24" w:author="Lenovo" w:date="2026-06-17T21:07:00Z" w16du:dateUtc="2026-06-17T15:37:00Z">
-        <w:r>
-          <w:t>DAY-3</w:t>
-        </w:r>
-      </w:ins>
-    </w:p>
-    <w:p>
-      <w:pPr>
-        <w:rPr>
-          <w:ins w:id="25" w:author="Lenovo" w:date="2026-06-17T21:07:00Z" w16du:dateUtc="2026-06-17T15:37:00Z"/>
-        </w:rPr>
-      </w:pPr>
-      <w:ins w:id="26" w:author="Lenovo" w:date="2026-06-17T21:07:00Z" w16du:dateUtc="2026-06-17T15:37:00Z">
-        <w:r>
-          <w:t>Day 3 – PV Model Improvement</w:t>
-        </w:r>
-      </w:ins>
+        <w:lastRenderedPageBreak/>
+        <w:drawing>
+          <wp:inline distT="0" distB="0" distL="0" distR="0" wp14:anchorId="4F03AB21" wp14:editId="5AC8EBE0">
+            <wp:extent cx="5731510" cy="3021330"/>
+            <wp:effectExtent l="0" t="0" r="2540" b="7620"/>
+            <wp:docPr id="1162972182" name="Picture 1"/>
+            <wp:cNvGraphicFramePr>
+              <a:graphicFrameLocks xmlns:a="http://schemas.openxmlformats.org/drawingml/2006/main" noChangeAspect="1"/>
+            </wp:cNvGraphicFramePr>
+            <a:graphic xmlns:a="http://schemas.openxmlformats.org/drawingml/2006/main">
+              <a:graphicData uri="http://schemas.openxmlformats.org/drawingml/2006/picture">
+                <pic:pic xmlns:pic="http://schemas.openxmlformats.org/drawingml/2006/picture">
+                  <pic:nvPicPr>
+                    <pic:cNvPr id="1162972182" name=""/>
+                    <pic:cNvPicPr/>
+                  </pic:nvPicPr>
+                  <pic:blipFill>
+                    <a:blip r:embed="rId10"/>
+                    <a:stretch>
+                      <a:fillRect/>
+                    </a:stretch>
+                  </pic:blipFill>
+                  <pic:spPr>
+                    <a:xfrm>
+                      <a:off x="0" y="0"/>
+                      <a:ext cx="5731510" cy="3021330"/>
+                    </a:xfrm>
+                    <a:prstGeom prst="rect">
+                      <a:avLst/>
+                    </a:prstGeom>
+                  </pic:spPr>
+                </pic:pic>
+              </a:graphicData>
+            </a:graphic>
+          </wp:inline>
+        </w:drawing>
+      </w:r>
+    </w:p>
+    <w:p>
+      <w:r>
+        <w:t>DAY-3</w:t>
+      </w:r>
+    </w:p>
+    <w:p>
+      <w:r>
+        <w:t>Day 3 – PV Model Improvement</w:t>
+      </w:r>
     </w:p>
     <w:p>
       <w:pPr>
@@ -425,23 +333,18 @@
           <w:ilvl w:val="0"/>
           <w:numId w:val="1"/>
         </w:numPr>
-        <w:rPr>
-          <w:ins w:id="27" w:author="Lenovo" w:date="2026-06-17T21:07:00Z" w16du:dateUtc="2026-06-17T15:37:00Z"/>
-        </w:rPr>
-      </w:pPr>
-      <w:ins w:id="28" w:author="Lenovo" w:date="2026-06-17T21:07:00Z" w16du:dateUtc="2026-06-17T15:37:00Z">
-        <w:r>
-          <w:t>Added series resistance (Rs) and shunt resistance (</w:t>
-        </w:r>
-        <w:proofErr w:type="spellStart"/>
-        <w:r>
-          <w:t>Rsh</w:t>
-        </w:r>
-        <w:proofErr w:type="spellEnd"/>
-        <w:r>
-          <w:t>) to the single-diode PV model.</w:t>
-        </w:r>
-      </w:ins>
+      </w:pPr>
+      <w:r>
+        <w:t>Added series resistance (Rs) and shunt resistance (</w:t>
+      </w:r>
+      <w:proofErr w:type="spellStart"/>
+      <w:r>
+        <w:t>Rsh</w:t>
+      </w:r>
+      <w:proofErr w:type="spellEnd"/>
+      <w:r>
+        <w:t>) to the single-diode PV model.</w:t>
+      </w:r>
     </w:p>
     <w:p>
       <w:pPr>
@@ -449,23 +352,18 @@
           <w:ilvl w:val="0"/>
           <w:numId w:val="1"/>
         </w:numPr>
-        <w:rPr>
-          <w:ins w:id="29" w:author="Lenovo" w:date="2026-06-17T21:07:00Z" w16du:dateUtc="2026-06-17T15:37:00Z"/>
-        </w:rPr>
-      </w:pPr>
-      <w:ins w:id="30" w:author="Lenovo" w:date="2026-06-17T21:07:00Z" w16du:dateUtc="2026-06-17T15:37:00Z">
-        <w:r>
-          <w:t xml:space="preserve">Tested different Rs and </w:t>
-        </w:r>
-        <w:proofErr w:type="spellStart"/>
-        <w:r>
-          <w:t>Rsh</w:t>
-        </w:r>
-        <w:proofErr w:type="spellEnd"/>
-        <w:r>
-          <w:t xml:space="preserve"> values in PSpice.</w:t>
-        </w:r>
-      </w:ins>
+      </w:pPr>
+      <w:r>
+        <w:t xml:space="preserve">Tested different Rs and </w:t>
+      </w:r>
+      <w:proofErr w:type="spellStart"/>
+      <w:r>
+        <w:t>Rsh</w:t>
+      </w:r>
+      <w:proofErr w:type="spellEnd"/>
+      <w:r>
+        <w:t xml:space="preserve"> values in PSpice.</w:t>
+      </w:r>
     </w:p>
     <w:p>
       <w:pPr>
@@ -473,15 +371,10 @@
           <w:ilvl w:val="0"/>
           <w:numId w:val="1"/>
         </w:numPr>
-        <w:rPr>
-          <w:ins w:id="31" w:author="Lenovo" w:date="2026-06-17T21:07:00Z" w16du:dateUtc="2026-06-17T15:37:00Z"/>
-        </w:rPr>
-      </w:pPr>
-      <w:ins w:id="32" w:author="Lenovo" w:date="2026-06-17T21:07:00Z" w16du:dateUtc="2026-06-17T15:37:00Z">
-        <w:r>
-          <w:t>Learned that circuit topology affects simulation results significantly.</w:t>
-        </w:r>
-      </w:ins>
+      </w:pPr>
+      <w:r>
+        <w:t>Learned that circuit topology affects simulation results significantly.</w:t>
+      </w:r>
     </w:p>
     <w:p>
       <w:pPr>
@@ -489,15 +382,10 @@
           <w:ilvl w:val="0"/>
           <w:numId w:val="1"/>
         </w:numPr>
-        <w:rPr>
-          <w:ins w:id="33" w:author="Lenovo" w:date="2026-06-17T21:07:00Z" w16du:dateUtc="2026-06-17T15:37:00Z"/>
-        </w:rPr>
-      </w:pPr>
-      <w:ins w:id="34" w:author="Lenovo" w:date="2026-06-17T21:07:00Z" w16du:dateUtc="2026-06-17T15:37:00Z">
-        <w:r>
-          <w:t>Connected a load resistor (RL) and obtained a stable output voltage.</w:t>
-        </w:r>
-      </w:ins>
+      </w:pPr>
+      <w:r>
+        <w:t>Connected a load resistor (RL) and obtained a stable output voltage.</w:t>
+      </w:r>
     </w:p>
     <w:p>
       <w:pPr>
@@ -505,23 +393,18 @@
           <w:ilvl w:val="0"/>
           <w:numId w:val="1"/>
         </w:numPr>
-        <w:rPr>
-          <w:ins w:id="35" w:author="Lenovo" w:date="2026-06-17T21:07:00Z" w16du:dateUtc="2026-06-17T15:37:00Z"/>
-        </w:rPr>
-      </w:pPr>
-      <w:ins w:id="36" w:author="Lenovo" w:date="2026-06-17T21:07:00Z" w16du:dateUtc="2026-06-17T15:37:00Z">
-        <w:r>
-          <w:t>Performed an irradiance (</w:t>
-        </w:r>
-        <w:proofErr w:type="spellStart"/>
-        <w:r>
-          <w:t>Iph</w:t>
-        </w:r>
-        <w:proofErr w:type="spellEnd"/>
-        <w:r>
-          <w:t>) sweep from 0.1 A to 1.0 A.</w:t>
-        </w:r>
-      </w:ins>
+      </w:pPr>
+      <w:r>
+        <w:t>Performed an irradiance (</w:t>
+      </w:r>
+      <w:proofErr w:type="spellStart"/>
+      <w:r>
+        <w:t>Iph</w:t>
+      </w:r>
+      <w:proofErr w:type="spellEnd"/>
+      <w:r>
+        <w:t>) sweep from 0.1 A to 1.0 A.</w:t>
+      </w:r>
     </w:p>
     <w:p>
       <w:pPr>
@@ -529,174 +412,1310 @@
           <w:ilvl w:val="0"/>
           <w:numId w:val="1"/>
         </w:numPr>
+      </w:pPr>
+      <w:r>
+        <w:t>Observed output voltage increase from approximately 0.81 V to 0.96 V with increasing irradiance.</w:t>
+      </w:r>
+    </w:p>
+    <w:p>
+      <w:r>
         <w:rPr>
-          <w:ins w:id="37" w:author="Lenovo" w:date="2026-06-17T21:07:00Z" w16du:dateUtc="2026-06-17T15:37:00Z"/>
+          <w:noProof/>
         </w:rPr>
-      </w:pPr>
-      <w:ins w:id="38" w:author="Lenovo" w:date="2026-06-17T21:07:00Z" w16du:dateUtc="2026-06-17T15:37:00Z">
-        <w:r>
-          <w:t>Observed output voltage increase from approximately 0.81 V to 0.96 V with increasing irradiance.</w:t>
-        </w:r>
-      </w:ins>
-    </w:p>
-    <w:p>
-      <w:pPr>
+        <w:drawing>
+          <wp:inline distT="0" distB="0" distL="0" distR="0" wp14:anchorId="690DD6E0" wp14:editId="52F93BCC">
+            <wp:extent cx="4515082" cy="1994002"/>
+            <wp:effectExtent l="0" t="0" r="0" b="6350"/>
+            <wp:docPr id="1235556243" name="Picture 1"/>
+            <wp:cNvGraphicFramePr>
+              <a:graphicFrameLocks xmlns:a="http://schemas.openxmlformats.org/drawingml/2006/main" noChangeAspect="1"/>
+            </wp:cNvGraphicFramePr>
+            <a:graphic xmlns:a="http://schemas.openxmlformats.org/drawingml/2006/main">
+              <a:graphicData uri="http://schemas.openxmlformats.org/drawingml/2006/picture">
+                <pic:pic xmlns:pic="http://schemas.openxmlformats.org/drawingml/2006/picture">
+                  <pic:nvPicPr>
+                    <pic:cNvPr id="1235556243" name=""/>
+                    <pic:cNvPicPr/>
+                  </pic:nvPicPr>
+                  <pic:blipFill>
+                    <a:blip r:embed="rId11"/>
+                    <a:stretch>
+                      <a:fillRect/>
+                    </a:stretch>
+                  </pic:blipFill>
+                  <pic:spPr>
+                    <a:xfrm>
+                      <a:off x="0" y="0"/>
+                      <a:ext cx="4515082" cy="1994002"/>
+                    </a:xfrm>
+                    <a:prstGeom prst="rect">
+                      <a:avLst/>
+                    </a:prstGeom>
+                  </pic:spPr>
+                </pic:pic>
+              </a:graphicData>
+            </a:graphic>
+          </wp:inline>
+        </w:drawing>
+      </w:r>
+    </w:p>
+    <w:p>
+      <w:r>
+        <w:t>Circuit used</w:t>
+      </w:r>
+    </w:p>
+    <w:p>
+      <w:r>
         <w:rPr>
-          <w:ins w:id="39" w:author="Lenovo" w:date="2026-06-17T21:07:00Z" w16du:dateUtc="2026-06-17T15:37:00Z"/>
+          <w:noProof/>
         </w:rPr>
-      </w:pPr>
-      <w:ins w:id="40" w:author="Lenovo" w:date="2026-06-17T21:07:00Z" w16du:dateUtc="2026-06-17T15:37:00Z">
-        <w:r>
-          <w:rPr>
-            <w:noProof/>
-          </w:rPr>
-          <w:drawing>
-            <wp:inline distT="0" distB="0" distL="0" distR="0" wp14:anchorId="1EF123A0" wp14:editId="23F065E0">
-              <wp:extent cx="4515082" cy="1994002"/>
-              <wp:effectExtent l="0" t="0" r="0" b="6350"/>
-              <wp:docPr id="1235556243" name="Picture 1"/>
-              <wp:cNvGraphicFramePr>
-                <a:graphicFrameLocks xmlns:a="http://schemas.openxmlformats.org/drawingml/2006/main" noChangeAspect="1"/>
-              </wp:cNvGraphicFramePr>
-              <a:graphic xmlns:a="http://schemas.openxmlformats.org/drawingml/2006/main">
-                <a:graphicData uri="http://schemas.openxmlformats.org/drawingml/2006/picture">
-                  <pic:pic xmlns:pic="http://schemas.openxmlformats.org/drawingml/2006/picture">
-                    <pic:nvPicPr>
-                      <pic:cNvPr id="1235556243" name=""/>
-                      <pic:cNvPicPr/>
-                    </pic:nvPicPr>
-                    <pic:blipFill>
-                      <a:blip r:embed="rId11"/>
-                      <a:stretch>
-                        <a:fillRect/>
-                      </a:stretch>
-                    </pic:blipFill>
-                    <pic:spPr>
-                      <a:xfrm>
-                        <a:off x="0" y="0"/>
-                        <a:ext cx="4515082" cy="1994002"/>
-                      </a:xfrm>
-                      <a:prstGeom prst="rect">
-                        <a:avLst/>
-                      </a:prstGeom>
-                    </pic:spPr>
-                  </pic:pic>
-                </a:graphicData>
-              </a:graphic>
-            </wp:inline>
-          </w:drawing>
-        </w:r>
-      </w:ins>
-    </w:p>
-    <w:p>
-      <w:pPr>
+        <w:lastRenderedPageBreak/>
+        <w:drawing>
+          <wp:inline distT="0" distB="0" distL="0" distR="0" wp14:anchorId="3E77D494" wp14:editId="162318F2">
+            <wp:extent cx="5731510" cy="1818640"/>
+            <wp:effectExtent l="0" t="0" r="2540" b="0"/>
+            <wp:docPr id="557308909" name="Picture 1"/>
+            <wp:cNvGraphicFramePr>
+              <a:graphicFrameLocks xmlns:a="http://schemas.openxmlformats.org/drawingml/2006/main" noChangeAspect="1"/>
+            </wp:cNvGraphicFramePr>
+            <a:graphic xmlns:a="http://schemas.openxmlformats.org/drawingml/2006/main">
+              <a:graphicData uri="http://schemas.openxmlformats.org/drawingml/2006/picture">
+                <pic:pic xmlns:pic="http://schemas.openxmlformats.org/drawingml/2006/picture">
+                  <pic:nvPicPr>
+                    <pic:cNvPr id="557308909" name=""/>
+                    <pic:cNvPicPr/>
+                  </pic:nvPicPr>
+                  <pic:blipFill>
+                    <a:blip r:embed="rId12"/>
+                    <a:stretch>
+                      <a:fillRect/>
+                    </a:stretch>
+                  </pic:blipFill>
+                  <pic:spPr>
+                    <a:xfrm>
+                      <a:off x="0" y="0"/>
+                      <a:ext cx="5731510" cy="1818640"/>
+                    </a:xfrm>
+                    <a:prstGeom prst="rect">
+                      <a:avLst/>
+                    </a:prstGeom>
+                  </pic:spPr>
+                </pic:pic>
+              </a:graphicData>
+            </a:graphic>
+          </wp:inline>
+        </w:drawing>
+      </w:r>
+    </w:p>
+    <w:p>
+      <w:r>
+        <w:t xml:space="preserve">Irradiance </w:t>
+      </w:r>
+      <w:proofErr w:type="gramStart"/>
+      <w:r>
+        <w:t xml:space="preserve">( </w:t>
+      </w:r>
+      <w:proofErr w:type="spellStart"/>
+      <w:r>
+        <w:t>Iph</w:t>
+      </w:r>
+      <w:proofErr w:type="spellEnd"/>
+      <w:proofErr w:type="gramEnd"/>
+      <w:r>
+        <w:t xml:space="preserve"> ) sweep</w:t>
+      </w:r>
+    </w:p>
+    <w:p>
+      <w:r>
+        <w:t>Conclusion:</w:t>
+      </w:r>
+      <w:r>
+        <w:br/>
+        <w:t>The PV model responds correctly to changes in illumination. Higher irradiance produces higher output voltage, indicating increased power generation capability.</w:t>
+      </w:r>
+    </w:p>
+    <w:p>
+      <w:r>
+        <w:t>DAY-4</w:t>
+      </w:r>
+    </w:p>
+    <w:tbl>
+      <w:tblPr>
+        <w:tblStyle w:val="TableGrid"/>
+        <w:tblW w:w="0" w:type="auto"/>
+        <w:tblLook w:val="04A0" w:firstRow="1" w:lastRow="0" w:firstColumn="1" w:lastColumn="0" w:noHBand="0" w:noVBand="1"/>
+      </w:tblPr>
+      <w:tblGrid>
+        <w:gridCol w:w="1822"/>
+        <w:gridCol w:w="1848"/>
+        <w:gridCol w:w="1854"/>
+        <w:gridCol w:w="1761"/>
+        <w:gridCol w:w="1731"/>
+      </w:tblGrid>
+      <w:tr>
+        <w:tc>
+          <w:tcPr>
+            <w:tcW w:w="1822" w:type="dxa"/>
+          </w:tcPr>
+          <w:p>
+            <w:r>
+              <w:t>Sno</w:t>
+            </w:r>
+          </w:p>
+        </w:tc>
+        <w:tc>
+          <w:tcPr>
+            <w:tcW w:w="1848" w:type="dxa"/>
+          </w:tcPr>
+          <w:p>
+            <w:r>
+              <w:t>R</w:t>
+            </w:r>
+          </w:p>
+        </w:tc>
+        <w:tc>
+          <w:tcPr>
+            <w:tcW w:w="1854" w:type="dxa"/>
+          </w:tcPr>
+          <w:p>
+            <w:proofErr w:type="spellStart"/>
+            <w:r>
+              <w:t>Vout</w:t>
+            </w:r>
+            <w:proofErr w:type="spellEnd"/>
+          </w:p>
+        </w:tc>
+        <w:tc>
+          <w:tcPr>
+            <w:tcW w:w="1761" w:type="dxa"/>
+          </w:tcPr>
+          <w:p>
+            <w:proofErr w:type="spellStart"/>
+            <w:r>
+              <w:t>Iload</w:t>
+            </w:r>
+            <w:proofErr w:type="spellEnd"/>
+          </w:p>
+        </w:tc>
+        <w:tc>
+          <w:tcPr>
+            <w:tcW w:w="1731" w:type="dxa"/>
+          </w:tcPr>
+          <w:p>
+            <w:r>
+              <w:t>P</w:t>
+            </w:r>
+          </w:p>
+        </w:tc>
+      </w:tr>
+      <w:tr>
+        <w:tc>
+          <w:tcPr>
+            <w:tcW w:w="1822" w:type="dxa"/>
+          </w:tcPr>
+          <w:p>
+            <w:r>
+              <w:t>1</w:t>
+            </w:r>
+          </w:p>
+        </w:tc>
+        <w:tc>
+          <w:tcPr>
+            <w:tcW w:w="1848" w:type="dxa"/>
+          </w:tcPr>
+          <w:p>
+            <w:r>
+              <w:t>10</w:t>
+            </w:r>
+          </w:p>
+        </w:tc>
+        <w:tc>
+          <w:tcPr>
+            <w:tcW w:w="1854" w:type="dxa"/>
+          </w:tcPr>
+          <w:p>
+            <w:r>
+              <w:t>0.942</w:t>
+            </w:r>
+          </w:p>
+        </w:tc>
+        <w:tc>
+          <w:tcPr>
+            <w:tcW w:w="1761" w:type="dxa"/>
+          </w:tcPr>
+          <w:p>
+            <w:r>
+              <w:t>0.0942</w:t>
+            </w:r>
+          </w:p>
+        </w:tc>
+        <w:tc>
+          <w:tcPr>
+            <w:tcW w:w="1731" w:type="dxa"/>
+          </w:tcPr>
+          <w:p>
+            <w:r>
+              <w:t>0.0887W</w:t>
+            </w:r>
+          </w:p>
+        </w:tc>
+      </w:tr>
+      <w:tr>
+        <w:tc>
+          <w:tcPr>
+            <w:tcW w:w="1822" w:type="dxa"/>
+          </w:tcPr>
+          <w:p>
+            <w:r>
+              <w:t>2</w:t>
+            </w:r>
+          </w:p>
+        </w:tc>
+        <w:tc>
+          <w:tcPr>
+            <w:tcW w:w="1848" w:type="dxa"/>
+          </w:tcPr>
+          <w:p>
+            <w:r>
+              <w:t>50</w:t>
+            </w:r>
+          </w:p>
+        </w:tc>
+        <w:tc>
+          <w:tcPr>
+            <w:tcW w:w="1854" w:type="dxa"/>
+          </w:tcPr>
+          <w:p>
+            <w:r>
+              <w:t>0.957</w:t>
+            </w:r>
+          </w:p>
+        </w:tc>
+        <w:tc>
+          <w:tcPr>
+            <w:tcW w:w="1761" w:type="dxa"/>
+          </w:tcPr>
+          <w:p>
+            <w:r>
+              <w:t>0.0191</w:t>
+            </w:r>
+          </w:p>
+        </w:tc>
+        <w:tc>
+          <w:tcPr>
+            <w:tcW w:w="1731" w:type="dxa"/>
+          </w:tcPr>
+          <w:p>
+            <w:r>
+              <w:t>0.0183W</w:t>
+            </w:r>
+          </w:p>
+        </w:tc>
+      </w:tr>
+      <w:tr>
+        <w:tc>
+          <w:tcPr>
+            <w:tcW w:w="1822" w:type="dxa"/>
+          </w:tcPr>
+          <w:p>
+            <w:r>
+              <w:t>3</w:t>
+            </w:r>
+          </w:p>
+        </w:tc>
+        <w:tc>
+          <w:tcPr>
+            <w:tcW w:w="1848" w:type="dxa"/>
+          </w:tcPr>
+          <w:p>
+            <w:r>
+              <w:t>100</w:t>
+            </w:r>
+          </w:p>
+        </w:tc>
+        <w:tc>
+          <w:tcPr>
+            <w:tcW w:w="1854" w:type="dxa"/>
+          </w:tcPr>
+          <w:p>
+            <w:r>
+              <w:t>0.955</w:t>
+            </w:r>
+          </w:p>
+        </w:tc>
+        <w:tc>
+          <w:tcPr>
+            <w:tcW w:w="1761" w:type="dxa"/>
+          </w:tcPr>
+          <w:p>
+            <w:r>
+              <w:t>0.0095</w:t>
+            </w:r>
+          </w:p>
+        </w:tc>
+        <w:tc>
+          <w:tcPr>
+            <w:tcW w:w="1731" w:type="dxa"/>
+          </w:tcPr>
+          <w:p>
+            <w:r>
+              <w:t>0.00927W</w:t>
+            </w:r>
+          </w:p>
+        </w:tc>
+      </w:tr>
+      <w:tr>
+        <w:tc>
+          <w:tcPr>
+            <w:tcW w:w="1822" w:type="dxa"/>
+          </w:tcPr>
+          <w:p>
+            <w:r>
+              <w:t>4</w:t>
+            </w:r>
+          </w:p>
+        </w:tc>
+        <w:tc>
+          <w:tcPr>
+            <w:tcW w:w="1848" w:type="dxa"/>
+          </w:tcPr>
+          <w:p>
+            <w:r>
+              <w:t>500</w:t>
+            </w:r>
+          </w:p>
+        </w:tc>
+        <w:tc>
+          <w:tcPr>
+            <w:tcW w:w="1854" w:type="dxa"/>
+          </w:tcPr>
+          <w:p>
+            <w:r>
+              <w:t>0.960</w:t>
+            </w:r>
+          </w:p>
+        </w:tc>
+        <w:tc>
+          <w:tcPr>
+            <w:tcW w:w="1761" w:type="dxa"/>
+          </w:tcPr>
+          <w:p>
+            <w:r>
+              <w:t>0.0019</w:t>
+            </w:r>
+          </w:p>
+        </w:tc>
+        <w:tc>
+          <w:tcPr>
+            <w:tcW w:w="1731" w:type="dxa"/>
+          </w:tcPr>
+          <w:p>
+            <w:r>
+              <w:t>0.00184W</w:t>
+            </w:r>
+          </w:p>
+        </w:tc>
+      </w:tr>
+      <w:tr>
+        <w:tc>
+          <w:tcPr>
+            <w:tcW w:w="1822" w:type="dxa"/>
+          </w:tcPr>
+          <w:p>
+            <w:r>
+              <w:t>5</w:t>
+            </w:r>
+          </w:p>
+        </w:tc>
+        <w:tc>
+          <w:tcPr>
+            <w:tcW w:w="1848" w:type="dxa"/>
+          </w:tcPr>
+          <w:p>
+            <w:r>
+              <w:t>1000</w:t>
+            </w:r>
+          </w:p>
+        </w:tc>
+        <w:tc>
+          <w:tcPr>
+            <w:tcW w:w="1854" w:type="dxa"/>
+          </w:tcPr>
+          <w:p>
+            <w:r>
+              <w:t>0.955</w:t>
+            </w:r>
+          </w:p>
+        </w:tc>
+        <w:tc>
+          <w:tcPr>
+            <w:tcW w:w="1761" w:type="dxa"/>
+          </w:tcPr>
+          <w:p>
+            <w:r>
+              <w:t>0.955*10^-3</w:t>
+            </w:r>
+          </w:p>
+        </w:tc>
+        <w:tc>
+          <w:tcPr>
+            <w:tcW w:w="1731" w:type="dxa"/>
+          </w:tcPr>
+          <w:p>
+            <w:r>
+              <w:t>0.912mW</w:t>
+            </w:r>
+          </w:p>
+        </w:tc>
+      </w:tr>
+      <w:tr>
+        <w:tc>
+          <w:tcPr>
+            <w:tcW w:w="1822" w:type="dxa"/>
+          </w:tcPr>
+          <w:p>
+            <w:r>
+              <w:t>6</w:t>
+            </w:r>
+          </w:p>
+        </w:tc>
+        <w:tc>
+          <w:tcPr>
+            <w:tcW w:w="1848" w:type="dxa"/>
+          </w:tcPr>
+          <w:p>
+            <w:r>
+              <w:t>5000</w:t>
+            </w:r>
+          </w:p>
+        </w:tc>
+        <w:tc>
+          <w:tcPr>
+            <w:tcW w:w="1854" w:type="dxa"/>
+          </w:tcPr>
+          <w:p>
+            <w:r>
+              <w:t>0.962</w:t>
+            </w:r>
+          </w:p>
+        </w:tc>
+        <w:tc>
+          <w:tcPr>
+            <w:tcW w:w="1761" w:type="dxa"/>
+          </w:tcPr>
+          <w:p>
+            <w:r>
+              <w:t>0.192*10^-3</w:t>
+            </w:r>
+          </w:p>
+        </w:tc>
+        <w:tc>
+          <w:tcPr>
+            <w:tcW w:w="1731" w:type="dxa"/>
+          </w:tcPr>
+          <w:p>
+            <w:r>
+              <w:t>0.1850mW</w:t>
+            </w:r>
+          </w:p>
+        </w:tc>
+      </w:tr>
+      <w:tr>
+        <w:tc>
+          <w:tcPr>
+            <w:tcW w:w="1822" w:type="dxa"/>
+          </w:tcPr>
+          <w:p>
+            <w:r>
+              <w:t>7</w:t>
+            </w:r>
+          </w:p>
+        </w:tc>
+        <w:tc>
+          <w:tcPr>
+            <w:tcW w:w="1848" w:type="dxa"/>
+          </w:tcPr>
+          <w:p>
+            <w:r>
+              <w:t>10000</w:t>
+            </w:r>
+          </w:p>
+        </w:tc>
+        <w:tc>
+          <w:tcPr>
+            <w:tcW w:w="1854" w:type="dxa"/>
+          </w:tcPr>
+          <w:p>
+            <w:r>
+              <w:t>0.962</w:t>
+            </w:r>
+          </w:p>
+        </w:tc>
+        <w:tc>
+          <w:tcPr>
+            <w:tcW w:w="1761" w:type="dxa"/>
+          </w:tcPr>
+          <w:p>
+            <w:r>
+              <w:t>0.0962*10^-3</w:t>
+            </w:r>
+          </w:p>
+        </w:tc>
+        <w:tc>
+          <w:tcPr>
+            <w:tcW w:w="1731" w:type="dxa"/>
+          </w:tcPr>
+          <w:p>
+            <w:r>
+              <w:t>0.0925mW</w:t>
+            </w:r>
+          </w:p>
+        </w:tc>
+      </w:tr>
+    </w:tbl>
+    <w:p/>
+    <w:p>
+      <w:r>
         <w:rPr>
-          <w:ins w:id="41" w:author="Lenovo" w:date="2026-06-17T21:07:00Z" w16du:dateUtc="2026-06-17T15:37:00Z"/>
+          <w:noProof/>
         </w:rPr>
-      </w:pPr>
-      <w:ins w:id="42" w:author="Lenovo" w:date="2026-06-17T21:07:00Z" w16du:dateUtc="2026-06-17T15:37:00Z">
-        <w:r>
-          <w:t>Circuit used</w:t>
-        </w:r>
-      </w:ins>
-    </w:p>
-    <w:p>
-      <w:pPr>
+        <w:drawing>
+          <wp:inline distT="0" distB="0" distL="0" distR="0" wp14:anchorId="5B80B3F6" wp14:editId="7384B91C">
+            <wp:extent cx="5731510" cy="1763395"/>
+            <wp:effectExtent l="0" t="0" r="2540" b="8255"/>
+            <wp:docPr id="1399856092" name="Picture 1"/>
+            <wp:cNvGraphicFramePr>
+              <a:graphicFrameLocks xmlns:a="http://schemas.openxmlformats.org/drawingml/2006/main" noChangeAspect="1"/>
+            </wp:cNvGraphicFramePr>
+            <a:graphic xmlns:a="http://schemas.openxmlformats.org/drawingml/2006/main">
+              <a:graphicData uri="http://schemas.openxmlformats.org/drawingml/2006/picture">
+                <pic:pic xmlns:pic="http://schemas.openxmlformats.org/drawingml/2006/picture">
+                  <pic:nvPicPr>
+                    <pic:cNvPr id="1399856092" name=""/>
+                    <pic:cNvPicPr/>
+                  </pic:nvPicPr>
+                  <pic:blipFill>
+                    <a:blip r:embed="rId13"/>
+                    <a:stretch>
+                      <a:fillRect/>
+                    </a:stretch>
+                  </pic:blipFill>
+                  <pic:spPr>
+                    <a:xfrm>
+                      <a:off x="0" y="0"/>
+                      <a:ext cx="5731510" cy="1763395"/>
+                    </a:xfrm>
+                    <a:prstGeom prst="rect">
+                      <a:avLst/>
+                    </a:prstGeom>
+                  </pic:spPr>
+                </pic:pic>
+              </a:graphicData>
+            </a:graphic>
+          </wp:inline>
+        </w:drawing>
+      </w:r>
+    </w:p>
+    <w:p>
+      <w:r>
+        <w:t>R=10ohm</w:t>
+      </w:r>
+    </w:p>
+    <w:p>
+      <w:r>
         <w:rPr>
-          <w:ins w:id="43" w:author="Lenovo" w:date="2026-06-17T21:07:00Z" w16du:dateUtc="2026-06-17T15:37:00Z"/>
+          <w:noProof/>
         </w:rPr>
-      </w:pPr>
-      <w:ins w:id="44" w:author="Lenovo" w:date="2026-06-17T21:07:00Z" w16du:dateUtc="2026-06-17T15:37:00Z">
-        <w:r>
-          <w:rPr>
-            <w:noProof/>
-          </w:rPr>
-          <w:drawing>
-            <wp:inline distT="0" distB="0" distL="0" distR="0" wp14:anchorId="5881176B" wp14:editId="6B6C43ED">
-              <wp:extent cx="5731510" cy="1818640"/>
-              <wp:effectExtent l="0" t="0" r="2540" b="0"/>
-              <wp:docPr id="557308909" name="Picture 1"/>
-              <wp:cNvGraphicFramePr>
-                <a:graphicFrameLocks xmlns:a="http://schemas.openxmlformats.org/drawingml/2006/main" noChangeAspect="1"/>
-              </wp:cNvGraphicFramePr>
-              <a:graphic xmlns:a="http://schemas.openxmlformats.org/drawingml/2006/main">
-                <a:graphicData uri="http://schemas.openxmlformats.org/drawingml/2006/picture">
-                  <pic:pic xmlns:pic="http://schemas.openxmlformats.org/drawingml/2006/picture">
-                    <pic:nvPicPr>
-                      <pic:cNvPr id="557308909" name=""/>
-                      <pic:cNvPicPr/>
-                    </pic:nvPicPr>
-                    <pic:blipFill>
-                      <a:blip r:embed="rId12"/>
-                      <a:stretch>
-                        <a:fillRect/>
-                      </a:stretch>
-                    </pic:blipFill>
-                    <pic:spPr>
-                      <a:xfrm>
-                        <a:off x="0" y="0"/>
-                        <a:ext cx="5731510" cy="1818640"/>
-                      </a:xfrm>
-                      <a:prstGeom prst="rect">
-                        <a:avLst/>
-                      </a:prstGeom>
-                    </pic:spPr>
-                  </pic:pic>
-                </a:graphicData>
-              </a:graphic>
-            </wp:inline>
-          </w:drawing>
-        </w:r>
-      </w:ins>
-    </w:p>
-    <w:p>
-      <w:pPr>
+        <w:lastRenderedPageBreak/>
+        <w:drawing>
+          <wp:inline distT="0" distB="0" distL="0" distR="0" wp14:anchorId="45BE51B8" wp14:editId="3151E513">
+            <wp:extent cx="5731510" cy="1842135"/>
+            <wp:effectExtent l="0" t="0" r="2540" b="5715"/>
+            <wp:docPr id="533492910" name="Picture 1"/>
+            <wp:cNvGraphicFramePr>
+              <a:graphicFrameLocks xmlns:a="http://schemas.openxmlformats.org/drawingml/2006/main" noChangeAspect="1"/>
+            </wp:cNvGraphicFramePr>
+            <a:graphic xmlns:a="http://schemas.openxmlformats.org/drawingml/2006/main">
+              <a:graphicData uri="http://schemas.openxmlformats.org/drawingml/2006/picture">
+                <pic:pic xmlns:pic="http://schemas.openxmlformats.org/drawingml/2006/picture">
+                  <pic:nvPicPr>
+                    <pic:cNvPr id="533492910" name=""/>
+                    <pic:cNvPicPr/>
+                  </pic:nvPicPr>
+                  <pic:blipFill>
+                    <a:blip r:embed="rId14"/>
+                    <a:stretch>
+                      <a:fillRect/>
+                    </a:stretch>
+                  </pic:blipFill>
+                  <pic:spPr>
+                    <a:xfrm>
+                      <a:off x="0" y="0"/>
+                      <a:ext cx="5731510" cy="1842135"/>
+                    </a:xfrm>
+                    <a:prstGeom prst="rect">
+                      <a:avLst/>
+                    </a:prstGeom>
+                  </pic:spPr>
+                </pic:pic>
+              </a:graphicData>
+            </a:graphic>
+          </wp:inline>
+        </w:drawing>
+      </w:r>
+    </w:p>
+    <w:p>
+      <w:r>
+        <w:t>R=50ohm</w:t>
+      </w:r>
+    </w:p>
+    <w:p>
+      <w:r>
         <w:rPr>
-          <w:ins w:id="45" w:author="Lenovo" w:date="2026-06-17T21:07:00Z" w16du:dateUtc="2026-06-17T15:37:00Z"/>
+          <w:noProof/>
         </w:rPr>
-      </w:pPr>
-      <w:ins w:id="46" w:author="Lenovo" w:date="2026-06-17T21:07:00Z" w16du:dateUtc="2026-06-17T15:37:00Z">
-        <w:r>
-          <w:t xml:space="preserve">Irradiance </w:t>
-        </w:r>
-        <w:proofErr w:type="gramStart"/>
-        <w:r>
-          <w:t xml:space="preserve">( </w:t>
-        </w:r>
-        <w:proofErr w:type="spellStart"/>
-        <w:r>
-          <w:t>Iph</w:t>
-        </w:r>
-        <w:proofErr w:type="spellEnd"/>
-        <w:proofErr w:type="gramEnd"/>
-        <w:r>
-          <w:t xml:space="preserve"> ) sweep</w:t>
-        </w:r>
-      </w:ins>
-    </w:p>
-    <w:p>
-      <w:pPr>
+        <w:drawing>
+          <wp:inline distT="0" distB="0" distL="0" distR="0" wp14:anchorId="2DCDCC97" wp14:editId="4B2E89A8">
+            <wp:extent cx="5731510" cy="1812925"/>
+            <wp:effectExtent l="0" t="0" r="2540" b="0"/>
+            <wp:docPr id="1150246076" name="Picture 1"/>
+            <wp:cNvGraphicFramePr>
+              <a:graphicFrameLocks xmlns:a="http://schemas.openxmlformats.org/drawingml/2006/main" noChangeAspect="1"/>
+            </wp:cNvGraphicFramePr>
+            <a:graphic xmlns:a="http://schemas.openxmlformats.org/drawingml/2006/main">
+              <a:graphicData uri="http://schemas.openxmlformats.org/drawingml/2006/picture">
+                <pic:pic xmlns:pic="http://schemas.openxmlformats.org/drawingml/2006/picture">
+                  <pic:nvPicPr>
+                    <pic:cNvPr id="1150246076" name=""/>
+                    <pic:cNvPicPr/>
+                  </pic:nvPicPr>
+                  <pic:blipFill>
+                    <a:blip r:embed="rId15"/>
+                    <a:stretch>
+                      <a:fillRect/>
+                    </a:stretch>
+                  </pic:blipFill>
+                  <pic:spPr>
+                    <a:xfrm>
+                      <a:off x="0" y="0"/>
+                      <a:ext cx="5731510" cy="1812925"/>
+                    </a:xfrm>
+                    <a:prstGeom prst="rect">
+                      <a:avLst/>
+                    </a:prstGeom>
+                  </pic:spPr>
+                </pic:pic>
+              </a:graphicData>
+            </a:graphic>
+          </wp:inline>
+        </w:drawing>
+      </w:r>
+    </w:p>
+    <w:p>
+      <w:r>
+        <w:t>R=100ohm</w:t>
+      </w:r>
+    </w:p>
+    <w:p>
+      <w:r>
         <w:rPr>
-          <w:ins w:id="47" w:author="Lenovo" w:date="2026-06-17T21:07:00Z" w16du:dateUtc="2026-06-17T15:37:00Z"/>
+          <w:noProof/>
         </w:rPr>
-      </w:pPr>
-      <w:ins w:id="48" w:author="Lenovo" w:date="2026-06-17T21:07:00Z" w16du:dateUtc="2026-06-17T15:37:00Z">
-        <w:r>
-          <w:t>Conclusion:</w:t>
-        </w:r>
-        <w:r>
-          <w:br/>
-          <w:t>The PV model responds correctly to changes in illumination. Higher irradiance produces higher output voltage, indicating increased power generation capability.</w:t>
-        </w:r>
-      </w:ins>
-    </w:p>
-    <w:p>
-      <w:pPr>
+        <w:drawing>
+          <wp:inline distT="0" distB="0" distL="0" distR="0" wp14:anchorId="5363D2D6" wp14:editId="379C4FA8">
+            <wp:extent cx="5731510" cy="1825625"/>
+            <wp:effectExtent l="0" t="0" r="2540" b="3175"/>
+            <wp:docPr id="304637135" name="Picture 1"/>
+            <wp:cNvGraphicFramePr>
+              <a:graphicFrameLocks xmlns:a="http://schemas.openxmlformats.org/drawingml/2006/main" noChangeAspect="1"/>
+            </wp:cNvGraphicFramePr>
+            <a:graphic xmlns:a="http://schemas.openxmlformats.org/drawingml/2006/main">
+              <a:graphicData uri="http://schemas.openxmlformats.org/drawingml/2006/picture">
+                <pic:pic xmlns:pic="http://schemas.openxmlformats.org/drawingml/2006/picture">
+                  <pic:nvPicPr>
+                    <pic:cNvPr id="304637135" name=""/>
+                    <pic:cNvPicPr/>
+                  </pic:nvPicPr>
+                  <pic:blipFill>
+                    <a:blip r:embed="rId16"/>
+                    <a:stretch>
+                      <a:fillRect/>
+                    </a:stretch>
+                  </pic:blipFill>
+                  <pic:spPr>
+                    <a:xfrm>
+                      <a:off x="0" y="0"/>
+                      <a:ext cx="5731510" cy="1825625"/>
+                    </a:xfrm>
+                    <a:prstGeom prst="rect">
+                      <a:avLst/>
+                    </a:prstGeom>
+                  </pic:spPr>
+                </pic:pic>
+              </a:graphicData>
+            </a:graphic>
+          </wp:inline>
+        </w:drawing>
+      </w:r>
+    </w:p>
+    <w:p>
+      <w:r>
+        <w:t>R=500ohm</w:t>
+      </w:r>
+    </w:p>
+    <w:p>
+      <w:r>
         <w:rPr>
-          <w:ins w:id="49" w:author="Lenovo" w:date="2026-06-17T21:07:00Z" w16du:dateUtc="2026-06-17T15:37:00Z"/>
+          <w:noProof/>
         </w:rPr>
-      </w:pPr>
-    </w:p>
+        <w:drawing>
+          <wp:inline distT="0" distB="0" distL="0" distR="0" wp14:anchorId="02A8B9CD" wp14:editId="1DEC91D1">
+            <wp:extent cx="5731510" cy="1849755"/>
+            <wp:effectExtent l="0" t="0" r="2540" b="0"/>
+            <wp:docPr id="70333745" name="Picture 1"/>
+            <wp:cNvGraphicFramePr>
+              <a:graphicFrameLocks xmlns:a="http://schemas.openxmlformats.org/drawingml/2006/main" noChangeAspect="1"/>
+            </wp:cNvGraphicFramePr>
+            <a:graphic xmlns:a="http://schemas.openxmlformats.org/drawingml/2006/main">
+              <a:graphicData uri="http://schemas.openxmlformats.org/drawingml/2006/picture">
+                <pic:pic xmlns:pic="http://schemas.openxmlformats.org/drawingml/2006/picture">
+                  <pic:nvPicPr>
+                    <pic:cNvPr id="70333745" name=""/>
+                    <pic:cNvPicPr/>
+                  </pic:nvPicPr>
+                  <pic:blipFill>
+                    <a:blip r:embed="rId17"/>
+                    <a:stretch>
+                      <a:fillRect/>
+                    </a:stretch>
+                  </pic:blipFill>
+                  <pic:spPr>
+                    <a:xfrm>
+                      <a:off x="0" y="0"/>
+                      <a:ext cx="5731510" cy="1849755"/>
+                    </a:xfrm>
+                    <a:prstGeom prst="rect">
+                      <a:avLst/>
+                    </a:prstGeom>
+                  </pic:spPr>
+                </pic:pic>
+              </a:graphicData>
+            </a:graphic>
+          </wp:inline>
+        </w:drawing>
+      </w:r>
+    </w:p>
+    <w:p>
+      <w:r>
+        <w:lastRenderedPageBreak/>
+        <w:t>R=1000ohm</w:t>
+      </w:r>
+    </w:p>
+    <w:p>
+      <w:r>
+        <w:rPr>
+          <w:noProof/>
+        </w:rPr>
+        <w:drawing>
+          <wp:inline distT="0" distB="0" distL="0" distR="0" wp14:anchorId="17A2B614" wp14:editId="582FDBC1">
+            <wp:extent cx="5731510" cy="1836420"/>
+            <wp:effectExtent l="0" t="0" r="2540" b="0"/>
+            <wp:docPr id="694640197" name="Picture 1"/>
+            <wp:cNvGraphicFramePr>
+              <a:graphicFrameLocks xmlns:a="http://schemas.openxmlformats.org/drawingml/2006/main" noChangeAspect="1"/>
+            </wp:cNvGraphicFramePr>
+            <a:graphic xmlns:a="http://schemas.openxmlformats.org/drawingml/2006/main">
+              <a:graphicData uri="http://schemas.openxmlformats.org/drawingml/2006/picture">
+                <pic:pic xmlns:pic="http://schemas.openxmlformats.org/drawingml/2006/picture">
+                  <pic:nvPicPr>
+                    <pic:cNvPr id="694640197" name=""/>
+                    <pic:cNvPicPr/>
+                  </pic:nvPicPr>
+                  <pic:blipFill>
+                    <a:blip r:embed="rId18"/>
+                    <a:stretch>
+                      <a:fillRect/>
+                    </a:stretch>
+                  </pic:blipFill>
+                  <pic:spPr>
+                    <a:xfrm>
+                      <a:off x="0" y="0"/>
+                      <a:ext cx="5731510" cy="1836420"/>
+                    </a:xfrm>
+                    <a:prstGeom prst="rect">
+                      <a:avLst/>
+                    </a:prstGeom>
+                  </pic:spPr>
+                </pic:pic>
+              </a:graphicData>
+            </a:graphic>
+          </wp:inline>
+        </w:drawing>
+      </w:r>
+    </w:p>
+    <w:p>
+      <w:r>
+        <w:t>R=5000ohm</w:t>
+      </w:r>
+    </w:p>
+    <w:p>
+      <w:r>
+        <w:rPr>
+          <w:noProof/>
+        </w:rPr>
+        <w:drawing>
+          <wp:inline distT="0" distB="0" distL="0" distR="0" wp14:anchorId="3F0E67AF" wp14:editId="26AC85FC">
+            <wp:extent cx="5731510" cy="1815465"/>
+            <wp:effectExtent l="0" t="0" r="2540" b="0"/>
+            <wp:docPr id="1734767319" name="Picture 1"/>
+            <wp:cNvGraphicFramePr>
+              <a:graphicFrameLocks xmlns:a="http://schemas.openxmlformats.org/drawingml/2006/main" noChangeAspect="1"/>
+            </wp:cNvGraphicFramePr>
+            <a:graphic xmlns:a="http://schemas.openxmlformats.org/drawingml/2006/main">
+              <a:graphicData uri="http://schemas.openxmlformats.org/drawingml/2006/picture">
+                <pic:pic xmlns:pic="http://schemas.openxmlformats.org/drawingml/2006/picture">
+                  <pic:nvPicPr>
+                    <pic:cNvPr id="1734767319" name=""/>
+                    <pic:cNvPicPr/>
+                  </pic:nvPicPr>
+                  <pic:blipFill>
+                    <a:blip r:embed="rId19"/>
+                    <a:stretch>
+                      <a:fillRect/>
+                    </a:stretch>
+                  </pic:blipFill>
+                  <pic:spPr>
+                    <a:xfrm>
+                      <a:off x="0" y="0"/>
+                      <a:ext cx="5731510" cy="1815465"/>
+                    </a:xfrm>
+                    <a:prstGeom prst="rect">
+                      <a:avLst/>
+                    </a:prstGeom>
+                  </pic:spPr>
+                </pic:pic>
+              </a:graphicData>
+            </a:graphic>
+          </wp:inline>
+        </w:drawing>
+      </w:r>
+    </w:p>
+    <w:p>
+      <w:r>
+        <w:t>R=10000ohm</w:t>
+      </w:r>
+    </w:p>
+    <w:p>
+      <w:r>
+        <w:t>DAY5</w:t>
+      </w:r>
+    </w:p>
+    <w:p>
+      <w:r>
+        <w:t>BUILDING POWER CONDITIONING AFTER BUILDING SOLAR CELL AND PROVING THAT IT WORKS</w:t>
+      </w:r>
+    </w:p>
+    <w:p>
+      <w:pPr>
+        <w:rPr>
+          <w:b/>
+          <w:bCs/>
+        </w:rPr>
+      </w:pPr>
+      <w:r>
+        <w:rPr>
+          <w:b/>
+          <w:bCs/>
+        </w:rPr>
+        <w:t xml:space="preserve">Day </w:t>
+      </w:r>
+      <w:r>
+        <w:rPr>
+          <w:b/>
+          <w:bCs/>
+        </w:rPr>
+        <w:t>5</w:t>
+      </w:r>
+    </w:p>
+    <w:p>
+      <w:pPr>
+        <w:rPr>
+          <w:b/>
+          <w:bCs/>
+        </w:rPr>
+      </w:pPr>
+      <w:r>
+        <w:rPr>
+          <w:b/>
+          <w:bCs/>
+        </w:rPr>
+        <w:t>Objective</w:t>
+      </w:r>
+    </w:p>
+    <w:p>
+      <w:r>
+        <w:t>Begin development of the power-conditioning stage required to interface the solar-cell output with the audio amplifier.</w:t>
+      </w:r>
+    </w:p>
+    <w:p>
+      <w:pPr>
+        <w:rPr>
+          <w:b/>
+          <w:bCs/>
+        </w:rPr>
+      </w:pPr>
+      <w:r>
+        <w:rPr>
+          <w:b/>
+          <w:bCs/>
+        </w:rPr>
+        <w:t>Work Performed</w:t>
+      </w:r>
+    </w:p>
+    <w:p>
+      <w:pPr>
+        <w:numPr>
+          <w:ilvl w:val="0"/>
+          <w:numId w:val="2"/>
+        </w:numPr>
+      </w:pPr>
+      <w:r>
+        <w:t>Studied the operation of a boost converter.</w:t>
+      </w:r>
+    </w:p>
+    <w:p>
+      <w:pPr>
+        <w:numPr>
+          <w:ilvl w:val="0"/>
+          <w:numId w:val="2"/>
+        </w:numPr>
+      </w:pPr>
+      <w:r>
+        <w:t>Built an initial boost-converter circuit in PSpice using:</w:t>
+      </w:r>
+    </w:p>
+    <w:p>
+      <w:pPr>
+        <w:numPr>
+          <w:ilvl w:val="1"/>
+          <w:numId w:val="2"/>
+        </w:numPr>
+      </w:pPr>
+      <w:r>
+        <w:t>Inductor</w:t>
+      </w:r>
+    </w:p>
+    <w:p>
+      <w:pPr>
+        <w:numPr>
+          <w:ilvl w:val="1"/>
+          <w:numId w:val="2"/>
+        </w:numPr>
+      </w:pPr>
+      <w:r>
+        <w:t>MOSFET switch (</w:t>
+      </w:r>
+      <w:proofErr w:type="spellStart"/>
+      <w:r>
+        <w:t>MbreakN</w:t>
+      </w:r>
+      <w:proofErr w:type="spellEnd"/>
+      <w:r>
+        <w:t>)</w:t>
+      </w:r>
+    </w:p>
+    <w:p>
+      <w:pPr>
+        <w:numPr>
+          <w:ilvl w:val="1"/>
+          <w:numId w:val="2"/>
+        </w:numPr>
+      </w:pPr>
+      <w:r>
+        <w:t>Diode</w:t>
+      </w:r>
+    </w:p>
+    <w:p>
+      <w:pPr>
+        <w:numPr>
+          <w:ilvl w:val="1"/>
+          <w:numId w:val="2"/>
+        </w:numPr>
+      </w:pPr>
+      <w:r>
+        <w:lastRenderedPageBreak/>
+        <w:t>Output capacitor</w:t>
+      </w:r>
+    </w:p>
+    <w:p>
+      <w:pPr>
+        <w:numPr>
+          <w:ilvl w:val="1"/>
+          <w:numId w:val="2"/>
+        </w:numPr>
+      </w:pPr>
+      <w:r>
+        <w:t>Load resistor</w:t>
+      </w:r>
+    </w:p>
+    <w:p>
+      <w:pPr>
+        <w:numPr>
+          <w:ilvl w:val="0"/>
+          <w:numId w:val="2"/>
+        </w:numPr>
+      </w:pPr>
+      <w:r>
+        <w:t>Generated a PWM switching signal using a VPULSE source.</w:t>
+      </w:r>
+    </w:p>
+    <w:p>
+      <w:pPr>
+        <w:numPr>
+          <w:ilvl w:val="0"/>
+          <w:numId w:val="2"/>
+        </w:numPr>
+      </w:pPr>
+      <w:r>
+        <w:t>Connected the boost-converter stage to the previously developed solar-cell model.</w:t>
+      </w:r>
+    </w:p>
+    <w:p>
+      <w:pPr>
+        <w:numPr>
+          <w:ilvl w:val="0"/>
+          <w:numId w:val="2"/>
+        </w:numPr>
+      </w:pPr>
+      <w:r>
+        <w:t xml:space="preserve">Resolved multiple simulation and </w:t>
+      </w:r>
+      <w:proofErr w:type="spellStart"/>
+      <w:r>
+        <w:t>netlisting</w:t>
+      </w:r>
+      <w:proofErr w:type="spellEnd"/>
+      <w:r>
+        <w:t xml:space="preserve"> issues, including:</w:t>
+      </w:r>
+    </w:p>
+    <w:p>
+      <w:pPr>
+        <w:numPr>
+          <w:ilvl w:val="1"/>
+          <w:numId w:val="2"/>
+        </w:numPr>
+      </w:pPr>
+      <w:r>
+        <w:t>Floating nodes</w:t>
+      </w:r>
+    </w:p>
+    <w:p>
+      <w:pPr>
+        <w:numPr>
+          <w:ilvl w:val="1"/>
+          <w:numId w:val="2"/>
+        </w:numPr>
+      </w:pPr>
+      <w:r>
+        <w:t>Unconnected components</w:t>
+      </w:r>
+    </w:p>
+    <w:p>
+      <w:pPr>
+        <w:numPr>
+          <w:ilvl w:val="1"/>
+          <w:numId w:val="2"/>
+        </w:numPr>
+      </w:pPr>
+      <w:r>
+        <w:t>Component reference conflicts</w:t>
+      </w:r>
+    </w:p>
+    <w:p>
+      <w:pPr>
+        <w:numPr>
+          <w:ilvl w:val="0"/>
+          <w:numId w:val="2"/>
+        </w:numPr>
+      </w:pPr>
+      <w:r>
+        <w:t>Successfully obtained switching activity in the converter during transient simulation.</w:t>
+      </w:r>
+    </w:p>
+    <w:p>
+      <w:pPr>
+        <w:rPr>
+          <w:b/>
+          <w:bCs/>
+        </w:rPr>
+      </w:pPr>
+      <w:r>
+        <w:rPr>
+          <w:b/>
+          <w:bCs/>
+        </w:rPr>
+        <w:t>Observations</w:t>
+      </w:r>
+    </w:p>
+    <w:p>
+      <w:pPr>
+        <w:rPr>
+          <w:b/>
+          <w:bCs/>
+        </w:rPr>
+      </w:pPr>
+      <w:r>
+        <w:rPr>
+          <w:b/>
+          <w:bCs/>
+          <w:noProof/>
+        </w:rPr>
+        <w:drawing>
+          <wp:inline distT="0" distB="0" distL="0" distR="0" wp14:anchorId="439CCD1E" wp14:editId="7175D70E">
+            <wp:extent cx="5731510" cy="1917065"/>
+            <wp:effectExtent l="0" t="0" r="2540" b="6985"/>
+            <wp:docPr id="942544895" name="Picture 1"/>
+            <wp:cNvGraphicFramePr>
+              <a:graphicFrameLocks xmlns:a="http://schemas.openxmlformats.org/drawingml/2006/main" noChangeAspect="1"/>
+            </wp:cNvGraphicFramePr>
+            <a:graphic xmlns:a="http://schemas.openxmlformats.org/drawingml/2006/main">
+              <a:graphicData uri="http://schemas.openxmlformats.org/drawingml/2006/picture">
+                <pic:pic xmlns:pic="http://schemas.openxmlformats.org/drawingml/2006/picture">
+                  <pic:nvPicPr>
+                    <pic:cNvPr id="942544895" name=""/>
+                    <pic:cNvPicPr/>
+                  </pic:nvPicPr>
+                  <pic:blipFill>
+                    <a:blip r:embed="rId20"/>
+                    <a:stretch>
+                      <a:fillRect/>
+                    </a:stretch>
+                  </pic:blipFill>
+                  <pic:spPr>
+                    <a:xfrm>
+                      <a:off x="0" y="0"/>
+                      <a:ext cx="5731510" cy="1917065"/>
+                    </a:xfrm>
+                    <a:prstGeom prst="rect">
+                      <a:avLst/>
+                    </a:prstGeom>
+                  </pic:spPr>
+                </pic:pic>
+              </a:graphicData>
+            </a:graphic>
+          </wp:inline>
+        </w:drawing>
+      </w:r>
+      <w:r>
+        <w:rPr>
+          <w:b/>
+          <w:bCs/>
+          <w:noProof/>
+        </w:rPr>
+        <w:drawing>
+          <wp:inline distT="0" distB="0" distL="0" distR="0" wp14:anchorId="50C82826" wp14:editId="29B92195">
+            <wp:extent cx="5731510" cy="1821815"/>
+            <wp:effectExtent l="0" t="0" r="2540" b="6985"/>
+            <wp:docPr id="1138023615" name="Picture 1"/>
+            <wp:cNvGraphicFramePr>
+              <a:graphicFrameLocks xmlns:a="http://schemas.openxmlformats.org/drawingml/2006/main" noChangeAspect="1"/>
+            </wp:cNvGraphicFramePr>
+            <a:graphic xmlns:a="http://schemas.openxmlformats.org/drawingml/2006/main">
+              <a:graphicData uri="http://schemas.openxmlformats.org/drawingml/2006/picture">
+                <pic:pic xmlns:pic="http://schemas.openxmlformats.org/drawingml/2006/picture">
+                  <pic:nvPicPr>
+                    <pic:cNvPr id="1138023615" name=""/>
+                    <pic:cNvPicPr/>
+                  </pic:nvPicPr>
+                  <pic:blipFill>
+                    <a:blip r:embed="rId21"/>
+                    <a:stretch>
+                      <a:fillRect/>
+                    </a:stretch>
+                  </pic:blipFill>
+                  <pic:spPr>
+                    <a:xfrm>
+                      <a:off x="0" y="0"/>
+                      <a:ext cx="5731510" cy="1821815"/>
+                    </a:xfrm>
+                    <a:prstGeom prst="rect">
+                      <a:avLst/>
+                    </a:prstGeom>
+                  </pic:spPr>
+                </pic:pic>
+              </a:graphicData>
+            </a:graphic>
+          </wp:inline>
+        </w:drawing>
+      </w:r>
+    </w:p>
+    <w:p>
+      <w:pPr>
+        <w:numPr>
+          <w:ilvl w:val="0"/>
+          <w:numId w:val="3"/>
+        </w:numPr>
+      </w:pPr>
+      <w:r>
+        <w:t>The MOSFET switching action was verified through simulation.</w:t>
+      </w:r>
+    </w:p>
+    <w:p>
+      <w:pPr>
+        <w:numPr>
+          <w:ilvl w:val="0"/>
+          <w:numId w:val="3"/>
+        </w:numPr>
+      </w:pPr>
+      <w:r>
+        <w:t>Inductor node activity was observed, confirming that the switching stage is operational.</w:t>
+      </w:r>
+    </w:p>
+    <w:p>
+      <w:pPr>
+        <w:numPr>
+          <w:ilvl w:val="0"/>
+          <w:numId w:val="3"/>
+        </w:numPr>
+      </w:pPr>
+      <w:r>
+        <w:t>Output voltage boosting has not yet been achieved and requires further investigation.</w:t>
+      </w:r>
+    </w:p>
+    <w:p>
+      <w:pPr>
+        <w:numPr>
+          <w:ilvl w:val="0"/>
+          <w:numId w:val="3"/>
+        </w:numPr>
+      </w:pPr>
+      <w:r>
+        <w:lastRenderedPageBreak/>
+        <w:t>Additional work is needed to verify component orientation, output-node measurement, and converter efficiency.</w:t>
+      </w:r>
+    </w:p>
+    <w:p>
+      <w:pPr>
+        <w:rPr>
+          <w:b/>
+          <w:bCs/>
+        </w:rPr>
+      </w:pPr>
+      <w:r>
+        <w:rPr>
+          <w:b/>
+          <w:bCs/>
+        </w:rPr>
+        <w:t>Conclusion</w:t>
+      </w:r>
+    </w:p>
+    <w:p>
+      <w:r>
+        <w:t>A preliminary power-conditioning stage was successfully implemented and simulated. The boost-converter framework is operational, and switching behaviour has been verified. Future work will focus on obtaining the desired voltage boost and integrating the conditioned output with the audio amplifier stage.</w:t>
+      </w:r>
+    </w:p>
+    <w:p/>
     <w:p/>
     <w:sectPr>
       <w:pgSz w:w="11906" w:h="16838"/>
@@ -859,18 +1878,314 @@
       </w:rPr>
     </w:lvl>
   </w:abstractNum>
+  <w:abstractNum w:abstractNumId="1" w15:restartNumberingAfterBreak="0">
+    <w:nsid w:val="424D47D2"/>
+    <w:multiLevelType w:val="multilevel"/>
+    <w:tmpl w:val="114E598E"/>
+    <w:lvl w:ilvl="0">
+      <w:start w:val="1"/>
+      <w:numFmt w:val="bullet"/>
+      <w:lvlText w:val=""/>
+      <w:lvlJc w:val="left"/>
+      <w:pPr>
+        <w:tabs>
+          <w:tab w:val="num" w:pos="720"/>
+        </w:tabs>
+        <w:ind w:left="720" w:hanging="360"/>
+      </w:pPr>
+      <w:rPr>
+        <w:rFonts w:ascii="Symbol" w:hAnsi="Symbol" w:hint="default"/>
+        <w:sz w:val="20"/>
+      </w:rPr>
+    </w:lvl>
+    <w:lvl w:ilvl="1">
+      <w:start w:val="1"/>
+      <w:numFmt w:val="bullet"/>
+      <w:lvlText w:val="o"/>
+      <w:lvlJc w:val="left"/>
+      <w:pPr>
+        <w:tabs>
+          <w:tab w:val="num" w:pos="1440"/>
+        </w:tabs>
+        <w:ind w:left="1440" w:hanging="360"/>
+      </w:pPr>
+      <w:rPr>
+        <w:rFonts w:ascii="Courier New" w:hAnsi="Courier New" w:hint="default"/>
+        <w:sz w:val="20"/>
+      </w:rPr>
+    </w:lvl>
+    <w:lvl w:ilvl="2" w:tentative="1">
+      <w:start w:val="1"/>
+      <w:numFmt w:val="bullet"/>
+      <w:lvlText w:val=""/>
+      <w:lvlJc w:val="left"/>
+      <w:pPr>
+        <w:tabs>
+          <w:tab w:val="num" w:pos="2160"/>
+        </w:tabs>
+        <w:ind w:left="2160" w:hanging="360"/>
+      </w:pPr>
+      <w:rPr>
+        <w:rFonts w:ascii="Wingdings" w:hAnsi="Wingdings" w:hint="default"/>
+        <w:sz w:val="20"/>
+      </w:rPr>
+    </w:lvl>
+    <w:lvl w:ilvl="3" w:tentative="1">
+      <w:start w:val="1"/>
+      <w:numFmt w:val="bullet"/>
+      <w:lvlText w:val=""/>
+      <w:lvlJc w:val="left"/>
+      <w:pPr>
+        <w:tabs>
+          <w:tab w:val="num" w:pos="2880"/>
+        </w:tabs>
+        <w:ind w:left="2880" w:hanging="360"/>
+      </w:pPr>
+      <w:rPr>
+        <w:rFonts w:ascii="Wingdings" w:hAnsi="Wingdings" w:hint="default"/>
+        <w:sz w:val="20"/>
+      </w:rPr>
+    </w:lvl>
+    <w:lvl w:ilvl="4" w:tentative="1">
+      <w:start w:val="1"/>
+      <w:numFmt w:val="bullet"/>
+      <w:lvlText w:val=""/>
+      <w:lvlJc w:val="left"/>
+      <w:pPr>
+        <w:tabs>
+          <w:tab w:val="num" w:pos="3600"/>
+        </w:tabs>
+        <w:ind w:left="3600" w:hanging="360"/>
+      </w:pPr>
+      <w:rPr>
+        <w:rFonts w:ascii="Wingdings" w:hAnsi="Wingdings" w:hint="default"/>
+        <w:sz w:val="20"/>
+      </w:rPr>
+    </w:lvl>
+    <w:lvl w:ilvl="5" w:tentative="1">
+      <w:start w:val="1"/>
+      <w:numFmt w:val="bullet"/>
+      <w:lvlText w:val=""/>
+      <w:lvlJc w:val="left"/>
+      <w:pPr>
+        <w:tabs>
+          <w:tab w:val="num" w:pos="4320"/>
+        </w:tabs>
+        <w:ind w:left="4320" w:hanging="360"/>
+      </w:pPr>
+      <w:rPr>
+        <w:rFonts w:ascii="Wingdings" w:hAnsi="Wingdings" w:hint="default"/>
+        <w:sz w:val="20"/>
+      </w:rPr>
+    </w:lvl>
+    <w:lvl w:ilvl="6" w:tentative="1">
+      <w:start w:val="1"/>
+      <w:numFmt w:val="bullet"/>
+      <w:lvlText w:val=""/>
+      <w:lvlJc w:val="left"/>
+      <w:pPr>
+        <w:tabs>
+          <w:tab w:val="num" w:pos="5040"/>
+        </w:tabs>
+        <w:ind w:left="5040" w:hanging="360"/>
+      </w:pPr>
+      <w:rPr>
+        <w:rFonts w:ascii="Wingdings" w:hAnsi="Wingdings" w:hint="default"/>
+        <w:sz w:val="20"/>
+      </w:rPr>
+    </w:lvl>
+    <w:lvl w:ilvl="7" w:tentative="1">
+      <w:start w:val="1"/>
+      <w:numFmt w:val="bullet"/>
+      <w:lvlText w:val=""/>
+      <w:lvlJc w:val="left"/>
+      <w:pPr>
+        <w:tabs>
+          <w:tab w:val="num" w:pos="5760"/>
+        </w:tabs>
+        <w:ind w:left="5760" w:hanging="360"/>
+      </w:pPr>
+      <w:rPr>
+        <w:rFonts w:ascii="Wingdings" w:hAnsi="Wingdings" w:hint="default"/>
+        <w:sz w:val="20"/>
+      </w:rPr>
+    </w:lvl>
+    <w:lvl w:ilvl="8" w:tentative="1">
+      <w:start w:val="1"/>
+      <w:numFmt w:val="bullet"/>
+      <w:lvlText w:val=""/>
+      <w:lvlJc w:val="left"/>
+      <w:pPr>
+        <w:tabs>
+          <w:tab w:val="num" w:pos="6480"/>
+        </w:tabs>
+        <w:ind w:left="6480" w:hanging="360"/>
+      </w:pPr>
+      <w:rPr>
+        <w:rFonts w:ascii="Wingdings" w:hAnsi="Wingdings" w:hint="default"/>
+        <w:sz w:val="20"/>
+      </w:rPr>
+    </w:lvl>
+  </w:abstractNum>
+  <w:abstractNum w:abstractNumId="2" w15:restartNumberingAfterBreak="0">
+    <w:nsid w:val="7DDE7040"/>
+    <w:multiLevelType w:val="multilevel"/>
+    <w:tmpl w:val="50B0CD1A"/>
+    <w:lvl w:ilvl="0">
+      <w:start w:val="1"/>
+      <w:numFmt w:val="bullet"/>
+      <w:lvlText w:val=""/>
+      <w:lvlJc w:val="left"/>
+      <w:pPr>
+        <w:tabs>
+          <w:tab w:val="num" w:pos="720"/>
+        </w:tabs>
+        <w:ind w:left="720" w:hanging="360"/>
+      </w:pPr>
+      <w:rPr>
+        <w:rFonts w:ascii="Symbol" w:hAnsi="Symbol" w:hint="default"/>
+        <w:sz w:val="20"/>
+      </w:rPr>
+    </w:lvl>
+    <w:lvl w:ilvl="1" w:tentative="1">
+      <w:start w:val="1"/>
+      <w:numFmt w:val="bullet"/>
+      <w:lvlText w:val="o"/>
+      <w:lvlJc w:val="left"/>
+      <w:pPr>
+        <w:tabs>
+          <w:tab w:val="num" w:pos="1440"/>
+        </w:tabs>
+        <w:ind w:left="1440" w:hanging="360"/>
+      </w:pPr>
+      <w:rPr>
+        <w:rFonts w:ascii="Courier New" w:hAnsi="Courier New" w:hint="default"/>
+        <w:sz w:val="20"/>
+      </w:rPr>
+    </w:lvl>
+    <w:lvl w:ilvl="2" w:tentative="1">
+      <w:start w:val="1"/>
+      <w:numFmt w:val="bullet"/>
+      <w:lvlText w:val=""/>
+      <w:lvlJc w:val="left"/>
+      <w:pPr>
+        <w:tabs>
+          <w:tab w:val="num" w:pos="2160"/>
+        </w:tabs>
+        <w:ind w:left="2160" w:hanging="360"/>
+      </w:pPr>
+      <w:rPr>
+        <w:rFonts w:ascii="Wingdings" w:hAnsi="Wingdings" w:hint="default"/>
+        <w:sz w:val="20"/>
+      </w:rPr>
+    </w:lvl>
+    <w:lvl w:ilvl="3" w:tentative="1">
+      <w:start w:val="1"/>
+      <w:numFmt w:val="bullet"/>
+      <w:lvlText w:val=""/>
+      <w:lvlJc w:val="left"/>
+      <w:pPr>
+        <w:tabs>
+          <w:tab w:val="num" w:pos="2880"/>
+        </w:tabs>
+        <w:ind w:left="2880" w:hanging="360"/>
+      </w:pPr>
+      <w:rPr>
+        <w:rFonts w:ascii="Wingdings" w:hAnsi="Wingdings" w:hint="default"/>
+        <w:sz w:val="20"/>
+      </w:rPr>
+    </w:lvl>
+    <w:lvl w:ilvl="4" w:tentative="1">
+      <w:start w:val="1"/>
+      <w:numFmt w:val="bullet"/>
+      <w:lvlText w:val=""/>
+      <w:lvlJc w:val="left"/>
+      <w:pPr>
+        <w:tabs>
+          <w:tab w:val="num" w:pos="3600"/>
+        </w:tabs>
+        <w:ind w:left="3600" w:hanging="360"/>
+      </w:pPr>
+      <w:rPr>
+        <w:rFonts w:ascii="Wingdings" w:hAnsi="Wingdings" w:hint="default"/>
+        <w:sz w:val="20"/>
+      </w:rPr>
+    </w:lvl>
+    <w:lvl w:ilvl="5" w:tentative="1">
+      <w:start w:val="1"/>
+      <w:numFmt w:val="bullet"/>
+      <w:lvlText w:val=""/>
+      <w:lvlJc w:val="left"/>
+      <w:pPr>
+        <w:tabs>
+          <w:tab w:val="num" w:pos="4320"/>
+        </w:tabs>
+        <w:ind w:left="4320" w:hanging="360"/>
+      </w:pPr>
+      <w:rPr>
+        <w:rFonts w:ascii="Wingdings" w:hAnsi="Wingdings" w:hint="default"/>
+        <w:sz w:val="20"/>
+      </w:rPr>
+    </w:lvl>
+    <w:lvl w:ilvl="6" w:tentative="1">
+      <w:start w:val="1"/>
+      <w:numFmt w:val="bullet"/>
+      <w:lvlText w:val=""/>
+      <w:lvlJc w:val="left"/>
+      <w:pPr>
+        <w:tabs>
+          <w:tab w:val="num" w:pos="5040"/>
+        </w:tabs>
+        <w:ind w:left="5040" w:hanging="360"/>
+      </w:pPr>
+      <w:rPr>
+        <w:rFonts w:ascii="Wingdings" w:hAnsi="Wingdings" w:hint="default"/>
+        <w:sz w:val="20"/>
+      </w:rPr>
+    </w:lvl>
+    <w:lvl w:ilvl="7" w:tentative="1">
+      <w:start w:val="1"/>
+      <w:numFmt w:val="bullet"/>
+      <w:lvlText w:val=""/>
+      <w:lvlJc w:val="left"/>
+      <w:pPr>
+        <w:tabs>
+          <w:tab w:val="num" w:pos="5760"/>
+        </w:tabs>
+        <w:ind w:left="5760" w:hanging="360"/>
+      </w:pPr>
+      <w:rPr>
+        <w:rFonts w:ascii="Wingdings" w:hAnsi="Wingdings" w:hint="default"/>
+        <w:sz w:val="20"/>
+      </w:rPr>
+    </w:lvl>
+    <w:lvl w:ilvl="8" w:tentative="1">
+      <w:start w:val="1"/>
+      <w:numFmt w:val="bullet"/>
+      <w:lvlText w:val=""/>
+      <w:lvlJc w:val="left"/>
+      <w:pPr>
+        <w:tabs>
+          <w:tab w:val="num" w:pos="6480"/>
+        </w:tabs>
+        <w:ind w:left="6480" w:hanging="360"/>
+      </w:pPr>
+      <w:rPr>
+        <w:rFonts w:ascii="Wingdings" w:hAnsi="Wingdings" w:hint="default"/>
+        <w:sz w:val="20"/>
+      </w:rPr>
+    </w:lvl>
+  </w:abstractNum>
   <w:num w:numId="1" w16cid:durableId="350884524">
     <w:abstractNumId w:val="0"/>
   </w:num>
+  <w:num w:numId="2" w16cid:durableId="378750866">
+    <w:abstractNumId w:val="1"/>
+  </w:num>
+  <w:num w:numId="3" w16cid:durableId="1994096526">
+    <w:abstractNumId w:val="2"/>
+  </w:num>
 </w:numbering>
-</file>
-
-<file path=word/people.xml><?xml version="1.0" encoding="utf-8"?>
-<w15:people xmlns:wpc="http://schemas.microsoft.com/office/word/2010/wordprocessingCanvas" xmlns:cx="http://schemas.microsoft.com/office/drawing/2014/chartex" xmlns:cx1="http://schemas.microsoft.com/office/drawing/2015/9/8/chartex" xmlns:cx2="http://schemas.microsoft.com/office/drawing/2015/10/21/chartex" xmlns:cx3="http://schemas.microsoft.com/office/drawing/2016/5/9/chartex" xmlns:cx4="http://schemas.microsoft.com/office/drawing/2016/5/10/chartex" xmlns:cx5="http://schemas.microsoft.com/office/drawing/2016/5/11/chartex" xmlns:cx6="http://schemas.microsoft.com/office/drawing/2016/5/12/chartex" xmlns:cx7="http://schemas.microsoft.com/office/drawing/2016/5/13/chartex" xmlns:cx8="http://schemas.microsoft.com/office/drawing/2016/5/14/chartex" xmlns:mc="http://schemas.openxmlformats.org/markup-compatibility/2006" xmlns:aink="http://schemas.microsoft.com/office/drawing/2016/ink" xmlns:am3d="http://schemas.microsoft.com/office/drawing/2017/model3d" xmlns:o="urn:schemas-microsoft-com:office:office" xmlns:oel="http://schemas.microsoft.com/office/2019/extlst" xmlns:r="http://schemas.openxmlformats.org/officeDocument/2006/relationships" xmlns:m="http://schemas.openxmlformats.org/officeDocument/2006/math" xmlns:v="urn:schemas-microsoft-com:vml" xmlns:wp14="http://schemas.microsoft.com/office/word/2010/wordprocessingDrawing" xmlns:wp="http://schemas.openxmlformats.org/drawingml/2006/wordprocessingDrawing" xmlns:w10="urn:schemas-microsoft-com:office:word" xmlns:w="http://schemas.openxmlformats.org/wordprocessingml/2006/main" xmlns:w14="http://schemas.microsoft.com/office/word/2010/wordml" xmlns:w15="http://schemas.microsoft.com/office/word/2012/wordml" xmlns:w16cex="http://schemas.microsoft.com/office/word/2018/wordml/cex" xmlns:w16cid="http://schemas.microsoft.com/office/word/2016/wordml/cid" xmlns:w16="http://schemas.microsoft.com/office/word/2018/wordml" xmlns:w16du="http://schemas.microsoft.com/office/word/2023/wordml/word16du" xmlns:w16sdtdh="http://schemas.microsoft.com/office/word/2020/wordml/sdtdatahash" xmlns:w16sdtfl="http://schemas.microsoft.com/office/word/2024/wordml/sdtformatlock" xmlns:w16se="http://schemas.microsoft.com/office/word/2015/wordml/symex" xmlns:wpg="http://schemas.microsoft.com/office/word/2010/wordprocessingGroup" xmlns:wpi="http://schemas.microsoft.com/office/word/2010/wordprocessingInk" xmlns:wne="http://schemas.microsoft.com/office/word/2006/wordml" xmlns:wps="http://schemas.microsoft.com/office/word/2010/wordprocessingShape" mc:Ignorable="w14 w15 w16se w16cid w16 w16cex w16sdtdh w16sdtfl w16du wp14">
-  <w15:person w15:author="Lenovo">
-    <w15:presenceInfo w15:providerId="None" w15:userId="Lenovo"/>
-  </w15:person>
-</w15:people>
 </file>
 
 <file path=word/styles.xml><?xml version="1.0" encoding="utf-8"?>
@@ -1273,6 +2588,7 @@
   <w:style w:type="paragraph" w:default="1" w:styleId="Normal">
     <w:name w:val="Normal"/>
     <w:qFormat/>
+    <w:rsid w:val="00456F02"/>
   </w:style>
   <w:style w:type="paragraph" w:styleId="Heading1">
     <w:name w:val="heading 1"/>
@@ -1281,7 +2597,7 @@
     <w:link w:val="Heading1Char"/>
     <w:uiPriority w:val="9"/>
     <w:qFormat/>
-    <w:rsid w:val="00735938"/>
+    <w:rsid w:val="00456F02"/>
     <w:pPr>
       <w:keepNext/>
       <w:keepLines/>
@@ -1304,7 +2620,7 @@
     <w:semiHidden/>
     <w:unhideWhenUsed/>
     <w:qFormat/>
-    <w:rsid w:val="00735938"/>
+    <w:rsid w:val="00456F02"/>
     <w:pPr>
       <w:keepNext/>
       <w:keepLines/>
@@ -1327,7 +2643,7 @@
     <w:semiHidden/>
     <w:unhideWhenUsed/>
     <w:qFormat/>
-    <w:rsid w:val="00735938"/>
+    <w:rsid w:val="00456F02"/>
     <w:pPr>
       <w:keepNext/>
       <w:keepLines/>
@@ -1350,7 +2666,7 @@
     <w:semiHidden/>
     <w:unhideWhenUsed/>
     <w:qFormat/>
-    <w:rsid w:val="00735938"/>
+    <w:rsid w:val="00456F02"/>
     <w:pPr>
       <w:keepNext/>
       <w:keepLines/>
@@ -1373,7 +2689,7 @@
     <w:semiHidden/>
     <w:unhideWhenUsed/>
     <w:qFormat/>
-    <w:rsid w:val="00735938"/>
+    <w:rsid w:val="00456F02"/>
     <w:pPr>
       <w:keepNext/>
       <w:keepLines/>
@@ -1394,7 +2710,7 @@
     <w:semiHidden/>
     <w:unhideWhenUsed/>
     <w:qFormat/>
-    <w:rsid w:val="00735938"/>
+    <w:rsid w:val="00456F02"/>
     <w:pPr>
       <w:keepNext/>
       <w:keepLines/>
@@ -1417,7 +2733,7 @@
     <w:semiHidden/>
     <w:unhideWhenUsed/>
     <w:qFormat/>
-    <w:rsid w:val="00735938"/>
+    <w:rsid w:val="00456F02"/>
     <w:pPr>
       <w:keepNext/>
       <w:keepLines/>
@@ -1438,7 +2754,7 @@
     <w:semiHidden/>
     <w:unhideWhenUsed/>
     <w:qFormat/>
-    <w:rsid w:val="00735938"/>
+    <w:rsid w:val="00456F02"/>
     <w:pPr>
       <w:keepNext/>
       <w:keepLines/>
@@ -1461,7 +2777,7 @@
     <w:semiHidden/>
     <w:unhideWhenUsed/>
     <w:qFormat/>
-    <w:rsid w:val="00735938"/>
+    <w:rsid w:val="00456F02"/>
     <w:pPr>
       <w:keepNext/>
       <w:keepLines/>
@@ -1505,7 +2821,7 @@
     <w:basedOn w:val="DefaultParagraphFont"/>
     <w:link w:val="Heading1"/>
     <w:uiPriority w:val="9"/>
-    <w:rsid w:val="00735938"/>
+    <w:rsid w:val="00456F02"/>
     <w:rPr>
       <w:rFonts w:asciiTheme="majorHAnsi" w:eastAsiaTheme="majorEastAsia" w:hAnsiTheme="majorHAnsi" w:cstheme="majorBidi"/>
       <w:color w:val="2F5496" w:themeColor="accent1" w:themeShade="BF"/>
@@ -1519,7 +2835,7 @@
     <w:link w:val="Heading2"/>
     <w:uiPriority w:val="9"/>
     <w:semiHidden/>
-    <w:rsid w:val="00735938"/>
+    <w:rsid w:val="00456F02"/>
     <w:rPr>
       <w:rFonts w:asciiTheme="majorHAnsi" w:eastAsiaTheme="majorEastAsia" w:hAnsiTheme="majorHAnsi" w:cstheme="majorBidi"/>
       <w:color w:val="2F5496" w:themeColor="accent1" w:themeShade="BF"/>
@@ -1533,7 +2849,7 @@
     <w:link w:val="Heading3"/>
     <w:uiPriority w:val="9"/>
     <w:semiHidden/>
-    <w:rsid w:val="00735938"/>
+    <w:rsid w:val="00456F02"/>
     <w:rPr>
       <w:rFonts w:eastAsiaTheme="majorEastAsia" w:cstheme="majorBidi"/>
       <w:color w:val="2F5496" w:themeColor="accent1" w:themeShade="BF"/>
@@ -1547,7 +2863,7 @@
     <w:link w:val="Heading4"/>
     <w:uiPriority w:val="9"/>
     <w:semiHidden/>
-    <w:rsid w:val="00735938"/>
+    <w:rsid w:val="00456F02"/>
     <w:rPr>
       <w:rFonts w:eastAsiaTheme="majorEastAsia" w:cstheme="majorBidi"/>
       <w:i/>
@@ -1561,7 +2877,7 @@
     <w:link w:val="Heading5"/>
     <w:uiPriority w:val="9"/>
     <w:semiHidden/>
-    <w:rsid w:val="00735938"/>
+    <w:rsid w:val="00456F02"/>
     <w:rPr>
       <w:rFonts w:eastAsiaTheme="majorEastAsia" w:cstheme="majorBidi"/>
       <w:color w:val="2F5496" w:themeColor="accent1" w:themeShade="BF"/>
@@ -1573,7 +2889,7 @@
     <w:link w:val="Heading6"/>
     <w:uiPriority w:val="9"/>
     <w:semiHidden/>
-    <w:rsid w:val="00735938"/>
+    <w:rsid w:val="00456F02"/>
     <w:rPr>
       <w:rFonts w:eastAsiaTheme="majorEastAsia" w:cstheme="majorBidi"/>
       <w:i/>
@@ -1587,7 +2903,7 @@
     <w:link w:val="Heading7"/>
     <w:uiPriority w:val="9"/>
     <w:semiHidden/>
-    <w:rsid w:val="00735938"/>
+    <w:rsid w:val="00456F02"/>
     <w:rPr>
       <w:rFonts w:eastAsiaTheme="majorEastAsia" w:cstheme="majorBidi"/>
       <w:color w:val="595959" w:themeColor="text1" w:themeTint="A6"/>
@@ -1599,7 +2915,7 @@
     <w:link w:val="Heading8"/>
     <w:uiPriority w:val="9"/>
     <w:semiHidden/>
-    <w:rsid w:val="00735938"/>
+    <w:rsid w:val="00456F02"/>
     <w:rPr>
       <w:rFonts w:eastAsiaTheme="majorEastAsia" w:cstheme="majorBidi"/>
       <w:i/>
@@ -1613,7 +2929,7 @@
     <w:link w:val="Heading9"/>
     <w:uiPriority w:val="9"/>
     <w:semiHidden/>
-    <w:rsid w:val="00735938"/>
+    <w:rsid w:val="00456F02"/>
     <w:rPr>
       <w:rFonts w:eastAsiaTheme="majorEastAsia" w:cstheme="majorBidi"/>
       <w:color w:val="272727" w:themeColor="text1" w:themeTint="D8"/>
@@ -1626,7 +2942,7 @@
     <w:link w:val="TitleChar"/>
     <w:uiPriority w:val="10"/>
     <w:qFormat/>
-    <w:rsid w:val="00735938"/>
+    <w:rsid w:val="00456F02"/>
     <w:pPr>
       <w:spacing w:after="80" w:line="240" w:lineRule="auto"/>
       <w:contextualSpacing/>
@@ -1644,7 +2960,7 @@
     <w:basedOn w:val="DefaultParagraphFont"/>
     <w:link w:val="Title"/>
     <w:uiPriority w:val="10"/>
-    <w:rsid w:val="00735938"/>
+    <w:rsid w:val="00456F02"/>
     <w:rPr>
       <w:rFonts w:asciiTheme="majorHAnsi" w:eastAsiaTheme="majorEastAsia" w:hAnsiTheme="majorHAnsi" w:cstheme="majorBidi"/>
       <w:spacing w:val="-10"/>
@@ -1660,7 +2976,7 @@
     <w:link w:val="SubtitleChar"/>
     <w:uiPriority w:val="11"/>
     <w:qFormat/>
-    <w:rsid w:val="00735938"/>
+    <w:rsid w:val="00456F02"/>
     <w:pPr>
       <w:numPr>
         <w:ilvl w:val="1"/>
@@ -1679,7 +2995,7 @@
     <w:basedOn w:val="DefaultParagraphFont"/>
     <w:link w:val="Subtitle"/>
     <w:uiPriority w:val="11"/>
-    <w:rsid w:val="00735938"/>
+    <w:rsid w:val="00456F02"/>
     <w:rPr>
       <w:rFonts w:eastAsiaTheme="majorEastAsia" w:cstheme="majorBidi"/>
       <w:color w:val="595959" w:themeColor="text1" w:themeTint="A6"/>
@@ -1695,7 +3011,7 @@
     <w:link w:val="QuoteChar"/>
     <w:uiPriority w:val="29"/>
     <w:qFormat/>
-    <w:rsid w:val="00735938"/>
+    <w:rsid w:val="00456F02"/>
     <w:pPr>
       <w:spacing w:before="160"/>
       <w:jc w:val="center"/>
@@ -1711,7 +3027,7 @@
     <w:basedOn w:val="DefaultParagraphFont"/>
     <w:link w:val="Quote"/>
     <w:uiPriority w:val="29"/>
-    <w:rsid w:val="00735938"/>
+    <w:rsid w:val="00456F02"/>
     <w:rPr>
       <w:i/>
       <w:iCs/>
@@ -1723,7 +3039,7 @@
     <w:basedOn w:val="Normal"/>
     <w:uiPriority w:val="34"/>
     <w:qFormat/>
-    <w:rsid w:val="00735938"/>
+    <w:rsid w:val="00456F02"/>
     <w:pPr>
       <w:ind w:left="720"/>
       <w:contextualSpacing/>
@@ -1734,7 +3050,7 @@
     <w:basedOn w:val="DefaultParagraphFont"/>
     <w:uiPriority w:val="21"/>
     <w:qFormat/>
-    <w:rsid w:val="00735938"/>
+    <w:rsid w:val="00456F02"/>
     <w:rPr>
       <w:i/>
       <w:iCs/>
@@ -1748,7 +3064,7 @@
     <w:link w:val="IntenseQuoteChar"/>
     <w:uiPriority w:val="30"/>
     <w:qFormat/>
-    <w:rsid w:val="00735938"/>
+    <w:rsid w:val="00456F02"/>
     <w:pPr>
       <w:pBdr>
         <w:top w:val="single" w:sz="4" w:space="10" w:color="2F5496" w:themeColor="accent1" w:themeShade="BF"/>
@@ -1769,7 +3085,7 @@
     <w:basedOn w:val="DefaultParagraphFont"/>
     <w:link w:val="IntenseQuote"/>
     <w:uiPriority w:val="30"/>
-    <w:rsid w:val="00735938"/>
+    <w:rsid w:val="00456F02"/>
     <w:rPr>
       <w:i/>
       <w:iCs/>
@@ -1781,7 +3097,7 @@
     <w:basedOn w:val="DefaultParagraphFont"/>
     <w:uiPriority w:val="32"/>
     <w:qFormat/>
-    <w:rsid w:val="00735938"/>
+    <w:rsid w:val="00456F02"/>
     <w:rPr>
       <w:b/>
       <w:bCs/>
@@ -1790,15 +3106,24 @@
       <w:spacing w:val="5"/>
     </w:rPr>
   </w:style>
-  <w:style w:type="paragraph" w:styleId="Revision">
-    <w:name w:val="Revision"/>
-    <w:hidden/>
-    <w:uiPriority w:val="99"/>
-    <w:semiHidden/>
-    <w:rsid w:val="00280B97"/>
+  <w:style w:type="table" w:styleId="TableGrid">
+    <w:name w:val="Table Grid"/>
+    <w:basedOn w:val="TableNormal"/>
+    <w:uiPriority w:val="39"/>
+    <w:rsid w:val="00456F02"/>
     <w:pPr>
       <w:spacing w:after="0" w:line="240" w:lineRule="auto"/>
     </w:pPr>
+    <w:tblPr>
+      <w:tblBorders>
+        <w:top w:val="single" w:sz="4" w:space="0" w:color="auto"/>
+        <w:left w:val="single" w:sz="4" w:space="0" w:color="auto"/>
+        <w:bottom w:val="single" w:sz="4" w:space="0" w:color="auto"/>
+        <w:right w:val="single" w:sz="4" w:space="0" w:color="auto"/>
+        <w:insideH w:val="single" w:sz="4" w:space="0" w:color="auto"/>
+        <w:insideV w:val="single" w:sz="4" w:space="0" w:color="auto"/>
+      </w:tblBorders>
+    </w:tblPr>
   </w:style>
 </w:styles>
 </file>

</xml_diff>

<commit_message>
LTspice Migration and Boost Converter Validation
</commit_message>
<xml_diff>
--- a/docs/Solar Audio Amplifier d2d track.docx
+++ b/docs/Solar Audio Amplifier d2d track.docx
@@ -113,15 +113,7 @@
     </w:p>
     <w:p>
       <w:r>
-        <w:t xml:space="preserve">Performed a DC voltage </w:t>
-      </w:r>
-      <w:proofErr w:type="gramStart"/>
-      <w:r>
-        <w:t>sweep</w:t>
-      </w:r>
-      <w:proofErr w:type="gramEnd"/>
-      <w:r>
-        <w:t xml:space="preserve"> and obtained the diode I-V characteristic.</w:t>
+        <w:t>Performed a DC voltage sweep and obtained the diode I-V characteristic.</w:t>
       </w:r>
     </w:p>
     <w:p>
@@ -509,18 +501,13 @@
     </w:p>
     <w:p>
       <w:r>
-        <w:t xml:space="preserve">Irradiance </w:t>
-      </w:r>
-      <w:proofErr w:type="gramStart"/>
-      <w:r>
-        <w:t xml:space="preserve">( </w:t>
+        <w:t xml:space="preserve">Irradiance ( </w:t>
       </w:r>
       <w:proofErr w:type="spellStart"/>
       <w:r>
         <w:t>Iph</w:t>
       </w:r>
       <w:proofErr w:type="spellEnd"/>
-      <w:proofErr w:type="gramEnd"/>
       <w:r>
         <w:t xml:space="preserve"> ) sweep</w:t>
       </w:r>
@@ -1716,6 +1703,797 @@
       </w:r>
     </w:p>
     <w:p/>
+    <w:p>
+      <w:r>
+        <w:t>DAY6</w:t>
+      </w:r>
+    </w:p>
+    <w:p>
+      <w:r>
+        <w:t>Date: 20 June 2026</w:t>
+      </w:r>
+    </w:p>
+    <w:p>
+      <w:r>
+        <w:t>Project: Solar-Powered Audio Amplifier (PSpice)</w:t>
+      </w:r>
+    </w:p>
+    <w:p>
+      <w:r>
+        <w:t>Work Completed:</w:t>
+      </w:r>
+    </w:p>
+    <w:p>
+      <w:pPr>
+        <w:numPr>
+          <w:ilvl w:val="0"/>
+          <w:numId w:val="4"/>
+        </w:numPr>
+      </w:pPr>
+      <w:r>
+        <w:t>Continued development of the solar cell equivalent model.</w:t>
+      </w:r>
+    </w:p>
+    <w:p>
+      <w:pPr>
+        <w:numPr>
+          <w:ilvl w:val="0"/>
+          <w:numId w:val="4"/>
+        </w:numPr>
+      </w:pPr>
+      <w:r>
+        <w:t>Investigated boost converter implementation using a 5 V input source, 100 µH inductor, Schottky diode, output capacitor, and MOSFET switch.</w:t>
+      </w:r>
+    </w:p>
+    <w:p>
+      <w:pPr>
+        <w:numPr>
+          <w:ilvl w:val="0"/>
+          <w:numId w:val="4"/>
+        </w:numPr>
+      </w:pPr>
+      <w:r>
+        <w:t>Verified PWM gate drive operation (0–10 V, 50 kHz).</w:t>
+      </w:r>
+    </w:p>
+    <w:p>
+      <w:pPr>
+        <w:numPr>
+          <w:ilvl w:val="0"/>
+          <w:numId w:val="4"/>
+        </w:numPr>
+      </w:pPr>
+      <w:r>
+        <w:t>Identified that the boost converter output was not increasing as expected.</w:t>
+      </w:r>
+    </w:p>
+    <w:p>
+      <w:pPr>
+        <w:numPr>
+          <w:ilvl w:val="0"/>
+          <w:numId w:val="4"/>
+        </w:numPr>
+      </w:pPr>
+      <w:r>
+        <w:t>Measured MOSFET drain voltage and current during simulation.</w:t>
+      </w:r>
+    </w:p>
+    <w:p>
+      <w:pPr>
+        <w:numPr>
+          <w:ilvl w:val="0"/>
+          <w:numId w:val="4"/>
+        </w:numPr>
+      </w:pPr>
+      <w:r>
+        <w:t>Investigated possible causes including:</w:t>
+      </w:r>
+    </w:p>
+    <w:p>
+      <w:pPr>
+        <w:numPr>
+          <w:ilvl w:val="1"/>
+          <w:numId w:val="4"/>
+        </w:numPr>
+      </w:pPr>
+      <w:r>
+        <w:t>MOSFET model issues</w:t>
+      </w:r>
+    </w:p>
+    <w:p>
+      <w:pPr>
+        <w:numPr>
+          <w:ilvl w:val="1"/>
+          <w:numId w:val="4"/>
+        </w:numPr>
+      </w:pPr>
+      <w:r>
+        <w:t>Pin-order mismatch</w:t>
+      </w:r>
+    </w:p>
+    <w:p>
+      <w:pPr>
+        <w:numPr>
+          <w:ilvl w:val="1"/>
+          <w:numId w:val="4"/>
+        </w:numPr>
+      </w:pPr>
+      <w:r>
+        <w:t xml:space="preserve">Incorrect switching </w:t>
+      </w:r>
+      <w:proofErr w:type="spellStart"/>
+      <w:r>
+        <w:t>behavior</w:t>
+      </w:r>
+      <w:proofErr w:type="spellEnd"/>
+    </w:p>
+    <w:p>
+      <w:pPr>
+        <w:numPr>
+          <w:ilvl w:val="1"/>
+          <w:numId w:val="4"/>
+        </w:numPr>
+      </w:pPr>
+      <w:r>
+        <w:t>Floating-node and connectivity errors</w:t>
+      </w:r>
+    </w:p>
+    <w:p>
+      <w:pPr>
+        <w:numPr>
+          <w:ilvl w:val="0"/>
+          <w:numId w:val="4"/>
+        </w:numPr>
+      </w:pPr>
+      <w:r>
+        <w:t>Built and tested alternative converter topologies for comparison.</w:t>
+      </w:r>
+    </w:p>
+    <w:p>
+      <w:pPr>
+        <w:numPr>
+          <w:ilvl w:val="0"/>
+          <w:numId w:val="4"/>
+        </w:numPr>
+      </w:pPr>
+      <w:r>
+        <w:t>Resolved multiple netlist and floating-node errors generated by PSpice.</w:t>
+      </w:r>
+    </w:p>
+    <w:p>
+      <w:pPr>
+        <w:numPr>
+          <w:ilvl w:val="0"/>
+          <w:numId w:val="4"/>
+        </w:numPr>
+      </w:pPr>
+      <w:r>
+        <w:t>Reduced the problem scope and isolated the likely fault to the switching device/model rather than the passive network.</w:t>
+      </w:r>
+    </w:p>
+    <w:p>
+      <w:r>
+        <w:t>Key Findings:</w:t>
+      </w:r>
+    </w:p>
+    <w:p>
+      <w:pPr>
+        <w:numPr>
+          <w:ilvl w:val="0"/>
+          <w:numId w:val="5"/>
+        </w:numPr>
+      </w:pPr>
+      <w:r>
+        <w:t>PWM source is functioning correctly.</w:t>
+      </w:r>
+    </w:p>
+    <w:p>
+      <w:pPr>
+        <w:numPr>
+          <w:ilvl w:val="0"/>
+          <w:numId w:val="5"/>
+        </w:numPr>
+      </w:pPr>
+      <w:r>
+        <w:t>Inductor current is non-zero.</w:t>
+      </w:r>
+    </w:p>
+    <w:p>
+      <w:pPr>
+        <w:numPr>
+          <w:ilvl w:val="0"/>
+          <w:numId w:val="5"/>
+        </w:numPr>
+      </w:pPr>
+      <w:r>
+        <w:lastRenderedPageBreak/>
+        <w:t>MOSFET drain current remains near zero in the original design.</w:t>
+      </w:r>
+    </w:p>
+    <w:p>
+      <w:pPr>
+        <w:numPr>
+          <w:ilvl w:val="0"/>
+          <w:numId w:val="5"/>
+        </w:numPr>
+      </w:pPr>
+      <w:r>
+        <w:t>Evidence suggests a possible MOSFET model or pin-mapping issue.</w:t>
+      </w:r>
+    </w:p>
+    <w:p>
+      <w:r>
+        <w:t>Next Steps:</w:t>
+      </w:r>
+    </w:p>
+    <w:p>
+      <w:pPr>
+        <w:numPr>
+          <w:ilvl w:val="0"/>
+          <w:numId w:val="6"/>
+        </w:numPr>
+      </w:pPr>
+      <w:r>
+        <w:t>Perform a standalone MOSFET validation test using a simple resistive load.</w:t>
+      </w:r>
+    </w:p>
+    <w:p>
+      <w:pPr>
+        <w:numPr>
+          <w:ilvl w:val="0"/>
+          <w:numId w:val="6"/>
+        </w:numPr>
+      </w:pPr>
+      <w:r>
+        <w:t>Verify IRF150 model pin configuration and switching operation.</w:t>
+      </w:r>
+    </w:p>
+    <w:p>
+      <w:pPr>
+        <w:numPr>
+          <w:ilvl w:val="0"/>
+          <w:numId w:val="6"/>
+        </w:numPr>
+      </w:pPr>
+      <w:r>
+        <w:t>Repair or replace the MOSFET model if necessary.</w:t>
+      </w:r>
+    </w:p>
+    <w:p>
+      <w:pPr>
+        <w:numPr>
+          <w:ilvl w:val="0"/>
+          <w:numId w:val="6"/>
+        </w:numPr>
+      </w:pPr>
+      <w:r>
+        <w:t xml:space="preserve">Return to the original boost converter and validate switching-node </w:t>
+      </w:r>
+      <w:proofErr w:type="spellStart"/>
+      <w:r>
+        <w:t>behavior</w:t>
+      </w:r>
+      <w:proofErr w:type="spellEnd"/>
+      <w:r>
+        <w:t xml:space="preserve"> before further integration.</w:t>
+      </w:r>
+    </w:p>
+    <w:p>
+      <w:r>
+        <w:t>Status:</w:t>
+      </w:r>
+      <w:r>
+        <w:br/>
+        <w:t>Boost converter not yet operational, but root-cause investigation has significantly narrowed the problem to the MOSFET stage.</w:t>
+      </w:r>
+    </w:p>
+    <w:p>
+      <w:r>
+        <w:rPr>
+          <w:noProof/>
+        </w:rPr>
+        <w:drawing>
+          <wp:inline distT="0" distB="0" distL="0" distR="0" wp14:anchorId="485B7D6F" wp14:editId="78E7DEA4">
+            <wp:extent cx="4286470" cy="2546481"/>
+            <wp:effectExtent l="0" t="0" r="0" b="6350"/>
+            <wp:docPr id="2013651094" name="Picture 1"/>
+            <wp:cNvGraphicFramePr>
+              <a:graphicFrameLocks xmlns:a="http://schemas.openxmlformats.org/drawingml/2006/main" noChangeAspect="1"/>
+            </wp:cNvGraphicFramePr>
+            <a:graphic xmlns:a="http://schemas.openxmlformats.org/drawingml/2006/main">
+              <a:graphicData uri="http://schemas.openxmlformats.org/drawingml/2006/picture">
+                <pic:pic xmlns:pic="http://schemas.openxmlformats.org/drawingml/2006/picture">
+                  <pic:nvPicPr>
+                    <pic:cNvPr id="2013651094" name=""/>
+                    <pic:cNvPicPr/>
+                  </pic:nvPicPr>
+                  <pic:blipFill>
+                    <a:blip r:embed="rId22"/>
+                    <a:stretch>
+                      <a:fillRect/>
+                    </a:stretch>
+                  </pic:blipFill>
+                  <pic:spPr>
+                    <a:xfrm>
+                      <a:off x="0" y="0"/>
+                      <a:ext cx="4286470" cy="2546481"/>
+                    </a:xfrm>
+                    <a:prstGeom prst="rect">
+                      <a:avLst/>
+                    </a:prstGeom>
+                  </pic:spPr>
+                </pic:pic>
+              </a:graphicData>
+            </a:graphic>
+          </wp:inline>
+        </w:drawing>
+      </w:r>
+      <w:r>
+        <w:rPr>
+          <w:noProof/>
+        </w:rPr>
+        <w:drawing>
+          <wp:inline distT="0" distB="0" distL="0" distR="0" wp14:anchorId="40D4317D" wp14:editId="15CEBB59">
+            <wp:extent cx="5731510" cy="1833245"/>
+            <wp:effectExtent l="0" t="0" r="2540" b="0"/>
+            <wp:docPr id="1560664436" name="Picture 1"/>
+            <wp:cNvGraphicFramePr>
+              <a:graphicFrameLocks xmlns:a="http://schemas.openxmlformats.org/drawingml/2006/main" noChangeAspect="1"/>
+            </wp:cNvGraphicFramePr>
+            <a:graphic xmlns:a="http://schemas.openxmlformats.org/drawingml/2006/main">
+              <a:graphicData uri="http://schemas.openxmlformats.org/drawingml/2006/picture">
+                <pic:pic xmlns:pic="http://schemas.openxmlformats.org/drawingml/2006/picture">
+                  <pic:nvPicPr>
+                    <pic:cNvPr id="1560664436" name=""/>
+                    <pic:cNvPicPr/>
+                  </pic:nvPicPr>
+                  <pic:blipFill>
+                    <a:blip r:embed="rId23"/>
+                    <a:stretch>
+                      <a:fillRect/>
+                    </a:stretch>
+                  </pic:blipFill>
+                  <pic:spPr>
+                    <a:xfrm>
+                      <a:off x="0" y="0"/>
+                      <a:ext cx="5731510" cy="1833245"/>
+                    </a:xfrm>
+                    <a:prstGeom prst="rect">
+                      <a:avLst/>
+                    </a:prstGeom>
+                  </pic:spPr>
+                </pic:pic>
+              </a:graphicData>
+            </a:graphic>
+          </wp:inline>
+        </w:drawing>
+      </w:r>
+    </w:p>
+    <w:p>
+      <w:r>
+        <w:t>DAY 7</w:t>
+      </w:r>
+    </w:p>
+    <w:p>
+      <w:r>
+        <w:t>Date: June 21, 2026</w:t>
+      </w:r>
+    </w:p>
+    <w:p>
+      <w:r>
+        <w:t>Today's goal was to validate the power conditioning (boost converter) stage of the solar-powered audio amplifier project.</w:t>
+      </w:r>
+    </w:p>
+    <w:p>
+      <w:r>
+        <w:lastRenderedPageBreak/>
+        <w:drawing>
+          <wp:inline distT="0" distB="0" distL="0" distR="0" wp14:anchorId="19390A0A" wp14:editId="3C42CF6B">
+            <wp:extent cx="5454930" cy="4007056"/>
+            <wp:effectExtent l="0" t="0" r="0" b="0"/>
+            <wp:docPr id="1860622901" name="Picture 1"/>
+            <wp:cNvGraphicFramePr>
+              <a:graphicFrameLocks xmlns:a="http://schemas.openxmlformats.org/drawingml/2006/main" noChangeAspect="1"/>
+            </wp:cNvGraphicFramePr>
+            <a:graphic xmlns:a="http://schemas.openxmlformats.org/drawingml/2006/main">
+              <a:graphicData uri="http://schemas.openxmlformats.org/drawingml/2006/picture">
+                <pic:pic xmlns:pic="http://schemas.openxmlformats.org/drawingml/2006/picture">
+                  <pic:nvPicPr>
+                    <pic:cNvPr id="1860622901" name=""/>
+                    <pic:cNvPicPr/>
+                  </pic:nvPicPr>
+                  <pic:blipFill>
+                    <a:blip r:embed="rId24"/>
+                    <a:stretch>
+                      <a:fillRect/>
+                    </a:stretch>
+                  </pic:blipFill>
+                  <pic:spPr>
+                    <a:xfrm>
+                      <a:off x="0" y="0"/>
+                      <a:ext cx="5454930" cy="4007056"/>
+                    </a:xfrm>
+                    <a:prstGeom prst="rect">
+                      <a:avLst/>
+                    </a:prstGeom>
+                  </pic:spPr>
+                </pic:pic>
+              </a:graphicData>
+            </a:graphic>
+          </wp:inline>
+        </w:drawing>
+      </w:r>
+    </w:p>
+    <w:p>
+      <w:r>
+        <w:drawing>
+          <wp:inline distT="0" distB="0" distL="0" distR="0" wp14:anchorId="6E733316" wp14:editId="4A85FFAB">
+            <wp:extent cx="5731510" cy="1201420"/>
+            <wp:effectExtent l="0" t="0" r="2540" b="0"/>
+            <wp:docPr id="2132197349" name="Picture 1"/>
+            <wp:cNvGraphicFramePr>
+              <a:graphicFrameLocks xmlns:a="http://schemas.openxmlformats.org/drawingml/2006/main" noChangeAspect="1"/>
+            </wp:cNvGraphicFramePr>
+            <a:graphic xmlns:a="http://schemas.openxmlformats.org/drawingml/2006/main">
+              <a:graphicData uri="http://schemas.openxmlformats.org/drawingml/2006/picture">
+                <pic:pic xmlns:pic="http://schemas.openxmlformats.org/drawingml/2006/picture">
+                  <pic:nvPicPr>
+                    <pic:cNvPr id="2132197349" name=""/>
+                    <pic:cNvPicPr/>
+                  </pic:nvPicPr>
+                  <pic:blipFill>
+                    <a:blip r:embed="rId25"/>
+                    <a:stretch>
+                      <a:fillRect/>
+                    </a:stretch>
+                  </pic:blipFill>
+                  <pic:spPr>
+                    <a:xfrm>
+                      <a:off x="0" y="0"/>
+                      <a:ext cx="5731510" cy="1201420"/>
+                    </a:xfrm>
+                    <a:prstGeom prst="rect">
+                      <a:avLst/>
+                    </a:prstGeom>
+                  </pic:spPr>
+                </pic:pic>
+              </a:graphicData>
+            </a:graphic>
+          </wp:inline>
+        </w:drawing>
+      </w:r>
+      <w:r>
+        <w:t xml:space="preserve">Graph for </w:t>
+      </w:r>
+      <w:proofErr w:type="spellStart"/>
+      <w:r>
+        <w:t>Vout</w:t>
+      </w:r>
+      <w:proofErr w:type="spellEnd"/>
+    </w:p>
+    <w:p>
+      <w:r>
+        <w:drawing>
+          <wp:inline distT="0" distB="0" distL="0" distR="0" wp14:anchorId="5DD30A31" wp14:editId="284A7D48">
+            <wp:extent cx="5731510" cy="1163320"/>
+            <wp:effectExtent l="0" t="0" r="2540" b="0"/>
+            <wp:docPr id="382991474" name="Picture 1"/>
+            <wp:cNvGraphicFramePr>
+              <a:graphicFrameLocks xmlns:a="http://schemas.openxmlformats.org/drawingml/2006/main" noChangeAspect="1"/>
+            </wp:cNvGraphicFramePr>
+            <a:graphic xmlns:a="http://schemas.openxmlformats.org/drawingml/2006/main">
+              <a:graphicData uri="http://schemas.openxmlformats.org/drawingml/2006/picture">
+                <pic:pic xmlns:pic="http://schemas.openxmlformats.org/drawingml/2006/picture">
+                  <pic:nvPicPr>
+                    <pic:cNvPr id="382991474" name=""/>
+                    <pic:cNvPicPr/>
+                  </pic:nvPicPr>
+                  <pic:blipFill>
+                    <a:blip r:embed="rId26"/>
+                    <a:stretch>
+                      <a:fillRect/>
+                    </a:stretch>
+                  </pic:blipFill>
+                  <pic:spPr>
+                    <a:xfrm>
+                      <a:off x="0" y="0"/>
+                      <a:ext cx="5731510" cy="1163320"/>
+                    </a:xfrm>
+                    <a:prstGeom prst="rect">
+                      <a:avLst/>
+                    </a:prstGeom>
+                  </pic:spPr>
+                </pic:pic>
+              </a:graphicData>
+            </a:graphic>
+          </wp:inline>
+        </w:drawing>
+      </w:r>
+      <w:r>
+        <w:t>Graph for Vin</w:t>
+      </w:r>
+    </w:p>
+    <w:p>
+      <w:r>
+        <w:drawing>
+          <wp:inline distT="0" distB="0" distL="0" distR="0" wp14:anchorId="7443DF03" wp14:editId="7357F622">
+            <wp:extent cx="5731510" cy="1062990"/>
+            <wp:effectExtent l="0" t="0" r="2540" b="3810"/>
+            <wp:docPr id="1914471289" name="Picture 1"/>
+            <wp:cNvGraphicFramePr>
+              <a:graphicFrameLocks xmlns:a="http://schemas.openxmlformats.org/drawingml/2006/main" noChangeAspect="1"/>
+            </wp:cNvGraphicFramePr>
+            <a:graphic xmlns:a="http://schemas.openxmlformats.org/drawingml/2006/main">
+              <a:graphicData uri="http://schemas.openxmlformats.org/drawingml/2006/picture">
+                <pic:pic xmlns:pic="http://schemas.openxmlformats.org/drawingml/2006/picture">
+                  <pic:nvPicPr>
+                    <pic:cNvPr id="1914471289" name=""/>
+                    <pic:cNvPicPr/>
+                  </pic:nvPicPr>
+                  <pic:blipFill>
+                    <a:blip r:embed="rId27"/>
+                    <a:stretch>
+                      <a:fillRect/>
+                    </a:stretch>
+                  </pic:blipFill>
+                  <pic:spPr>
+                    <a:xfrm>
+                      <a:off x="0" y="0"/>
+                      <a:ext cx="5731510" cy="1062990"/>
+                    </a:xfrm>
+                    <a:prstGeom prst="rect">
+                      <a:avLst/>
+                    </a:prstGeom>
+                  </pic:spPr>
+                </pic:pic>
+              </a:graphicData>
+            </a:graphic>
+          </wp:inline>
+        </w:drawing>
+      </w:r>
+      <w:r>
+        <w:t xml:space="preserve">Graph for </w:t>
+      </w:r>
+      <w:proofErr w:type="spellStart"/>
+      <w:r>
+        <w:t>Vgate</w:t>
+      </w:r>
+      <w:r>
+        <w:t>When</w:t>
+      </w:r>
+      <w:proofErr w:type="spellEnd"/>
+      <w:r>
+        <w:t xml:space="preserve"> the gate goes high:</w:t>
+      </w:r>
+    </w:p>
+    <w:p>
+      <w:pPr>
+        <w:numPr>
+          <w:ilvl w:val="0"/>
+          <w:numId w:val="9"/>
+        </w:numPr>
+      </w:pPr>
+      <w:r>
+        <w:t xml:space="preserve">MOSFET turns ON </w:t>
+      </w:r>
+    </w:p>
+    <w:p>
+      <w:pPr>
+        <w:numPr>
+          <w:ilvl w:val="0"/>
+          <w:numId w:val="9"/>
+        </w:numPr>
+      </w:pPr>
+      <w:r>
+        <w:lastRenderedPageBreak/>
+        <w:t xml:space="preserve">Inductor stores energy </w:t>
+      </w:r>
+    </w:p>
+    <w:p>
+      <w:r>
+        <w:t>When the gate goes low:</w:t>
+      </w:r>
+    </w:p>
+    <w:p>
+      <w:pPr>
+        <w:numPr>
+          <w:ilvl w:val="0"/>
+          <w:numId w:val="10"/>
+        </w:numPr>
+      </w:pPr>
+      <w:r>
+        <w:t xml:space="preserve">MOSFET turns OFF </w:t>
+      </w:r>
+    </w:p>
+    <w:p>
+      <w:pPr>
+        <w:numPr>
+          <w:ilvl w:val="0"/>
+          <w:numId w:val="10"/>
+        </w:numPr>
+      </w:pPr>
+      <w:r>
+        <w:t xml:space="preserve">Inductor releases energy through the diode </w:t>
+      </w:r>
+    </w:p>
+    <w:p>
+      <w:pPr>
+        <w:numPr>
+          <w:ilvl w:val="0"/>
+          <w:numId w:val="10"/>
+        </w:numPr>
+      </w:pPr>
+      <w:r>
+        <w:t>Output capacitor charges</w:t>
+      </w:r>
+    </w:p>
+    <w:p/>
+    <w:p>
+      <w:r>
+        <w:t>Key accomplishments:</w:t>
+      </w:r>
+    </w:p>
+    <w:p>
+      <w:pPr>
+        <w:numPr>
+          <w:ilvl w:val="0"/>
+          <w:numId w:val="7"/>
+        </w:numPr>
+      </w:pPr>
+      <w:r>
+        <w:t xml:space="preserve">Migrated the boost converter simulation from PSpice to </w:t>
+      </w:r>
+      <w:proofErr w:type="spellStart"/>
+      <w:r>
+        <w:t>LTspice</w:t>
+      </w:r>
+      <w:proofErr w:type="spellEnd"/>
+      <w:r>
+        <w:t xml:space="preserve"> after encountering persistent simulation and component-model issues.</w:t>
+      </w:r>
+    </w:p>
+    <w:p>
+      <w:pPr>
+        <w:numPr>
+          <w:ilvl w:val="0"/>
+          <w:numId w:val="7"/>
+        </w:numPr>
+      </w:pPr>
+      <w:r>
+        <w:t xml:space="preserve">Recreated the converter schematic in </w:t>
+      </w:r>
+      <w:proofErr w:type="spellStart"/>
+      <w:r>
+        <w:t>LTspice</w:t>
+      </w:r>
+      <w:proofErr w:type="spellEnd"/>
+      <w:r>
+        <w:t xml:space="preserve"> using a real MOSFET model and Schottky diode.</w:t>
+      </w:r>
+    </w:p>
+    <w:p>
+      <w:pPr>
+        <w:numPr>
+          <w:ilvl w:val="0"/>
+          <w:numId w:val="7"/>
+        </w:numPr>
+      </w:pPr>
+      <w:r>
+        <w:t xml:space="preserve">Debugged startup current </w:t>
+      </w:r>
+      <w:proofErr w:type="spellStart"/>
+      <w:r>
+        <w:t>behavior</w:t>
+      </w:r>
+      <w:proofErr w:type="spellEnd"/>
+      <w:r>
+        <w:t xml:space="preserve"> and investigated the effect of output capacitor size on transient response.</w:t>
+      </w:r>
+    </w:p>
+    <w:p>
+      <w:pPr>
+        <w:numPr>
+          <w:ilvl w:val="0"/>
+          <w:numId w:val="7"/>
+        </w:numPr>
+      </w:pPr>
+      <w:r>
+        <w:t>Verified that the converter successfully boosts a 5 V input to approximately 10 V under load, matching theoretical expectations for a 50% duty-cycle boost converter.</w:t>
+      </w:r>
+    </w:p>
+    <w:p>
+      <w:pPr>
+        <w:numPr>
+          <w:ilvl w:val="0"/>
+          <w:numId w:val="7"/>
+        </w:numPr>
+      </w:pPr>
+      <w:r>
+        <w:t xml:space="preserve">Confirmed that output voltage </w:t>
+      </w:r>
+      <w:proofErr w:type="spellStart"/>
+      <w:r>
+        <w:t>behavior</w:t>
+      </w:r>
+      <w:proofErr w:type="spellEnd"/>
+      <w:r>
+        <w:t xml:space="preserve"> changes appropriately with load resistance, indicating that the topology is functioning correctly.</w:t>
+      </w:r>
+    </w:p>
+    <w:p>
+      <w:pPr>
+        <w:numPr>
+          <w:ilvl w:val="0"/>
+          <w:numId w:val="7"/>
+        </w:numPr>
+      </w:pPr>
+      <w:r>
+        <w:t xml:space="preserve">Saved the working </w:t>
+      </w:r>
+      <w:proofErr w:type="spellStart"/>
+      <w:r>
+        <w:t>LTspice</w:t>
+      </w:r>
+      <w:proofErr w:type="spellEnd"/>
+      <w:r>
+        <w:t xml:space="preserve"> design as the baseline version for future development.</w:t>
+      </w:r>
+    </w:p>
+    <w:p>
+      <w:r>
+        <w:t>Key lesson:</w:t>
+      </w:r>
+      <w:r>
+        <w:br/>
+        <w:t xml:space="preserve">Simulator problems can sometimes hide circuit </w:t>
+      </w:r>
+      <w:proofErr w:type="spellStart"/>
+      <w:r>
+        <w:t>behavior</w:t>
+      </w:r>
+      <w:proofErr w:type="spellEnd"/>
+      <w:r>
+        <w:t>. Rebuilding and validating the design in a different environment helped isolate the issue and confirm that the converter itself was working.</w:t>
+      </w:r>
+    </w:p>
+    <w:p>
+      <w:r>
+        <w:t>Next steps:</w:t>
+      </w:r>
+    </w:p>
+    <w:p>
+      <w:pPr>
+        <w:numPr>
+          <w:ilvl w:val="0"/>
+          <w:numId w:val="8"/>
+        </w:numPr>
+      </w:pPr>
+      <w:r>
+        <w:t>Commit the power conditioning stage to GitHub.</w:t>
+      </w:r>
+    </w:p>
+    <w:p>
+      <w:pPr>
+        <w:numPr>
+          <w:ilvl w:val="0"/>
+          <w:numId w:val="8"/>
+        </w:numPr>
+      </w:pPr>
+      <w:r>
+        <w:t>Begin development and simulation of the audio amplifier stage.</w:t>
+      </w:r>
+    </w:p>
+    <w:p>
+      <w:pPr>
+        <w:numPr>
+          <w:ilvl w:val="0"/>
+          <w:numId w:val="8"/>
+        </w:numPr>
+      </w:pPr>
+      <w:r>
+        <w:t>Later integrate the solar source, boost converter, and amplifier into a single system.</w:t>
+      </w:r>
+    </w:p>
     <w:p/>
     <w:sectPr>
       <w:pgSz w:w="11906" w:h="16838"/>
@@ -1730,6 +2508,155 @@
 <file path=word/numbering.xml><?xml version="1.0" encoding="utf-8"?>
 <w:numbering xmlns:wpc="http://schemas.microsoft.com/office/word/2010/wordprocessingCanvas" xmlns:cx="http://schemas.microsoft.com/office/drawing/2014/chartex" xmlns:cx1="http://schemas.microsoft.com/office/drawing/2015/9/8/chartex" xmlns:cx2="http://schemas.microsoft.com/office/drawing/2015/10/21/chartex" xmlns:cx3="http://schemas.microsoft.com/office/drawing/2016/5/9/chartex" xmlns:cx4="http://schemas.microsoft.com/office/drawing/2016/5/10/chartex" xmlns:cx5="http://schemas.microsoft.com/office/drawing/2016/5/11/chartex" xmlns:cx6="http://schemas.microsoft.com/office/drawing/2016/5/12/chartex" xmlns:cx7="http://schemas.microsoft.com/office/drawing/2016/5/13/chartex" xmlns:cx8="http://schemas.microsoft.com/office/drawing/2016/5/14/chartex" xmlns:mc="http://schemas.openxmlformats.org/markup-compatibility/2006" xmlns:aink="http://schemas.microsoft.com/office/drawing/2016/ink" xmlns:am3d="http://schemas.microsoft.com/office/drawing/2017/model3d" xmlns:o="urn:schemas-microsoft-com:office:office" xmlns:oel="http://schemas.microsoft.com/office/2019/extlst" xmlns:r="http://schemas.openxmlformats.org/officeDocument/2006/relationships" xmlns:m="http://schemas.openxmlformats.org/officeDocument/2006/math" xmlns:v="urn:schemas-microsoft-com:vml" xmlns:wp14="http://schemas.microsoft.com/office/word/2010/wordprocessingDrawing" xmlns:wp="http://schemas.openxmlformats.org/drawingml/2006/wordprocessingDrawing" xmlns:w10="urn:schemas-microsoft-com:office:word" xmlns:w="http://schemas.openxmlformats.org/wordprocessingml/2006/main" xmlns:w14="http://schemas.microsoft.com/office/word/2010/wordml" xmlns:w15="http://schemas.microsoft.com/office/word/2012/wordml" xmlns:w16cex="http://schemas.microsoft.com/office/word/2018/wordml/cex" xmlns:w16cid="http://schemas.microsoft.com/office/word/2016/wordml/cid" xmlns:w16="http://schemas.microsoft.com/office/word/2018/wordml" xmlns:w16du="http://schemas.microsoft.com/office/word/2023/wordml/word16du" xmlns:w16sdtdh="http://schemas.microsoft.com/office/word/2020/wordml/sdtdatahash" xmlns:w16sdtfl="http://schemas.microsoft.com/office/word/2024/wordml/sdtformatlock" xmlns:w16se="http://schemas.microsoft.com/office/word/2015/wordml/symex" xmlns:wpg="http://schemas.microsoft.com/office/word/2010/wordprocessingGroup" xmlns:wpi="http://schemas.microsoft.com/office/word/2010/wordprocessingInk" xmlns:wne="http://schemas.microsoft.com/office/word/2006/wordml" xmlns:wps="http://schemas.microsoft.com/office/word/2010/wordprocessingShape" mc:Ignorable="w14 w15 w16se w16cid w16 w16cex w16sdtdh w16sdtfl w16du wp14">
   <w:abstractNum w:abstractNumId="0" w15:restartNumberingAfterBreak="0">
+    <w:nsid w:val="16712CF6"/>
+    <w:multiLevelType w:val="multilevel"/>
+    <w:tmpl w:val="12DE2564"/>
+    <w:lvl w:ilvl="0">
+      <w:start w:val="1"/>
+      <w:numFmt w:val="bullet"/>
+      <w:lvlText w:val=""/>
+      <w:lvlJc w:val="left"/>
+      <w:pPr>
+        <w:tabs>
+          <w:tab w:val="num" w:pos="720"/>
+        </w:tabs>
+        <w:ind w:left="720" w:hanging="360"/>
+      </w:pPr>
+      <w:rPr>
+        <w:rFonts w:ascii="Symbol" w:hAnsi="Symbol" w:hint="default"/>
+        <w:sz w:val="20"/>
+      </w:rPr>
+    </w:lvl>
+    <w:lvl w:ilvl="1" w:tentative="1">
+      <w:start w:val="1"/>
+      <w:numFmt w:val="bullet"/>
+      <w:lvlText w:val="o"/>
+      <w:lvlJc w:val="left"/>
+      <w:pPr>
+        <w:tabs>
+          <w:tab w:val="num" w:pos="1440"/>
+        </w:tabs>
+        <w:ind w:left="1440" w:hanging="360"/>
+      </w:pPr>
+      <w:rPr>
+        <w:rFonts w:ascii="Courier New" w:hAnsi="Courier New" w:hint="default"/>
+        <w:sz w:val="20"/>
+      </w:rPr>
+    </w:lvl>
+    <w:lvl w:ilvl="2" w:tentative="1">
+      <w:start w:val="1"/>
+      <w:numFmt w:val="bullet"/>
+      <w:lvlText w:val=""/>
+      <w:lvlJc w:val="left"/>
+      <w:pPr>
+        <w:tabs>
+          <w:tab w:val="num" w:pos="2160"/>
+        </w:tabs>
+        <w:ind w:left="2160" w:hanging="360"/>
+      </w:pPr>
+      <w:rPr>
+        <w:rFonts w:ascii="Wingdings" w:hAnsi="Wingdings" w:hint="default"/>
+        <w:sz w:val="20"/>
+      </w:rPr>
+    </w:lvl>
+    <w:lvl w:ilvl="3" w:tentative="1">
+      <w:start w:val="1"/>
+      <w:numFmt w:val="bullet"/>
+      <w:lvlText w:val=""/>
+      <w:lvlJc w:val="left"/>
+      <w:pPr>
+        <w:tabs>
+          <w:tab w:val="num" w:pos="2880"/>
+        </w:tabs>
+        <w:ind w:left="2880" w:hanging="360"/>
+      </w:pPr>
+      <w:rPr>
+        <w:rFonts w:ascii="Wingdings" w:hAnsi="Wingdings" w:hint="default"/>
+        <w:sz w:val="20"/>
+      </w:rPr>
+    </w:lvl>
+    <w:lvl w:ilvl="4" w:tentative="1">
+      <w:start w:val="1"/>
+      <w:numFmt w:val="bullet"/>
+      <w:lvlText w:val=""/>
+      <w:lvlJc w:val="left"/>
+      <w:pPr>
+        <w:tabs>
+          <w:tab w:val="num" w:pos="3600"/>
+        </w:tabs>
+        <w:ind w:left="3600" w:hanging="360"/>
+      </w:pPr>
+      <w:rPr>
+        <w:rFonts w:ascii="Wingdings" w:hAnsi="Wingdings" w:hint="default"/>
+        <w:sz w:val="20"/>
+      </w:rPr>
+    </w:lvl>
+    <w:lvl w:ilvl="5" w:tentative="1">
+      <w:start w:val="1"/>
+      <w:numFmt w:val="bullet"/>
+      <w:lvlText w:val=""/>
+      <w:lvlJc w:val="left"/>
+      <w:pPr>
+        <w:tabs>
+          <w:tab w:val="num" w:pos="4320"/>
+        </w:tabs>
+        <w:ind w:left="4320" w:hanging="360"/>
+      </w:pPr>
+      <w:rPr>
+        <w:rFonts w:ascii="Wingdings" w:hAnsi="Wingdings" w:hint="default"/>
+        <w:sz w:val="20"/>
+      </w:rPr>
+    </w:lvl>
+    <w:lvl w:ilvl="6" w:tentative="1">
+      <w:start w:val="1"/>
+      <w:numFmt w:val="bullet"/>
+      <w:lvlText w:val=""/>
+      <w:lvlJc w:val="left"/>
+      <w:pPr>
+        <w:tabs>
+          <w:tab w:val="num" w:pos="5040"/>
+        </w:tabs>
+        <w:ind w:left="5040" w:hanging="360"/>
+      </w:pPr>
+      <w:rPr>
+        <w:rFonts w:ascii="Wingdings" w:hAnsi="Wingdings" w:hint="default"/>
+        <w:sz w:val="20"/>
+      </w:rPr>
+    </w:lvl>
+    <w:lvl w:ilvl="7" w:tentative="1">
+      <w:start w:val="1"/>
+      <w:numFmt w:val="bullet"/>
+      <w:lvlText w:val=""/>
+      <w:lvlJc w:val="left"/>
+      <w:pPr>
+        <w:tabs>
+          <w:tab w:val="num" w:pos="5760"/>
+        </w:tabs>
+        <w:ind w:left="5760" w:hanging="360"/>
+      </w:pPr>
+      <w:rPr>
+        <w:rFonts w:ascii="Wingdings" w:hAnsi="Wingdings" w:hint="default"/>
+        <w:sz w:val="20"/>
+      </w:rPr>
+    </w:lvl>
+    <w:lvl w:ilvl="8" w:tentative="1">
+      <w:start w:val="1"/>
+      <w:numFmt w:val="bullet"/>
+      <w:lvlText w:val=""/>
+      <w:lvlJc w:val="left"/>
+      <w:pPr>
+        <w:tabs>
+          <w:tab w:val="num" w:pos="6480"/>
+        </w:tabs>
+        <w:ind w:left="6480" w:hanging="360"/>
+      </w:pPr>
+      <w:rPr>
+        <w:rFonts w:ascii="Wingdings" w:hAnsi="Wingdings" w:hint="default"/>
+        <w:sz w:val="20"/>
+      </w:rPr>
+    </w:lvl>
+  </w:abstractNum>
+  <w:abstractNum w:abstractNumId="1" w15:restartNumberingAfterBreak="0">
     <w:nsid w:val="211E4489"/>
     <w:multiLevelType w:val="multilevel"/>
     <w:tmpl w:val="01580EFC"/>
@@ -1878,7 +2805,156 @@
       </w:rPr>
     </w:lvl>
   </w:abstractNum>
-  <w:abstractNum w:abstractNumId="1" w15:restartNumberingAfterBreak="0">
+  <w:abstractNum w:abstractNumId="2" w15:restartNumberingAfterBreak="0">
+    <w:nsid w:val="38252712"/>
+    <w:multiLevelType w:val="multilevel"/>
+    <w:tmpl w:val="1BACE01C"/>
+    <w:lvl w:ilvl="0">
+      <w:start w:val="1"/>
+      <w:numFmt w:val="bullet"/>
+      <w:lvlText w:val=""/>
+      <w:lvlJc w:val="left"/>
+      <w:pPr>
+        <w:tabs>
+          <w:tab w:val="num" w:pos="720"/>
+        </w:tabs>
+        <w:ind w:left="720" w:hanging="360"/>
+      </w:pPr>
+      <w:rPr>
+        <w:rFonts w:ascii="Symbol" w:hAnsi="Symbol" w:hint="default"/>
+        <w:sz w:val="20"/>
+      </w:rPr>
+    </w:lvl>
+    <w:lvl w:ilvl="1" w:tentative="1">
+      <w:start w:val="1"/>
+      <w:numFmt w:val="bullet"/>
+      <w:lvlText w:val="o"/>
+      <w:lvlJc w:val="left"/>
+      <w:pPr>
+        <w:tabs>
+          <w:tab w:val="num" w:pos="1440"/>
+        </w:tabs>
+        <w:ind w:left="1440" w:hanging="360"/>
+      </w:pPr>
+      <w:rPr>
+        <w:rFonts w:ascii="Courier New" w:hAnsi="Courier New" w:hint="default"/>
+        <w:sz w:val="20"/>
+      </w:rPr>
+    </w:lvl>
+    <w:lvl w:ilvl="2" w:tentative="1">
+      <w:start w:val="1"/>
+      <w:numFmt w:val="bullet"/>
+      <w:lvlText w:val=""/>
+      <w:lvlJc w:val="left"/>
+      <w:pPr>
+        <w:tabs>
+          <w:tab w:val="num" w:pos="2160"/>
+        </w:tabs>
+        <w:ind w:left="2160" w:hanging="360"/>
+      </w:pPr>
+      <w:rPr>
+        <w:rFonts w:ascii="Wingdings" w:hAnsi="Wingdings" w:hint="default"/>
+        <w:sz w:val="20"/>
+      </w:rPr>
+    </w:lvl>
+    <w:lvl w:ilvl="3" w:tentative="1">
+      <w:start w:val="1"/>
+      <w:numFmt w:val="bullet"/>
+      <w:lvlText w:val=""/>
+      <w:lvlJc w:val="left"/>
+      <w:pPr>
+        <w:tabs>
+          <w:tab w:val="num" w:pos="2880"/>
+        </w:tabs>
+        <w:ind w:left="2880" w:hanging="360"/>
+      </w:pPr>
+      <w:rPr>
+        <w:rFonts w:ascii="Wingdings" w:hAnsi="Wingdings" w:hint="default"/>
+        <w:sz w:val="20"/>
+      </w:rPr>
+    </w:lvl>
+    <w:lvl w:ilvl="4" w:tentative="1">
+      <w:start w:val="1"/>
+      <w:numFmt w:val="bullet"/>
+      <w:lvlText w:val=""/>
+      <w:lvlJc w:val="left"/>
+      <w:pPr>
+        <w:tabs>
+          <w:tab w:val="num" w:pos="3600"/>
+        </w:tabs>
+        <w:ind w:left="3600" w:hanging="360"/>
+      </w:pPr>
+      <w:rPr>
+        <w:rFonts w:ascii="Wingdings" w:hAnsi="Wingdings" w:hint="default"/>
+        <w:sz w:val="20"/>
+      </w:rPr>
+    </w:lvl>
+    <w:lvl w:ilvl="5" w:tentative="1">
+      <w:start w:val="1"/>
+      <w:numFmt w:val="bullet"/>
+      <w:lvlText w:val=""/>
+      <w:lvlJc w:val="left"/>
+      <w:pPr>
+        <w:tabs>
+          <w:tab w:val="num" w:pos="4320"/>
+        </w:tabs>
+        <w:ind w:left="4320" w:hanging="360"/>
+      </w:pPr>
+      <w:rPr>
+        <w:rFonts w:ascii="Wingdings" w:hAnsi="Wingdings" w:hint="default"/>
+        <w:sz w:val="20"/>
+      </w:rPr>
+    </w:lvl>
+    <w:lvl w:ilvl="6" w:tentative="1">
+      <w:start w:val="1"/>
+      <w:numFmt w:val="bullet"/>
+      <w:lvlText w:val=""/>
+      <w:lvlJc w:val="left"/>
+      <w:pPr>
+        <w:tabs>
+          <w:tab w:val="num" w:pos="5040"/>
+        </w:tabs>
+        <w:ind w:left="5040" w:hanging="360"/>
+      </w:pPr>
+      <w:rPr>
+        <w:rFonts w:ascii="Wingdings" w:hAnsi="Wingdings" w:hint="default"/>
+        <w:sz w:val="20"/>
+      </w:rPr>
+    </w:lvl>
+    <w:lvl w:ilvl="7" w:tentative="1">
+      <w:start w:val="1"/>
+      <w:numFmt w:val="bullet"/>
+      <w:lvlText w:val=""/>
+      <w:lvlJc w:val="left"/>
+      <w:pPr>
+        <w:tabs>
+          <w:tab w:val="num" w:pos="5760"/>
+        </w:tabs>
+        <w:ind w:left="5760" w:hanging="360"/>
+      </w:pPr>
+      <w:rPr>
+        <w:rFonts w:ascii="Wingdings" w:hAnsi="Wingdings" w:hint="default"/>
+        <w:sz w:val="20"/>
+      </w:rPr>
+    </w:lvl>
+    <w:lvl w:ilvl="8" w:tentative="1">
+      <w:start w:val="1"/>
+      <w:numFmt w:val="bullet"/>
+      <w:lvlText w:val=""/>
+      <w:lvlJc w:val="left"/>
+      <w:pPr>
+        <w:tabs>
+          <w:tab w:val="num" w:pos="6480"/>
+        </w:tabs>
+        <w:ind w:left="6480" w:hanging="360"/>
+      </w:pPr>
+      <w:rPr>
+        <w:rFonts w:ascii="Wingdings" w:hAnsi="Wingdings" w:hint="default"/>
+        <w:sz w:val="20"/>
+      </w:rPr>
+    </w:lvl>
+  </w:abstractNum>
+  <w:abstractNum w:abstractNumId="3" w15:restartNumberingAfterBreak="0">
     <w:nsid w:val="424D47D2"/>
     <w:multiLevelType w:val="multilevel"/>
     <w:tmpl w:val="114E598E"/>
@@ -2027,7 +3103,752 @@
       </w:rPr>
     </w:lvl>
   </w:abstractNum>
-  <w:abstractNum w:abstractNumId="2" w15:restartNumberingAfterBreak="0">
+  <w:abstractNum w:abstractNumId="4" w15:restartNumberingAfterBreak="0">
+    <w:nsid w:val="4E5F45BA"/>
+    <w:multiLevelType w:val="multilevel"/>
+    <w:tmpl w:val="4CCC82FA"/>
+    <w:lvl w:ilvl="0">
+      <w:start w:val="1"/>
+      <w:numFmt w:val="bullet"/>
+      <w:lvlText w:val=""/>
+      <w:lvlJc w:val="left"/>
+      <w:pPr>
+        <w:tabs>
+          <w:tab w:val="num" w:pos="720"/>
+        </w:tabs>
+        <w:ind w:left="720" w:hanging="360"/>
+      </w:pPr>
+      <w:rPr>
+        <w:rFonts w:ascii="Symbol" w:hAnsi="Symbol" w:hint="default"/>
+        <w:sz w:val="20"/>
+      </w:rPr>
+    </w:lvl>
+    <w:lvl w:ilvl="1">
+      <w:start w:val="1"/>
+      <w:numFmt w:val="bullet"/>
+      <w:lvlText w:val="o"/>
+      <w:lvlJc w:val="left"/>
+      <w:pPr>
+        <w:tabs>
+          <w:tab w:val="num" w:pos="1440"/>
+        </w:tabs>
+        <w:ind w:left="1440" w:hanging="360"/>
+      </w:pPr>
+      <w:rPr>
+        <w:rFonts w:ascii="Courier New" w:hAnsi="Courier New" w:hint="default"/>
+        <w:sz w:val="20"/>
+      </w:rPr>
+    </w:lvl>
+    <w:lvl w:ilvl="2" w:tentative="1">
+      <w:start w:val="1"/>
+      <w:numFmt w:val="bullet"/>
+      <w:lvlText w:val=""/>
+      <w:lvlJc w:val="left"/>
+      <w:pPr>
+        <w:tabs>
+          <w:tab w:val="num" w:pos="2160"/>
+        </w:tabs>
+        <w:ind w:left="2160" w:hanging="360"/>
+      </w:pPr>
+      <w:rPr>
+        <w:rFonts w:ascii="Wingdings" w:hAnsi="Wingdings" w:hint="default"/>
+        <w:sz w:val="20"/>
+      </w:rPr>
+    </w:lvl>
+    <w:lvl w:ilvl="3" w:tentative="1">
+      <w:start w:val="1"/>
+      <w:numFmt w:val="bullet"/>
+      <w:lvlText w:val=""/>
+      <w:lvlJc w:val="left"/>
+      <w:pPr>
+        <w:tabs>
+          <w:tab w:val="num" w:pos="2880"/>
+        </w:tabs>
+        <w:ind w:left="2880" w:hanging="360"/>
+      </w:pPr>
+      <w:rPr>
+        <w:rFonts w:ascii="Wingdings" w:hAnsi="Wingdings" w:hint="default"/>
+        <w:sz w:val="20"/>
+      </w:rPr>
+    </w:lvl>
+    <w:lvl w:ilvl="4" w:tentative="1">
+      <w:start w:val="1"/>
+      <w:numFmt w:val="bullet"/>
+      <w:lvlText w:val=""/>
+      <w:lvlJc w:val="left"/>
+      <w:pPr>
+        <w:tabs>
+          <w:tab w:val="num" w:pos="3600"/>
+        </w:tabs>
+        <w:ind w:left="3600" w:hanging="360"/>
+      </w:pPr>
+      <w:rPr>
+        <w:rFonts w:ascii="Wingdings" w:hAnsi="Wingdings" w:hint="default"/>
+        <w:sz w:val="20"/>
+      </w:rPr>
+    </w:lvl>
+    <w:lvl w:ilvl="5" w:tentative="1">
+      <w:start w:val="1"/>
+      <w:numFmt w:val="bullet"/>
+      <w:lvlText w:val=""/>
+      <w:lvlJc w:val="left"/>
+      <w:pPr>
+        <w:tabs>
+          <w:tab w:val="num" w:pos="4320"/>
+        </w:tabs>
+        <w:ind w:left="4320" w:hanging="360"/>
+      </w:pPr>
+      <w:rPr>
+        <w:rFonts w:ascii="Wingdings" w:hAnsi="Wingdings" w:hint="default"/>
+        <w:sz w:val="20"/>
+      </w:rPr>
+    </w:lvl>
+    <w:lvl w:ilvl="6" w:tentative="1">
+      <w:start w:val="1"/>
+      <w:numFmt w:val="bullet"/>
+      <w:lvlText w:val=""/>
+      <w:lvlJc w:val="left"/>
+      <w:pPr>
+        <w:tabs>
+          <w:tab w:val="num" w:pos="5040"/>
+        </w:tabs>
+        <w:ind w:left="5040" w:hanging="360"/>
+      </w:pPr>
+      <w:rPr>
+        <w:rFonts w:ascii="Wingdings" w:hAnsi="Wingdings" w:hint="default"/>
+        <w:sz w:val="20"/>
+      </w:rPr>
+    </w:lvl>
+    <w:lvl w:ilvl="7" w:tentative="1">
+      <w:start w:val="1"/>
+      <w:numFmt w:val="bullet"/>
+      <w:lvlText w:val=""/>
+      <w:lvlJc w:val="left"/>
+      <w:pPr>
+        <w:tabs>
+          <w:tab w:val="num" w:pos="5760"/>
+        </w:tabs>
+        <w:ind w:left="5760" w:hanging="360"/>
+      </w:pPr>
+      <w:rPr>
+        <w:rFonts w:ascii="Wingdings" w:hAnsi="Wingdings" w:hint="default"/>
+        <w:sz w:val="20"/>
+      </w:rPr>
+    </w:lvl>
+    <w:lvl w:ilvl="8" w:tentative="1">
+      <w:start w:val="1"/>
+      <w:numFmt w:val="bullet"/>
+      <w:lvlText w:val=""/>
+      <w:lvlJc w:val="left"/>
+      <w:pPr>
+        <w:tabs>
+          <w:tab w:val="num" w:pos="6480"/>
+        </w:tabs>
+        <w:ind w:left="6480" w:hanging="360"/>
+      </w:pPr>
+      <w:rPr>
+        <w:rFonts w:ascii="Wingdings" w:hAnsi="Wingdings" w:hint="default"/>
+        <w:sz w:val="20"/>
+      </w:rPr>
+    </w:lvl>
+  </w:abstractNum>
+  <w:abstractNum w:abstractNumId="5" w15:restartNumberingAfterBreak="0">
+    <w:nsid w:val="563900D1"/>
+    <w:multiLevelType w:val="multilevel"/>
+    <w:tmpl w:val="06A89ECA"/>
+    <w:lvl w:ilvl="0">
+      <w:start w:val="1"/>
+      <w:numFmt w:val="bullet"/>
+      <w:lvlText w:val=""/>
+      <w:lvlJc w:val="left"/>
+      <w:pPr>
+        <w:tabs>
+          <w:tab w:val="num" w:pos="720"/>
+        </w:tabs>
+        <w:ind w:left="720" w:hanging="360"/>
+      </w:pPr>
+      <w:rPr>
+        <w:rFonts w:ascii="Symbol" w:hAnsi="Symbol" w:hint="default"/>
+        <w:sz w:val="20"/>
+      </w:rPr>
+    </w:lvl>
+    <w:lvl w:ilvl="1" w:tentative="1">
+      <w:start w:val="1"/>
+      <w:numFmt w:val="bullet"/>
+      <w:lvlText w:val="o"/>
+      <w:lvlJc w:val="left"/>
+      <w:pPr>
+        <w:tabs>
+          <w:tab w:val="num" w:pos="1440"/>
+        </w:tabs>
+        <w:ind w:left="1440" w:hanging="360"/>
+      </w:pPr>
+      <w:rPr>
+        <w:rFonts w:ascii="Courier New" w:hAnsi="Courier New" w:hint="default"/>
+        <w:sz w:val="20"/>
+      </w:rPr>
+    </w:lvl>
+    <w:lvl w:ilvl="2" w:tentative="1">
+      <w:start w:val="1"/>
+      <w:numFmt w:val="bullet"/>
+      <w:lvlText w:val=""/>
+      <w:lvlJc w:val="left"/>
+      <w:pPr>
+        <w:tabs>
+          <w:tab w:val="num" w:pos="2160"/>
+        </w:tabs>
+        <w:ind w:left="2160" w:hanging="360"/>
+      </w:pPr>
+      <w:rPr>
+        <w:rFonts w:ascii="Wingdings" w:hAnsi="Wingdings" w:hint="default"/>
+        <w:sz w:val="20"/>
+      </w:rPr>
+    </w:lvl>
+    <w:lvl w:ilvl="3" w:tentative="1">
+      <w:start w:val="1"/>
+      <w:numFmt w:val="bullet"/>
+      <w:lvlText w:val=""/>
+      <w:lvlJc w:val="left"/>
+      <w:pPr>
+        <w:tabs>
+          <w:tab w:val="num" w:pos="2880"/>
+        </w:tabs>
+        <w:ind w:left="2880" w:hanging="360"/>
+      </w:pPr>
+      <w:rPr>
+        <w:rFonts w:ascii="Wingdings" w:hAnsi="Wingdings" w:hint="default"/>
+        <w:sz w:val="20"/>
+      </w:rPr>
+    </w:lvl>
+    <w:lvl w:ilvl="4" w:tentative="1">
+      <w:start w:val="1"/>
+      <w:numFmt w:val="bullet"/>
+      <w:lvlText w:val=""/>
+      <w:lvlJc w:val="left"/>
+      <w:pPr>
+        <w:tabs>
+          <w:tab w:val="num" w:pos="3600"/>
+        </w:tabs>
+        <w:ind w:left="3600" w:hanging="360"/>
+      </w:pPr>
+      <w:rPr>
+        <w:rFonts w:ascii="Wingdings" w:hAnsi="Wingdings" w:hint="default"/>
+        <w:sz w:val="20"/>
+      </w:rPr>
+    </w:lvl>
+    <w:lvl w:ilvl="5" w:tentative="1">
+      <w:start w:val="1"/>
+      <w:numFmt w:val="bullet"/>
+      <w:lvlText w:val=""/>
+      <w:lvlJc w:val="left"/>
+      <w:pPr>
+        <w:tabs>
+          <w:tab w:val="num" w:pos="4320"/>
+        </w:tabs>
+        <w:ind w:left="4320" w:hanging="360"/>
+      </w:pPr>
+      <w:rPr>
+        <w:rFonts w:ascii="Wingdings" w:hAnsi="Wingdings" w:hint="default"/>
+        <w:sz w:val="20"/>
+      </w:rPr>
+    </w:lvl>
+    <w:lvl w:ilvl="6" w:tentative="1">
+      <w:start w:val="1"/>
+      <w:numFmt w:val="bullet"/>
+      <w:lvlText w:val=""/>
+      <w:lvlJc w:val="left"/>
+      <w:pPr>
+        <w:tabs>
+          <w:tab w:val="num" w:pos="5040"/>
+        </w:tabs>
+        <w:ind w:left="5040" w:hanging="360"/>
+      </w:pPr>
+      <w:rPr>
+        <w:rFonts w:ascii="Wingdings" w:hAnsi="Wingdings" w:hint="default"/>
+        <w:sz w:val="20"/>
+      </w:rPr>
+    </w:lvl>
+    <w:lvl w:ilvl="7" w:tentative="1">
+      <w:start w:val="1"/>
+      <w:numFmt w:val="bullet"/>
+      <w:lvlText w:val=""/>
+      <w:lvlJc w:val="left"/>
+      <w:pPr>
+        <w:tabs>
+          <w:tab w:val="num" w:pos="5760"/>
+        </w:tabs>
+        <w:ind w:left="5760" w:hanging="360"/>
+      </w:pPr>
+      <w:rPr>
+        <w:rFonts w:ascii="Wingdings" w:hAnsi="Wingdings" w:hint="default"/>
+        <w:sz w:val="20"/>
+      </w:rPr>
+    </w:lvl>
+    <w:lvl w:ilvl="8" w:tentative="1">
+      <w:start w:val="1"/>
+      <w:numFmt w:val="bullet"/>
+      <w:lvlText w:val=""/>
+      <w:lvlJc w:val="left"/>
+      <w:pPr>
+        <w:tabs>
+          <w:tab w:val="num" w:pos="6480"/>
+        </w:tabs>
+        <w:ind w:left="6480" w:hanging="360"/>
+      </w:pPr>
+      <w:rPr>
+        <w:rFonts w:ascii="Wingdings" w:hAnsi="Wingdings" w:hint="default"/>
+        <w:sz w:val="20"/>
+      </w:rPr>
+    </w:lvl>
+  </w:abstractNum>
+  <w:abstractNum w:abstractNumId="6" w15:restartNumberingAfterBreak="0">
+    <w:nsid w:val="61524A92"/>
+    <w:multiLevelType w:val="multilevel"/>
+    <w:tmpl w:val="FACC0D5C"/>
+    <w:lvl w:ilvl="0">
+      <w:start w:val="1"/>
+      <w:numFmt w:val="bullet"/>
+      <w:lvlText w:val=""/>
+      <w:lvlJc w:val="left"/>
+      <w:pPr>
+        <w:tabs>
+          <w:tab w:val="num" w:pos="720"/>
+        </w:tabs>
+        <w:ind w:left="720" w:hanging="360"/>
+      </w:pPr>
+      <w:rPr>
+        <w:rFonts w:ascii="Symbol" w:hAnsi="Symbol" w:hint="default"/>
+        <w:sz w:val="20"/>
+      </w:rPr>
+    </w:lvl>
+    <w:lvl w:ilvl="1" w:tentative="1">
+      <w:start w:val="1"/>
+      <w:numFmt w:val="bullet"/>
+      <w:lvlText w:val="o"/>
+      <w:lvlJc w:val="left"/>
+      <w:pPr>
+        <w:tabs>
+          <w:tab w:val="num" w:pos="1440"/>
+        </w:tabs>
+        <w:ind w:left="1440" w:hanging="360"/>
+      </w:pPr>
+      <w:rPr>
+        <w:rFonts w:ascii="Courier New" w:hAnsi="Courier New" w:hint="default"/>
+        <w:sz w:val="20"/>
+      </w:rPr>
+    </w:lvl>
+    <w:lvl w:ilvl="2" w:tentative="1">
+      <w:start w:val="1"/>
+      <w:numFmt w:val="bullet"/>
+      <w:lvlText w:val=""/>
+      <w:lvlJc w:val="left"/>
+      <w:pPr>
+        <w:tabs>
+          <w:tab w:val="num" w:pos="2160"/>
+        </w:tabs>
+        <w:ind w:left="2160" w:hanging="360"/>
+      </w:pPr>
+      <w:rPr>
+        <w:rFonts w:ascii="Wingdings" w:hAnsi="Wingdings" w:hint="default"/>
+        <w:sz w:val="20"/>
+      </w:rPr>
+    </w:lvl>
+    <w:lvl w:ilvl="3" w:tentative="1">
+      <w:start w:val="1"/>
+      <w:numFmt w:val="bullet"/>
+      <w:lvlText w:val=""/>
+      <w:lvlJc w:val="left"/>
+      <w:pPr>
+        <w:tabs>
+          <w:tab w:val="num" w:pos="2880"/>
+        </w:tabs>
+        <w:ind w:left="2880" w:hanging="360"/>
+      </w:pPr>
+      <w:rPr>
+        <w:rFonts w:ascii="Wingdings" w:hAnsi="Wingdings" w:hint="default"/>
+        <w:sz w:val="20"/>
+      </w:rPr>
+    </w:lvl>
+    <w:lvl w:ilvl="4" w:tentative="1">
+      <w:start w:val="1"/>
+      <w:numFmt w:val="bullet"/>
+      <w:lvlText w:val=""/>
+      <w:lvlJc w:val="left"/>
+      <w:pPr>
+        <w:tabs>
+          <w:tab w:val="num" w:pos="3600"/>
+        </w:tabs>
+        <w:ind w:left="3600" w:hanging="360"/>
+      </w:pPr>
+      <w:rPr>
+        <w:rFonts w:ascii="Wingdings" w:hAnsi="Wingdings" w:hint="default"/>
+        <w:sz w:val="20"/>
+      </w:rPr>
+    </w:lvl>
+    <w:lvl w:ilvl="5" w:tentative="1">
+      <w:start w:val="1"/>
+      <w:numFmt w:val="bullet"/>
+      <w:lvlText w:val=""/>
+      <w:lvlJc w:val="left"/>
+      <w:pPr>
+        <w:tabs>
+          <w:tab w:val="num" w:pos="4320"/>
+        </w:tabs>
+        <w:ind w:left="4320" w:hanging="360"/>
+      </w:pPr>
+      <w:rPr>
+        <w:rFonts w:ascii="Wingdings" w:hAnsi="Wingdings" w:hint="default"/>
+        <w:sz w:val="20"/>
+      </w:rPr>
+    </w:lvl>
+    <w:lvl w:ilvl="6" w:tentative="1">
+      <w:start w:val="1"/>
+      <w:numFmt w:val="bullet"/>
+      <w:lvlText w:val=""/>
+      <w:lvlJc w:val="left"/>
+      <w:pPr>
+        <w:tabs>
+          <w:tab w:val="num" w:pos="5040"/>
+        </w:tabs>
+        <w:ind w:left="5040" w:hanging="360"/>
+      </w:pPr>
+      <w:rPr>
+        <w:rFonts w:ascii="Wingdings" w:hAnsi="Wingdings" w:hint="default"/>
+        <w:sz w:val="20"/>
+      </w:rPr>
+    </w:lvl>
+    <w:lvl w:ilvl="7" w:tentative="1">
+      <w:start w:val="1"/>
+      <w:numFmt w:val="bullet"/>
+      <w:lvlText w:val=""/>
+      <w:lvlJc w:val="left"/>
+      <w:pPr>
+        <w:tabs>
+          <w:tab w:val="num" w:pos="5760"/>
+        </w:tabs>
+        <w:ind w:left="5760" w:hanging="360"/>
+      </w:pPr>
+      <w:rPr>
+        <w:rFonts w:ascii="Wingdings" w:hAnsi="Wingdings" w:hint="default"/>
+        <w:sz w:val="20"/>
+      </w:rPr>
+    </w:lvl>
+    <w:lvl w:ilvl="8" w:tentative="1">
+      <w:start w:val="1"/>
+      <w:numFmt w:val="bullet"/>
+      <w:lvlText w:val=""/>
+      <w:lvlJc w:val="left"/>
+      <w:pPr>
+        <w:tabs>
+          <w:tab w:val="num" w:pos="6480"/>
+        </w:tabs>
+        <w:ind w:left="6480" w:hanging="360"/>
+      </w:pPr>
+      <w:rPr>
+        <w:rFonts w:ascii="Wingdings" w:hAnsi="Wingdings" w:hint="default"/>
+        <w:sz w:val="20"/>
+      </w:rPr>
+    </w:lvl>
+  </w:abstractNum>
+  <w:abstractNum w:abstractNumId="7" w15:restartNumberingAfterBreak="0">
+    <w:nsid w:val="70B93B44"/>
+    <w:multiLevelType w:val="multilevel"/>
+    <w:tmpl w:val="DF60ED56"/>
+    <w:lvl w:ilvl="0">
+      <w:start w:val="1"/>
+      <w:numFmt w:val="bullet"/>
+      <w:lvlText w:val=""/>
+      <w:lvlJc w:val="left"/>
+      <w:pPr>
+        <w:tabs>
+          <w:tab w:val="num" w:pos="720"/>
+        </w:tabs>
+        <w:ind w:left="720" w:hanging="360"/>
+      </w:pPr>
+      <w:rPr>
+        <w:rFonts w:ascii="Symbol" w:hAnsi="Symbol" w:hint="default"/>
+        <w:sz w:val="20"/>
+      </w:rPr>
+    </w:lvl>
+    <w:lvl w:ilvl="1" w:tentative="1">
+      <w:start w:val="1"/>
+      <w:numFmt w:val="bullet"/>
+      <w:lvlText w:val="o"/>
+      <w:lvlJc w:val="left"/>
+      <w:pPr>
+        <w:tabs>
+          <w:tab w:val="num" w:pos="1440"/>
+        </w:tabs>
+        <w:ind w:left="1440" w:hanging="360"/>
+      </w:pPr>
+      <w:rPr>
+        <w:rFonts w:ascii="Courier New" w:hAnsi="Courier New" w:hint="default"/>
+        <w:sz w:val="20"/>
+      </w:rPr>
+    </w:lvl>
+    <w:lvl w:ilvl="2" w:tentative="1">
+      <w:start w:val="1"/>
+      <w:numFmt w:val="bullet"/>
+      <w:lvlText w:val=""/>
+      <w:lvlJc w:val="left"/>
+      <w:pPr>
+        <w:tabs>
+          <w:tab w:val="num" w:pos="2160"/>
+        </w:tabs>
+        <w:ind w:left="2160" w:hanging="360"/>
+      </w:pPr>
+      <w:rPr>
+        <w:rFonts w:ascii="Wingdings" w:hAnsi="Wingdings" w:hint="default"/>
+        <w:sz w:val="20"/>
+      </w:rPr>
+    </w:lvl>
+    <w:lvl w:ilvl="3" w:tentative="1">
+      <w:start w:val="1"/>
+      <w:numFmt w:val="bullet"/>
+      <w:lvlText w:val=""/>
+      <w:lvlJc w:val="left"/>
+      <w:pPr>
+        <w:tabs>
+          <w:tab w:val="num" w:pos="2880"/>
+        </w:tabs>
+        <w:ind w:left="2880" w:hanging="360"/>
+      </w:pPr>
+      <w:rPr>
+        <w:rFonts w:ascii="Wingdings" w:hAnsi="Wingdings" w:hint="default"/>
+        <w:sz w:val="20"/>
+      </w:rPr>
+    </w:lvl>
+    <w:lvl w:ilvl="4" w:tentative="1">
+      <w:start w:val="1"/>
+      <w:numFmt w:val="bullet"/>
+      <w:lvlText w:val=""/>
+      <w:lvlJc w:val="left"/>
+      <w:pPr>
+        <w:tabs>
+          <w:tab w:val="num" w:pos="3600"/>
+        </w:tabs>
+        <w:ind w:left="3600" w:hanging="360"/>
+      </w:pPr>
+      <w:rPr>
+        <w:rFonts w:ascii="Wingdings" w:hAnsi="Wingdings" w:hint="default"/>
+        <w:sz w:val="20"/>
+      </w:rPr>
+    </w:lvl>
+    <w:lvl w:ilvl="5" w:tentative="1">
+      <w:start w:val="1"/>
+      <w:numFmt w:val="bullet"/>
+      <w:lvlText w:val=""/>
+      <w:lvlJc w:val="left"/>
+      <w:pPr>
+        <w:tabs>
+          <w:tab w:val="num" w:pos="4320"/>
+        </w:tabs>
+        <w:ind w:left="4320" w:hanging="360"/>
+      </w:pPr>
+      <w:rPr>
+        <w:rFonts w:ascii="Wingdings" w:hAnsi="Wingdings" w:hint="default"/>
+        <w:sz w:val="20"/>
+      </w:rPr>
+    </w:lvl>
+    <w:lvl w:ilvl="6" w:tentative="1">
+      <w:start w:val="1"/>
+      <w:numFmt w:val="bullet"/>
+      <w:lvlText w:val=""/>
+      <w:lvlJc w:val="left"/>
+      <w:pPr>
+        <w:tabs>
+          <w:tab w:val="num" w:pos="5040"/>
+        </w:tabs>
+        <w:ind w:left="5040" w:hanging="360"/>
+      </w:pPr>
+      <w:rPr>
+        <w:rFonts w:ascii="Wingdings" w:hAnsi="Wingdings" w:hint="default"/>
+        <w:sz w:val="20"/>
+      </w:rPr>
+    </w:lvl>
+    <w:lvl w:ilvl="7" w:tentative="1">
+      <w:start w:val="1"/>
+      <w:numFmt w:val="bullet"/>
+      <w:lvlText w:val=""/>
+      <w:lvlJc w:val="left"/>
+      <w:pPr>
+        <w:tabs>
+          <w:tab w:val="num" w:pos="5760"/>
+        </w:tabs>
+        <w:ind w:left="5760" w:hanging="360"/>
+      </w:pPr>
+      <w:rPr>
+        <w:rFonts w:ascii="Wingdings" w:hAnsi="Wingdings" w:hint="default"/>
+        <w:sz w:val="20"/>
+      </w:rPr>
+    </w:lvl>
+    <w:lvl w:ilvl="8" w:tentative="1">
+      <w:start w:val="1"/>
+      <w:numFmt w:val="bullet"/>
+      <w:lvlText w:val=""/>
+      <w:lvlJc w:val="left"/>
+      <w:pPr>
+        <w:tabs>
+          <w:tab w:val="num" w:pos="6480"/>
+        </w:tabs>
+        <w:ind w:left="6480" w:hanging="360"/>
+      </w:pPr>
+      <w:rPr>
+        <w:rFonts w:ascii="Wingdings" w:hAnsi="Wingdings" w:hint="default"/>
+        <w:sz w:val="20"/>
+      </w:rPr>
+    </w:lvl>
+  </w:abstractNum>
+  <w:abstractNum w:abstractNumId="8" w15:restartNumberingAfterBreak="0">
+    <w:nsid w:val="739B446C"/>
+    <w:multiLevelType w:val="multilevel"/>
+    <w:tmpl w:val="5600A75A"/>
+    <w:lvl w:ilvl="0">
+      <w:start w:val="1"/>
+      <w:numFmt w:val="bullet"/>
+      <w:lvlText w:val=""/>
+      <w:lvlJc w:val="left"/>
+      <w:pPr>
+        <w:tabs>
+          <w:tab w:val="num" w:pos="720"/>
+        </w:tabs>
+        <w:ind w:left="720" w:hanging="360"/>
+      </w:pPr>
+      <w:rPr>
+        <w:rFonts w:ascii="Symbol" w:hAnsi="Symbol" w:hint="default"/>
+        <w:sz w:val="20"/>
+      </w:rPr>
+    </w:lvl>
+    <w:lvl w:ilvl="1" w:tentative="1">
+      <w:start w:val="1"/>
+      <w:numFmt w:val="bullet"/>
+      <w:lvlText w:val="o"/>
+      <w:lvlJc w:val="left"/>
+      <w:pPr>
+        <w:tabs>
+          <w:tab w:val="num" w:pos="1440"/>
+        </w:tabs>
+        <w:ind w:left="1440" w:hanging="360"/>
+      </w:pPr>
+      <w:rPr>
+        <w:rFonts w:ascii="Courier New" w:hAnsi="Courier New" w:hint="default"/>
+        <w:sz w:val="20"/>
+      </w:rPr>
+    </w:lvl>
+    <w:lvl w:ilvl="2" w:tentative="1">
+      <w:start w:val="1"/>
+      <w:numFmt w:val="bullet"/>
+      <w:lvlText w:val=""/>
+      <w:lvlJc w:val="left"/>
+      <w:pPr>
+        <w:tabs>
+          <w:tab w:val="num" w:pos="2160"/>
+        </w:tabs>
+        <w:ind w:left="2160" w:hanging="360"/>
+      </w:pPr>
+      <w:rPr>
+        <w:rFonts w:ascii="Wingdings" w:hAnsi="Wingdings" w:hint="default"/>
+        <w:sz w:val="20"/>
+      </w:rPr>
+    </w:lvl>
+    <w:lvl w:ilvl="3" w:tentative="1">
+      <w:start w:val="1"/>
+      <w:numFmt w:val="bullet"/>
+      <w:lvlText w:val=""/>
+      <w:lvlJc w:val="left"/>
+      <w:pPr>
+        <w:tabs>
+          <w:tab w:val="num" w:pos="2880"/>
+        </w:tabs>
+        <w:ind w:left="2880" w:hanging="360"/>
+      </w:pPr>
+      <w:rPr>
+        <w:rFonts w:ascii="Wingdings" w:hAnsi="Wingdings" w:hint="default"/>
+        <w:sz w:val="20"/>
+      </w:rPr>
+    </w:lvl>
+    <w:lvl w:ilvl="4" w:tentative="1">
+      <w:start w:val="1"/>
+      <w:numFmt w:val="bullet"/>
+      <w:lvlText w:val=""/>
+      <w:lvlJc w:val="left"/>
+      <w:pPr>
+        <w:tabs>
+          <w:tab w:val="num" w:pos="3600"/>
+        </w:tabs>
+        <w:ind w:left="3600" w:hanging="360"/>
+      </w:pPr>
+      <w:rPr>
+        <w:rFonts w:ascii="Wingdings" w:hAnsi="Wingdings" w:hint="default"/>
+        <w:sz w:val="20"/>
+      </w:rPr>
+    </w:lvl>
+    <w:lvl w:ilvl="5" w:tentative="1">
+      <w:start w:val="1"/>
+      <w:numFmt w:val="bullet"/>
+      <w:lvlText w:val=""/>
+      <w:lvlJc w:val="left"/>
+      <w:pPr>
+        <w:tabs>
+          <w:tab w:val="num" w:pos="4320"/>
+        </w:tabs>
+        <w:ind w:left="4320" w:hanging="360"/>
+      </w:pPr>
+      <w:rPr>
+        <w:rFonts w:ascii="Wingdings" w:hAnsi="Wingdings" w:hint="default"/>
+        <w:sz w:val="20"/>
+      </w:rPr>
+    </w:lvl>
+    <w:lvl w:ilvl="6" w:tentative="1">
+      <w:start w:val="1"/>
+      <w:numFmt w:val="bullet"/>
+      <w:lvlText w:val=""/>
+      <w:lvlJc w:val="left"/>
+      <w:pPr>
+        <w:tabs>
+          <w:tab w:val="num" w:pos="5040"/>
+        </w:tabs>
+        <w:ind w:left="5040" w:hanging="360"/>
+      </w:pPr>
+      <w:rPr>
+        <w:rFonts w:ascii="Wingdings" w:hAnsi="Wingdings" w:hint="default"/>
+        <w:sz w:val="20"/>
+      </w:rPr>
+    </w:lvl>
+    <w:lvl w:ilvl="7" w:tentative="1">
+      <w:start w:val="1"/>
+      <w:numFmt w:val="bullet"/>
+      <w:lvlText w:val=""/>
+      <w:lvlJc w:val="left"/>
+      <w:pPr>
+        <w:tabs>
+          <w:tab w:val="num" w:pos="5760"/>
+        </w:tabs>
+        <w:ind w:left="5760" w:hanging="360"/>
+      </w:pPr>
+      <w:rPr>
+        <w:rFonts w:ascii="Wingdings" w:hAnsi="Wingdings" w:hint="default"/>
+        <w:sz w:val="20"/>
+      </w:rPr>
+    </w:lvl>
+    <w:lvl w:ilvl="8" w:tentative="1">
+      <w:start w:val="1"/>
+      <w:numFmt w:val="bullet"/>
+      <w:lvlText w:val=""/>
+      <w:lvlJc w:val="left"/>
+      <w:pPr>
+        <w:tabs>
+          <w:tab w:val="num" w:pos="6480"/>
+        </w:tabs>
+        <w:ind w:left="6480" w:hanging="360"/>
+      </w:pPr>
+      <w:rPr>
+        <w:rFonts w:ascii="Wingdings" w:hAnsi="Wingdings" w:hint="default"/>
+        <w:sz w:val="20"/>
+      </w:rPr>
+    </w:lvl>
+  </w:abstractNum>
+  <w:abstractNum w:abstractNumId="9" w15:restartNumberingAfterBreak="0">
     <w:nsid w:val="7DDE7040"/>
     <w:multiLevelType w:val="multilevel"/>
     <w:tmpl w:val="50B0CD1A"/>
@@ -2177,13 +3998,34 @@
     </w:lvl>
   </w:abstractNum>
   <w:num w:numId="1" w16cid:durableId="350884524">
+    <w:abstractNumId w:val="1"/>
+  </w:num>
+  <w:num w:numId="2" w16cid:durableId="378750866">
+    <w:abstractNumId w:val="3"/>
+  </w:num>
+  <w:num w:numId="3" w16cid:durableId="1994096526">
+    <w:abstractNumId w:val="9"/>
+  </w:num>
+  <w:num w:numId="4" w16cid:durableId="335233769">
+    <w:abstractNumId w:val="4"/>
+  </w:num>
+  <w:num w:numId="5" w16cid:durableId="393285597">
+    <w:abstractNumId w:val="2"/>
+  </w:num>
+  <w:num w:numId="6" w16cid:durableId="410352494">
+    <w:abstractNumId w:val="5"/>
+  </w:num>
+  <w:num w:numId="7" w16cid:durableId="1949241657">
     <w:abstractNumId w:val="0"/>
   </w:num>
-  <w:num w:numId="2" w16cid:durableId="378750866">
-    <w:abstractNumId w:val="1"/>
+  <w:num w:numId="8" w16cid:durableId="1424912325">
+    <w:abstractNumId w:val="8"/>
   </w:num>
-  <w:num w:numId="3" w16cid:durableId="1994096526">
-    <w:abstractNumId w:val="2"/>
+  <w:num w:numId="9" w16cid:durableId="1271815459">
+    <w:abstractNumId w:val="7"/>
+  </w:num>
+  <w:num w:numId="10" w16cid:durableId="72971102">
+    <w:abstractNumId w:val="6"/>
   </w:num>
 </w:numbering>
 </file>
@@ -2792,7 +4634,6 @@
   <w:style w:type="character" w:default="1" w:styleId="DefaultParagraphFont">
     <w:name w:val="Default Paragraph Font"/>
     <w:uiPriority w:val="1"/>
-    <w:semiHidden/>
     <w:unhideWhenUsed/>
   </w:style>
   <w:style w:type="table" w:default="1" w:styleId="TableNormal">
@@ -3125,6 +4966,17 @@
       </w:tblBorders>
     </w:tblPr>
   </w:style>
+  <w:style w:type="paragraph" w:styleId="NormalWeb">
+    <w:name w:val="Normal (Web)"/>
+    <w:basedOn w:val="Normal"/>
+    <w:uiPriority w:val="99"/>
+    <w:semiHidden/>
+    <w:unhideWhenUsed/>
+    <w:rsid w:val="00CE1575"/>
+    <w:rPr>
+      <w:rFonts w:ascii="Times New Roman" w:hAnsi="Times New Roman" w:cs="Times New Roman"/>
+    </w:rPr>
+  </w:style>
 </w:styles>
 </file>
 

</xml_diff>

<commit_message>
Day 8 changes added : Audio Amplifier done
</commit_message>
<xml_diff>
--- a/docs/Solar Audio Amplifier d2d track.docx
+++ b/docs/Solar Audio Amplifier d2d track.docx
@@ -123,15 +123,7 @@
     </w:p>
     <w:p>
       <w:r>
-        <w:t xml:space="preserve">This serves as a precursor to photovoltaic cell </w:t>
-      </w:r>
-      <w:proofErr w:type="spellStart"/>
-      <w:r>
-        <w:t>modeling</w:t>
-      </w:r>
-      <w:proofErr w:type="spellEnd"/>
-      <w:r>
-        <w:t>, since the solar-cell equivalent circuit is fundamentally diode-based.</w:t>
+        <w:t>This serves as a precursor to photovoltaic cell modeling, since the solar-cell equivalent circuit is fundamentally diode-based.</w:t>
       </w:r>
     </w:p>
     <w:p>
@@ -327,15 +319,7 @@
         </w:numPr>
       </w:pPr>
       <w:r>
-        <w:t>Added series resistance (Rs) and shunt resistance (</w:t>
-      </w:r>
-      <w:proofErr w:type="spellStart"/>
-      <w:r>
-        <w:t>Rsh</w:t>
-      </w:r>
-      <w:proofErr w:type="spellEnd"/>
-      <w:r>
-        <w:t>) to the single-diode PV model.</w:t>
+        <w:t>Added series resistance (Rs) and shunt resistance (Rsh) to the single-diode PV model.</w:t>
       </w:r>
     </w:p>
     <w:p>
@@ -346,15 +330,7 @@
         </w:numPr>
       </w:pPr>
       <w:r>
-        <w:t xml:space="preserve">Tested different Rs and </w:t>
-      </w:r>
-      <w:proofErr w:type="spellStart"/>
-      <w:r>
-        <w:t>Rsh</w:t>
-      </w:r>
-      <w:proofErr w:type="spellEnd"/>
-      <w:r>
-        <w:t xml:space="preserve"> values in PSpice.</w:t>
+        <w:t>Tested different Rs and Rsh values in PSpice.</w:t>
       </w:r>
     </w:p>
     <w:p>
@@ -387,15 +363,7 @@
         </w:numPr>
       </w:pPr>
       <w:r>
-        <w:t>Performed an irradiance (</w:t>
-      </w:r>
-      <w:proofErr w:type="spellStart"/>
-      <w:r>
-        <w:t>Iph</w:t>
-      </w:r>
-      <w:proofErr w:type="spellEnd"/>
-      <w:r>
-        <w:t>) sweep from 0.1 A to 1.0 A.</w:t>
+        <w:t>Performed an irradiance (Iph) sweep from 0.1 A to 1.0 A.</w:t>
       </w:r>
     </w:p>
     <w:p>
@@ -501,15 +469,7 @@
     </w:p>
     <w:p>
       <w:r>
-        <w:t xml:space="preserve">Irradiance ( </w:t>
-      </w:r>
-      <w:proofErr w:type="spellStart"/>
-      <w:r>
-        <w:t>Iph</w:t>
-      </w:r>
-      <w:proofErr w:type="spellEnd"/>
-      <w:r>
-        <w:t xml:space="preserve"> ) sweep</w:t>
+        <w:t>Irradiance ( Iph ) sweep</w:t>
       </w:r>
     </w:p>
     <w:p>
@@ -565,11 +525,9 @@
             <w:tcW w:w="1854" w:type="dxa"/>
           </w:tcPr>
           <w:p>
-            <w:proofErr w:type="spellStart"/>
             <w:r>
               <w:t>Vout</w:t>
             </w:r>
-            <w:proofErr w:type="spellEnd"/>
           </w:p>
         </w:tc>
         <w:tc>
@@ -577,11 +535,9 @@
             <w:tcW w:w="1761" w:type="dxa"/>
           </w:tcPr>
           <w:p>
-            <w:proofErr w:type="spellStart"/>
             <w:r>
               <w:t>Iload</w:t>
             </w:r>
-            <w:proofErr w:type="spellEnd"/>
           </w:p>
         </w:tc>
         <w:tc>
@@ -1294,22 +1250,6 @@
     </w:p>
     <w:p>
       <w:r>
-        <w:t>DAY5</w:t>
-      </w:r>
-    </w:p>
-    <w:p>
-      <w:r>
-        <w:t>BUILDING POWER CONDITIONING AFTER BUILDING SOLAR CELL AND PROVING THAT IT WORKS</w:t>
-      </w:r>
-    </w:p>
-    <w:p>
-      <w:pPr>
-        <w:rPr>
-          <w:b/>
-          <w:bCs/>
-        </w:rPr>
-      </w:pPr>
-      <w:r>
         <w:rPr>
           <w:b/>
           <w:bCs/>
@@ -1400,15 +1340,7 @@
         </w:numPr>
       </w:pPr>
       <w:r>
-        <w:t>MOSFET switch (</w:t>
-      </w:r>
-      <w:proofErr w:type="spellStart"/>
-      <w:r>
-        <w:t>MbreakN</w:t>
-      </w:r>
-      <w:proofErr w:type="spellEnd"/>
-      <w:r>
-        <w:t>)</w:t>
+        <w:t>MOSFET switch (MbreakN)</w:t>
       </w:r>
     </w:p>
     <w:p>
@@ -1430,7 +1362,6 @@
         </w:numPr>
       </w:pPr>
       <w:r>
-        <w:lastRenderedPageBreak/>
         <w:t>Output capacitor</w:t>
       </w:r>
     </w:p>
@@ -1464,6 +1395,7 @@
         </w:numPr>
       </w:pPr>
       <w:r>
+        <w:lastRenderedPageBreak/>
         <w:t>Connected the boost-converter stage to the previously developed solar-cell model.</w:t>
       </w:r>
     </w:p>
@@ -1475,15 +1407,7 @@
         </w:numPr>
       </w:pPr>
       <w:r>
-        <w:t xml:space="preserve">Resolved multiple simulation and </w:t>
-      </w:r>
-      <w:proofErr w:type="spellStart"/>
-      <w:r>
-        <w:t>netlisting</w:t>
-      </w:r>
-      <w:proofErr w:type="spellEnd"/>
-      <w:r>
-        <w:t xml:space="preserve"> issues, including:</w:t>
+        <w:t>Resolved multiple simulation and netlisting issues, including:</w:t>
       </w:r>
     </w:p>
     <w:p>
@@ -1678,28 +1602,31 @@
         </w:numPr>
       </w:pPr>
       <w:r>
+        <w:t>Additional work is needed to verify component orientation, output-node measurement, and converter efficiency.</w:t>
+      </w:r>
+    </w:p>
+    <w:p>
+      <w:pPr>
+        <w:rPr>
+          <w:b/>
+          <w:bCs/>
+        </w:rPr>
+      </w:pPr>
+      <w:r>
+        <w:rPr>
+          <w:b/>
+          <w:bCs/>
+        </w:rPr>
+        <w:t>Conclusion</w:t>
+      </w:r>
+    </w:p>
+    <w:p>
+      <w:r>
+        <w:t xml:space="preserve">A preliminary power-conditioning stage was successfully implemented and simulated. The boost-converter framework is operational, and switching behaviour has been verified. </w:t>
+      </w:r>
+      <w:r>
         <w:lastRenderedPageBreak/>
-        <w:t>Additional work is needed to verify component orientation, output-node measurement, and converter efficiency.</w:t>
-      </w:r>
-    </w:p>
-    <w:p>
-      <w:pPr>
-        <w:rPr>
-          <w:b/>
-          <w:bCs/>
-        </w:rPr>
-      </w:pPr>
-      <w:r>
-        <w:rPr>
-          <w:b/>
-          <w:bCs/>
-        </w:rPr>
-        <w:t>Conclusion</w:t>
-      </w:r>
-    </w:p>
-    <w:p>
-      <w:r>
-        <w:t>A preliminary power-conditioning stage was successfully implemented and simulated. The boost-converter framework is operational, and switching behaviour has been verified. Future work will focus on obtaining the desired voltage boost and integrating the conditioned output with the audio amplifier stage.</w:t>
+        <w:t>Future work will focus on obtaining the desired voltage boost and integrating the conditioned output with the audio amplifier stage.</w:t>
       </w:r>
     </w:p>
     <w:p/>
@@ -1819,13 +1746,8 @@
         </w:numPr>
       </w:pPr>
       <w:r>
-        <w:t xml:space="preserve">Incorrect switching </w:t>
-      </w:r>
-      <w:proofErr w:type="spellStart"/>
-      <w:r>
-        <w:t>behavior</w:t>
-      </w:r>
-      <w:proofErr w:type="spellEnd"/>
+        <w:t>Incorrect switching behavior</w:t>
+      </w:r>
     </w:p>
     <w:p>
       <w:pPr>
@@ -1906,7 +1828,6 @@
         </w:numPr>
       </w:pPr>
       <w:r>
-        <w:lastRenderedPageBreak/>
         <w:t>MOSFET drain current remains near zero in the original design.</w:t>
       </w:r>
     </w:p>
@@ -1945,6 +1866,7 @@
         </w:numPr>
       </w:pPr>
       <w:r>
+        <w:lastRenderedPageBreak/>
         <w:t>Verify IRF150 model pin configuration and switching operation.</w:t>
       </w:r>
     </w:p>
@@ -1967,15 +1889,7 @@
         </w:numPr>
       </w:pPr>
       <w:r>
-        <w:t xml:space="preserve">Return to the original boost converter and validate switching-node </w:t>
-      </w:r>
-      <w:proofErr w:type="spellStart"/>
-      <w:r>
-        <w:t>behavior</w:t>
-      </w:r>
-      <w:proofErr w:type="spellEnd"/>
-      <w:r>
-        <w:t xml:space="preserve"> before further integration.</w:t>
+        <w:t>Return to the original boost converter and validate switching-node behavior before further integration.</w:t>
       </w:r>
     </w:p>
     <w:p>
@@ -2086,6 +2000,9 @@
     </w:p>
     <w:p>
       <w:r>
+        <w:rPr>
+          <w:noProof/>
+        </w:rPr>
         <w:lastRenderedPageBreak/>
         <w:drawing>
           <wp:inline distT="0" distB="0" distL="0" distR="0" wp14:anchorId="19390A0A" wp14:editId="3C42CF6B">
@@ -2126,6 +2043,9 @@
     </w:p>
     <w:p>
       <w:r>
+        <w:rPr>
+          <w:noProof/>
+        </w:rPr>
         <w:drawing>
           <wp:inline distT="0" distB="0" distL="0" distR="0" wp14:anchorId="6E733316" wp14:editId="4A85FFAB">
             <wp:extent cx="5731510" cy="1201420"/>
@@ -2163,16 +2083,14 @@
         </w:drawing>
       </w:r>
       <w:r>
-        <w:t xml:space="preserve">Graph for </w:t>
-      </w:r>
-      <w:proofErr w:type="spellStart"/>
-      <w:r>
-        <w:t>Vout</w:t>
-      </w:r>
-      <w:proofErr w:type="spellEnd"/>
-    </w:p>
-    <w:p>
-      <w:r>
+        <w:t>Graph for Vout</w:t>
+      </w:r>
+    </w:p>
+    <w:p>
+      <w:r>
+        <w:rPr>
+          <w:noProof/>
+        </w:rPr>
         <w:drawing>
           <wp:inline distT="0" distB="0" distL="0" distR="0" wp14:anchorId="5DD30A31" wp14:editId="284A7D48">
             <wp:extent cx="5731510" cy="1163320"/>
@@ -2215,6 +2133,9 @@
     </w:p>
     <w:p>
       <w:r>
+        <w:rPr>
+          <w:noProof/>
+        </w:rPr>
         <w:drawing>
           <wp:inline distT="0" distB="0" distL="0" distR="0" wp14:anchorId="7443DF03" wp14:editId="7357F622">
             <wp:extent cx="5731510" cy="1062990"/>
@@ -2252,18 +2173,10 @@
         </w:drawing>
       </w:r>
       <w:r>
-        <w:t xml:space="preserve">Graph for </w:t>
-      </w:r>
-      <w:proofErr w:type="spellStart"/>
-      <w:r>
-        <w:t>Vgate</w:t>
-      </w:r>
-      <w:r>
-        <w:t>When</w:t>
-      </w:r>
-      <w:proofErr w:type="spellEnd"/>
-      <w:r>
-        <w:t xml:space="preserve"> the gate goes high:</w:t>
+        <w:t>Graph for Vgate</w:t>
+      </w:r>
+      <w:r>
+        <w:t>When the gate goes high:</w:t>
       </w:r>
     </w:p>
     <w:p>
@@ -2341,15 +2254,7 @@
         </w:numPr>
       </w:pPr>
       <w:r>
-        <w:t xml:space="preserve">Migrated the boost converter simulation from PSpice to </w:t>
-      </w:r>
-      <w:proofErr w:type="spellStart"/>
-      <w:r>
-        <w:t>LTspice</w:t>
-      </w:r>
-      <w:proofErr w:type="spellEnd"/>
-      <w:r>
-        <w:t xml:space="preserve"> after encountering persistent simulation and component-model issues.</w:t>
+        <w:t>Migrated the boost converter simulation from PSpice to LTspice after encountering persistent simulation and component-model issues.</w:t>
       </w:r>
     </w:p>
     <w:p>
@@ -2360,15 +2265,7 @@
         </w:numPr>
       </w:pPr>
       <w:r>
-        <w:t xml:space="preserve">Recreated the converter schematic in </w:t>
-      </w:r>
-      <w:proofErr w:type="spellStart"/>
-      <w:r>
-        <w:t>LTspice</w:t>
-      </w:r>
-      <w:proofErr w:type="spellEnd"/>
-      <w:r>
-        <w:t xml:space="preserve"> using a real MOSFET model and Schottky diode.</w:t>
+        <w:t>Recreated the converter schematic in LTspice using a real MOSFET model and Schottky diode.</w:t>
       </w:r>
     </w:p>
     <w:p>
@@ -2379,15 +2276,7 @@
         </w:numPr>
       </w:pPr>
       <w:r>
-        <w:t xml:space="preserve">Debugged startup current </w:t>
-      </w:r>
-      <w:proofErr w:type="spellStart"/>
-      <w:r>
-        <w:t>behavior</w:t>
-      </w:r>
-      <w:proofErr w:type="spellEnd"/>
-      <w:r>
-        <w:t xml:space="preserve"> and investigated the effect of output capacitor size on transient response.</w:t>
+        <w:t>Debugged startup current behavior and investigated the effect of output capacitor size on transient response.</w:t>
       </w:r>
     </w:p>
     <w:p>
@@ -2409,15 +2298,7 @@
         </w:numPr>
       </w:pPr>
       <w:r>
-        <w:t xml:space="preserve">Confirmed that output voltage </w:t>
-      </w:r>
-      <w:proofErr w:type="spellStart"/>
-      <w:r>
-        <w:t>behavior</w:t>
-      </w:r>
-      <w:proofErr w:type="spellEnd"/>
-      <w:r>
-        <w:t xml:space="preserve"> changes appropriately with load resistance, indicating that the topology is functioning correctly.</w:t>
+        <w:t>Confirmed that output voltage behavior changes appropriately with load resistance, indicating that the topology is functioning correctly.</w:t>
       </w:r>
     </w:p>
     <w:p>
@@ -2428,15 +2309,7 @@
         </w:numPr>
       </w:pPr>
       <w:r>
-        <w:t xml:space="preserve">Saved the working </w:t>
-      </w:r>
-      <w:proofErr w:type="spellStart"/>
-      <w:r>
-        <w:t>LTspice</w:t>
-      </w:r>
-      <w:proofErr w:type="spellEnd"/>
-      <w:r>
-        <w:t xml:space="preserve"> design as the baseline version for future development.</w:t>
+        <w:t>Saved the working LTspice design as the baseline version for future development.</w:t>
       </w:r>
     </w:p>
     <w:p>
@@ -2445,15 +2318,7 @@
       </w:r>
       <w:r>
         <w:br/>
-        <w:t xml:space="preserve">Simulator problems can sometimes hide circuit </w:t>
-      </w:r>
-      <w:proofErr w:type="spellStart"/>
-      <w:r>
-        <w:t>behavior</w:t>
-      </w:r>
-      <w:proofErr w:type="spellEnd"/>
-      <w:r>
-        <w:t>. Rebuilding and validating the design in a different environment helped isolate the issue and confirm that the converter itself was working.</w:t>
+        <w:t>Simulator problems can sometimes hide circuit behavior. Rebuilding and validating the design in a different environment helped isolate the issue and confirm that the converter itself was working.</w:t>
       </w:r>
     </w:p>
     <w:p>
@@ -2493,6 +2358,1715 @@
       <w:r>
         <w:t>Later integrate the solar source, boost converter, and amplifier into a single system.</w:t>
       </w:r>
+    </w:p>
+    <w:p>
+      <w:r>
+        <w:t>DAY8</w:t>
+      </w:r>
+    </w:p>
+    <w:p>
+      <w:pPr>
+        <w:rPr>
+          <w:b/>
+          <w:bCs/>
+        </w:rPr>
+      </w:pPr>
+      <w:r>
+        <w:rPr>
+          <w:b/>
+          <w:bCs/>
+        </w:rPr>
+        <w:t xml:space="preserve">Day 8 </w:t>
+      </w:r>
+    </w:p>
+    <w:p>
+      <w:pPr>
+        <w:rPr>
+          <w:b/>
+          <w:bCs/>
+        </w:rPr>
+      </w:pPr>
+      <w:r>
+        <w:rPr>
+          <w:b/>
+          <w:bCs/>
+        </w:rPr>
+        <w:t>Objective</w:t>
+      </w:r>
+    </w:p>
+    <w:p>
+      <w:r>
+        <w:t>Today was focused on recreating the two-stage transistor amplifier in LTspice and obtaining a stable operating point before moving on to further performance analysis.</w:t>
+      </w:r>
+    </w:p>
+    <w:p>
+      <w:pPr>
+        <w:rPr>
+          <w:b/>
+          <w:bCs/>
+        </w:rPr>
+      </w:pPr>
+      <w:r>
+        <w:rPr>
+          <w:b/>
+          <w:bCs/>
+        </w:rPr>
+        <w:lastRenderedPageBreak/>
+        <w:t>Work Completed</w:t>
+      </w:r>
+    </w:p>
+    <w:p>
+      <w:pPr>
+        <w:rPr>
+          <w:b/>
+          <w:bCs/>
+        </w:rPr>
+      </w:pPr>
+      <w:r>
+        <w:rPr>
+          <w:b/>
+          <w:bCs/>
+        </w:rPr>
+        <w:t>1</w:t>
+      </w:r>
+      <w:r>
+        <w:rPr>
+          <w:b/>
+          <w:bCs/>
+        </w:rPr>
+        <w:t>. Initial Circuit Construction</w:t>
+      </w:r>
+    </w:p>
+    <w:p>
+      <w:r>
+        <w:t>The first version of the amplifier was assembled using:</w:t>
+      </w:r>
+    </w:p>
+    <w:p>
+      <w:pPr>
+        <w:numPr>
+          <w:ilvl w:val="0"/>
+          <w:numId w:val="11"/>
+        </w:numPr>
+      </w:pPr>
+      <w:r>
+        <w:t>Two 2N2222 BJTs</w:t>
+      </w:r>
+    </w:p>
+    <w:p>
+      <w:pPr>
+        <w:numPr>
+          <w:ilvl w:val="0"/>
+          <w:numId w:val="11"/>
+        </w:numPr>
+      </w:pPr>
+      <w:r>
+        <w:t>Biasing resistors</w:t>
+      </w:r>
+    </w:p>
+    <w:p>
+      <w:pPr>
+        <w:numPr>
+          <w:ilvl w:val="0"/>
+          <w:numId w:val="11"/>
+        </w:numPr>
+      </w:pPr>
+      <w:r>
+        <w:t>Coupling capacitors</w:t>
+      </w:r>
+    </w:p>
+    <w:p>
+      <w:pPr>
+        <w:numPr>
+          <w:ilvl w:val="0"/>
+          <w:numId w:val="11"/>
+        </w:numPr>
+      </w:pPr>
+      <w:r>
+        <w:t>Emitter bypass capacitor</w:t>
+      </w:r>
+    </w:p>
+    <w:p>
+      <w:pPr>
+        <w:numPr>
+          <w:ilvl w:val="0"/>
+          <w:numId w:val="11"/>
+        </w:numPr>
+      </w:pPr>
+      <w:r>
+        <w:t>12 V supply</w:t>
+      </w:r>
+    </w:p>
+    <w:p>
+      <w:pPr>
+        <w:numPr>
+          <w:ilvl w:val="0"/>
+          <w:numId w:val="11"/>
+        </w:numPr>
+      </w:pPr>
+      <w:r>
+        <w:t>8 Ω load</w:t>
+      </w:r>
+    </w:p>
+    <w:p>
+      <w:r>
+        <w:t>Initial operating point simulations showed almost zero currents and voltages throughout the circuit, indicating major biasing problems.</w:t>
+      </w:r>
+    </w:p>
+    <w:p>
+      <w:pPr>
+        <w:rPr>
+          <w:b/>
+          <w:bCs/>
+        </w:rPr>
+      </w:pPr>
+      <w:r>
+        <w:rPr>
+          <w:b/>
+          <w:bCs/>
+        </w:rPr>
+        <w:t>2</w:t>
+      </w:r>
+      <w:r>
+        <w:rPr>
+          <w:b/>
+          <w:bCs/>
+        </w:rPr>
+        <w:t>. Debugging Process</w:t>
+      </w:r>
+    </w:p>
+    <w:p>
+      <w:r>
+        <w:t>Several issues were identified and corrected:</w:t>
+      </w:r>
+    </w:p>
+    <w:p>
+      <w:pPr>
+        <w:numPr>
+          <w:ilvl w:val="0"/>
+          <w:numId w:val="12"/>
+        </w:numPr>
+      </w:pPr>
+      <w:r>
+        <w:t>Incorrect supply wiring</w:t>
+      </w:r>
+    </w:p>
+    <w:p>
+      <w:pPr>
+        <w:numPr>
+          <w:ilvl w:val="0"/>
+          <w:numId w:val="12"/>
+        </w:numPr>
+      </w:pPr>
+      <w:r>
+        <w:t>Floating transistor nodes</w:t>
+      </w:r>
+    </w:p>
+    <w:p>
+      <w:pPr>
+        <w:numPr>
+          <w:ilvl w:val="0"/>
+          <w:numId w:val="12"/>
+        </w:numPr>
+      </w:pPr>
+      <w:r>
+        <w:t>Missing DC bias path for the second transistor stage</w:t>
+      </w:r>
+    </w:p>
+    <w:p>
+      <w:pPr>
+        <w:numPr>
+          <w:ilvl w:val="0"/>
+          <w:numId w:val="12"/>
+        </w:numPr>
+      </w:pPr>
+      <w:r>
+        <w:t>Incorrect transistor operating regions</w:t>
+      </w:r>
+    </w:p>
+    <w:p>
+      <w:pPr>
+        <w:numPr>
+          <w:ilvl w:val="0"/>
+          <w:numId w:val="12"/>
+        </w:numPr>
+      </w:pPr>
+      <w:r>
+        <w:t>Excessively heavy output loading</w:t>
+      </w:r>
+    </w:p>
+    <w:p>
+      <w:r>
+        <w:t>The operating point was repeatedly checked after each modification.</w:t>
+      </w:r>
+    </w:p>
+    <w:p>
+      <w:pPr>
+        <w:rPr>
+          <w:b/>
+          <w:bCs/>
+        </w:rPr>
+      </w:pPr>
+      <w:r>
+        <w:rPr>
+          <w:b/>
+          <w:bCs/>
+        </w:rPr>
+        <w:t>3</w:t>
+      </w:r>
+      <w:r>
+        <w:rPr>
+          <w:b/>
+          <w:bCs/>
+        </w:rPr>
+        <w:t>. Q1 Amplifier Stage Verification</w:t>
+      </w:r>
+    </w:p>
+    <w:p>
+      <w:r>
+        <w:t>After correction:</w:t>
+      </w:r>
+    </w:p>
+    <w:p>
+      <w:pPr>
+        <w:numPr>
+          <w:ilvl w:val="0"/>
+          <w:numId w:val="13"/>
+        </w:numPr>
+      </w:pPr>
+      <w:r>
+        <w:t>Q1 base bias settled around 2.05 V</w:t>
+      </w:r>
+    </w:p>
+    <w:p>
+      <w:pPr>
+        <w:numPr>
+          <w:ilvl w:val="0"/>
+          <w:numId w:val="13"/>
+        </w:numPr>
+      </w:pPr>
+      <w:r>
+        <w:t>Q1 emitter settled around 1.39 V</w:t>
+      </w:r>
+    </w:p>
+    <w:p>
+      <w:pPr>
+        <w:numPr>
+          <w:ilvl w:val="0"/>
+          <w:numId w:val="13"/>
+        </w:numPr>
+      </w:pPr>
+      <w:r>
+        <w:t>Q1 collector settled around 5.51 V</w:t>
+      </w:r>
+    </w:p>
+    <w:p>
+      <w:r>
+        <w:t>This confirmed that the first transistor was operating in the active region and functioning as a voltage amplifier.</w:t>
+      </w:r>
+    </w:p>
+    <w:p>
+      <w:pPr>
+        <w:rPr>
+          <w:b/>
+          <w:bCs/>
+        </w:rPr>
+      </w:pPr>
+      <w:r>
+        <w:rPr>
+          <w:b/>
+          <w:bCs/>
+        </w:rPr>
+        <w:t>4</w:t>
+      </w:r>
+      <w:r>
+        <w:rPr>
+          <w:b/>
+          <w:bCs/>
+        </w:rPr>
+        <w:t>. Q2 Bias Network Development</w:t>
+      </w:r>
+    </w:p>
+    <w:p>
+      <w:r>
+        <w:t>A voltage divider was added:</w:t>
+      </w:r>
+    </w:p>
+    <w:p>
+      <w:pPr>
+        <w:numPr>
+          <w:ilvl w:val="0"/>
+          <w:numId w:val="14"/>
+        </w:numPr>
+      </w:pPr>
+      <w:r>
+        <w:t>R7 = 47 kΩ</w:t>
+      </w:r>
+    </w:p>
+    <w:p>
+      <w:pPr>
+        <w:numPr>
+          <w:ilvl w:val="0"/>
+          <w:numId w:val="14"/>
+        </w:numPr>
+      </w:pPr>
+      <w:r>
+        <w:lastRenderedPageBreak/>
+        <w:t>R8 = 10 kΩ</w:t>
+      </w:r>
+    </w:p>
+    <w:p>
+      <w:r>
+        <w:t>This provided a proper DC bias for the second transistor.</w:t>
+      </w:r>
+    </w:p>
+    <w:p>
+      <w:r>
+        <w:t>The second stage began conducting and producing output gain.</w:t>
+      </w:r>
+    </w:p>
+    <w:p>
+      <w:pPr>
+        <w:rPr>
+          <w:b/>
+          <w:bCs/>
+        </w:rPr>
+      </w:pPr>
+      <w:r>
+        <w:rPr>
+          <w:b/>
+          <w:bCs/>
+        </w:rPr>
+        <w:t>5</w:t>
+      </w:r>
+      <w:r>
+        <w:rPr>
+          <w:b/>
+          <w:bCs/>
+        </w:rPr>
+        <w:t>. Output Load Investigation</w:t>
+      </w:r>
+    </w:p>
+    <w:p>
+      <w:r>
+        <w:t>Using an 8 Ω load produced severe distortion and clipping because the 2N2222 could not supply the required output current.</w:t>
+      </w:r>
+    </w:p>
+    <w:p>
+      <w:r>
+        <w:t>The load was temporarily increased to:</w:t>
+      </w:r>
+    </w:p>
+    <w:p>
+      <w:pPr>
+        <w:numPr>
+          <w:ilvl w:val="0"/>
+          <w:numId w:val="15"/>
+        </w:numPr>
+      </w:pPr>
+      <w:r>
+        <w:t>100 Ω</w:t>
+      </w:r>
+    </w:p>
+    <w:p>
+      <w:pPr>
+        <w:numPr>
+          <w:ilvl w:val="0"/>
+          <w:numId w:val="15"/>
+        </w:numPr>
+      </w:pPr>
+      <w:r>
+        <w:t>1 kΩ</w:t>
+      </w:r>
+    </w:p>
+    <w:p>
+      <w:r>
+        <w:t>This demonstrated significantly cleaner waveforms and confirmed that the observed distortion was primarily due to loading effects.</w:t>
+      </w:r>
+    </w:p>
+    <w:p>
+      <w:pPr>
+        <w:rPr>
+          <w:b/>
+          <w:bCs/>
+        </w:rPr>
+      </w:pPr>
+      <w:r>
+        <w:rPr>
+          <w:b/>
+          <w:bCs/>
+        </w:rPr>
+        <w:t>6</w:t>
+      </w:r>
+      <w:r>
+        <w:rPr>
+          <w:b/>
+          <w:bCs/>
+        </w:rPr>
+        <w:t>. Waveform Analysis</w:t>
+      </w:r>
+    </w:p>
+    <w:p>
+      <w:r>
+        <w:t>Observed and analyzed:</w:t>
+      </w:r>
+    </w:p>
+    <w:p>
+      <w:pPr>
+        <w:numPr>
+          <w:ilvl w:val="0"/>
+          <w:numId w:val="16"/>
+        </w:numPr>
+      </w:pPr>
+      <w:r>
+        <w:t>Q1 collector waveform</w:t>
+      </w:r>
+    </w:p>
+    <w:p>
+      <w:pPr>
+        <w:numPr>
+          <w:ilvl w:val="0"/>
+          <w:numId w:val="16"/>
+        </w:numPr>
+      </w:pPr>
+      <w:r>
+        <w:t>Coupling capacitor current</w:t>
+      </w:r>
+    </w:p>
+    <w:p>
+      <w:pPr>
+        <w:numPr>
+          <w:ilvl w:val="0"/>
+          <w:numId w:val="16"/>
+        </w:numPr>
+      </w:pPr>
+      <w:r>
+        <w:t>Base node waveform</w:t>
+      </w:r>
+    </w:p>
+    <w:p>
+      <w:pPr>
+        <w:numPr>
+          <w:ilvl w:val="0"/>
+          <w:numId w:val="16"/>
+        </w:numPr>
+      </w:pPr>
+      <w:r>
+        <w:t>Output waveform</w:t>
+      </w:r>
+    </w:p>
+    <w:p>
+      <w:r>
+        <w:t>The final simulations showed:</w:t>
+      </w:r>
+    </w:p>
+    <w:p>
+      <w:pPr>
+        <w:numPr>
+          <w:ilvl w:val="0"/>
+          <w:numId w:val="17"/>
+        </w:numPr>
+      </w:pPr>
+      <w:r>
+        <w:t>Stable transistor biasing</w:t>
+      </w:r>
+    </w:p>
+    <w:p>
+      <w:pPr>
+        <w:numPr>
+          <w:ilvl w:val="0"/>
+          <w:numId w:val="17"/>
+        </w:numPr>
+      </w:pPr>
+      <w:r>
+        <w:t>Proper amplification</w:t>
+      </w:r>
+    </w:p>
+    <w:p>
+      <w:pPr>
+        <w:numPr>
+          <w:ilvl w:val="0"/>
+          <w:numId w:val="17"/>
+        </w:numPr>
+      </w:pPr>
+      <w:r>
+        <w:t>Reduced clipping</w:t>
+      </w:r>
+    </w:p>
+    <w:p>
+      <w:pPr>
+        <w:numPr>
+          <w:ilvl w:val="0"/>
+          <w:numId w:val="17"/>
+        </w:numPr>
+      </w:pPr>
+      <w:r>
+        <w:t>Much cleaner sinusoidal response</w:t>
+      </w:r>
+    </w:p>
+    <w:p>
+      <w:pPr>
+        <w:rPr>
+          <w:b/>
+          <w:bCs/>
+        </w:rPr>
+      </w:pPr>
+      <w:r>
+        <w:rPr>
+          <w:b/>
+          <w:bCs/>
+        </w:rPr>
+        <w:t>Key Lessons Learned</w:t>
+      </w:r>
+    </w:p>
+    <w:p>
+      <w:pPr>
+        <w:numPr>
+          <w:ilvl w:val="0"/>
+          <w:numId w:val="18"/>
+        </w:numPr>
+      </w:pPr>
+      <w:r>
+        <w:t>A transistor amplifier is extremely sensitive to DC biasing.</w:t>
+      </w:r>
+    </w:p>
+    <w:p>
+      <w:pPr>
+        <w:numPr>
+          <w:ilvl w:val="0"/>
+          <w:numId w:val="18"/>
+        </w:numPr>
+      </w:pPr>
+      <w:r>
+        <w:t>An operating point simulation should always be verified before running transient analysis.</w:t>
+      </w:r>
+    </w:p>
+    <w:p>
+      <w:pPr>
+        <w:numPr>
+          <w:ilvl w:val="0"/>
+          <w:numId w:val="18"/>
+        </w:numPr>
+      </w:pPr>
+      <w:r>
+        <w:t>Coupling capacitors block DC but do not create bias conditions.</w:t>
+      </w:r>
+    </w:p>
+    <w:p>
+      <w:pPr>
+        <w:numPr>
+          <w:ilvl w:val="0"/>
+          <w:numId w:val="18"/>
+        </w:numPr>
+      </w:pPr>
+      <w:r>
+        <w:t>Low-impedance loads dramatically increase current demand.</w:t>
+      </w:r>
+    </w:p>
+    <w:p>
+      <w:pPr>
+        <w:numPr>
+          <w:ilvl w:val="0"/>
+          <w:numId w:val="18"/>
+        </w:numPr>
+      </w:pPr>
+      <w:r>
+        <w:lastRenderedPageBreak/>
+        <w:t>A circuit that looks correct schematically may still be completely inactive due to incorrect bias conditions.</w:t>
+      </w:r>
+    </w:p>
+    <w:p>
+      <w:pPr>
+        <w:rPr>
+          <w:b/>
+          <w:bCs/>
+        </w:rPr>
+      </w:pPr>
+      <w:r>
+        <w:rPr>
+          <w:b/>
+          <w:bCs/>
+        </w:rPr>
+        <w:t>Status</w:t>
+      </w:r>
+    </w:p>
+    <w:p>
+      <w:r>
+        <w:t>Current state:</w:t>
+      </w:r>
+    </w:p>
+    <w:p>
+      <w:pPr>
+        <w:numPr>
+          <w:ilvl w:val="0"/>
+          <w:numId w:val="19"/>
+        </w:numPr>
+      </w:pPr>
+      <w:r>
+        <w:t>Q1 stage operational</w:t>
+      </w:r>
+    </w:p>
+    <w:p>
+      <w:pPr>
+        <w:numPr>
+          <w:ilvl w:val="0"/>
+          <w:numId w:val="19"/>
+        </w:numPr>
+      </w:pPr>
+      <w:r>
+        <w:t>Q2 stage operational</w:t>
+      </w:r>
+    </w:p>
+    <w:p>
+      <w:pPr>
+        <w:numPr>
+          <w:ilvl w:val="0"/>
+          <w:numId w:val="19"/>
+        </w:numPr>
+      </w:pPr>
+      <w:r>
+        <w:t>Amplifier producing amplified AC output</w:t>
+      </w:r>
+    </w:p>
+    <w:p>
+      <w:pPr>
+        <w:numPr>
+          <w:ilvl w:val="0"/>
+          <w:numId w:val="19"/>
+        </w:numPr>
+      </w:pPr>
+      <w:r>
+        <w:t>Further optimization required for low-impedance load driving</w:t>
+      </w:r>
+    </w:p>
+    <w:p>
+      <w:r>
+        <w:t>The amplifier is now functional and ready for gain measurements and frequency-response testing in future sessions.</w:t>
+      </w:r>
+    </w:p>
+    <w:p>
+      <w:r>
+        <w:t>GRAPHS</w:t>
+      </w:r>
+    </w:p>
+    <w:p>
+      <w:r>
+        <w:t>For Q1</w:t>
+      </w:r>
+    </w:p>
+    <w:p>
+      <w:r>
+        <w:t xml:space="preserve">Q1 Base ≈ 2.05 V </w:t>
+      </w:r>
+    </w:p>
+    <w:p>
+      <w:r>
+        <w:t xml:space="preserve">Q1 Emitter ≈ 1.39 V </w:t>
+      </w:r>
+    </w:p>
+    <w:p>
+      <w:r>
+        <w:t>Q1 Collector ≈ 5.51 V</w:t>
+      </w:r>
+      <w:r>
+        <w:drawing>
+          <wp:inline distT="0" distB="0" distL="0" distR="0" wp14:anchorId="74D3EB7D" wp14:editId="795F72B4">
+            <wp:extent cx="5731510" cy="1038225"/>
+            <wp:effectExtent l="0" t="0" r="2540" b="9525"/>
+            <wp:docPr id="167612210" name="Picture 1"/>
+            <wp:cNvGraphicFramePr>
+              <a:graphicFrameLocks xmlns:a="http://schemas.openxmlformats.org/drawingml/2006/main" noChangeAspect="1"/>
+            </wp:cNvGraphicFramePr>
+            <a:graphic xmlns:a="http://schemas.openxmlformats.org/drawingml/2006/main">
+              <a:graphicData uri="http://schemas.openxmlformats.org/drawingml/2006/picture">
+                <pic:pic xmlns:pic="http://schemas.openxmlformats.org/drawingml/2006/picture">
+                  <pic:nvPicPr>
+                    <pic:cNvPr id="167612210" name=""/>
+                    <pic:cNvPicPr/>
+                  </pic:nvPicPr>
+                  <pic:blipFill>
+                    <a:blip r:embed="rId28"/>
+                    <a:stretch>
+                      <a:fillRect/>
+                    </a:stretch>
+                  </pic:blipFill>
+                  <pic:spPr>
+                    <a:xfrm>
+                      <a:off x="0" y="0"/>
+                      <a:ext cx="5731510" cy="1038225"/>
+                    </a:xfrm>
+                    <a:prstGeom prst="rect">
+                      <a:avLst/>
+                    </a:prstGeom>
+                  </pic:spPr>
+                </pic:pic>
+              </a:graphicData>
+            </a:graphic>
+          </wp:inline>
+        </w:drawing>
+      </w:r>
+    </w:p>
+    <w:p>
+      <w:pPr>
+        <w:rPr>
+          <w:b/>
+          <w:bCs/>
+        </w:rPr>
+      </w:pPr>
+      <w:r>
+        <w:rPr>
+          <w:b/>
+          <w:bCs/>
+        </w:rPr>
+        <w:t xml:space="preserve">       --- Operating Point ---</w:t>
+      </w:r>
+    </w:p>
+    <w:p>
+      <w:pPr>
+        <w:rPr>
+          <w:b/>
+          <w:bCs/>
+        </w:rPr>
+      </w:pPr>
+    </w:p>
+    <w:p>
+      <w:pPr>
+        <w:rPr>
+          <w:b/>
+          <w:bCs/>
+        </w:rPr>
+      </w:pPr>
+      <w:r>
+        <w:rPr>
+          <w:b/>
+          <w:bCs/>
+        </w:rPr>
+        <w:t>V(n001):</w:t>
+      </w:r>
+      <w:r>
+        <w:rPr>
+          <w:b/>
+          <w:bCs/>
+        </w:rPr>
+        <w:tab/>
+        <w:t xml:space="preserve"> 12</w:t>
+      </w:r>
+      <w:r>
+        <w:rPr>
+          <w:b/>
+          <w:bCs/>
+        </w:rPr>
+        <w:tab/>
+        <w:t xml:space="preserve"> voltage</w:t>
+      </w:r>
+    </w:p>
+    <w:p>
+      <w:pPr>
+        <w:rPr>
+          <w:b/>
+          <w:bCs/>
+        </w:rPr>
+      </w:pPr>
+      <w:r>
+        <w:rPr>
+          <w:b/>
+          <w:bCs/>
+        </w:rPr>
+        <w:t>V(n002):</w:t>
+      </w:r>
+      <w:r>
+        <w:rPr>
+          <w:b/>
+          <w:bCs/>
+        </w:rPr>
+        <w:tab/>
+        <w:t xml:space="preserve"> 0</w:t>
+      </w:r>
+      <w:r>
+        <w:rPr>
+          <w:b/>
+          <w:bCs/>
+        </w:rPr>
+        <w:tab/>
+        <w:t xml:space="preserve"> voltage</w:t>
+      </w:r>
+    </w:p>
+    <w:p>
+      <w:pPr>
+        <w:rPr>
+          <w:b/>
+          <w:bCs/>
+        </w:rPr>
+      </w:pPr>
+      <w:r>
+        <w:rPr>
+          <w:b/>
+          <w:bCs/>
+        </w:rPr>
+        <w:t>V(n003):</w:t>
+      </w:r>
+      <w:r>
+        <w:rPr>
+          <w:b/>
+          <w:bCs/>
+        </w:rPr>
+        <w:tab/>
+        <w:t xml:space="preserve"> 2.05002</w:t>
+      </w:r>
+      <w:r>
+        <w:rPr>
+          <w:b/>
+          <w:bCs/>
+        </w:rPr>
+        <w:tab/>
+        <w:t xml:space="preserve"> voltage</w:t>
+      </w:r>
+    </w:p>
+    <w:p>
+      <w:pPr>
+        <w:rPr>
+          <w:b/>
+          <w:bCs/>
+        </w:rPr>
+      </w:pPr>
+      <w:r>
+        <w:rPr>
+          <w:b/>
+          <w:bCs/>
+        </w:rPr>
+        <w:t>V(n004):</w:t>
+      </w:r>
+      <w:r>
+        <w:rPr>
+          <w:b/>
+          <w:bCs/>
+        </w:rPr>
+        <w:tab/>
+        <w:t xml:space="preserve"> 5.51267</w:t>
+      </w:r>
+      <w:r>
+        <w:rPr>
+          <w:b/>
+          <w:bCs/>
+        </w:rPr>
+        <w:tab/>
+        <w:t xml:space="preserve"> voltage</w:t>
+      </w:r>
+    </w:p>
+    <w:p>
+      <w:pPr>
+        <w:rPr>
+          <w:b/>
+          <w:bCs/>
+        </w:rPr>
+      </w:pPr>
+      <w:r>
+        <w:rPr>
+          <w:b/>
+          <w:bCs/>
+        </w:rPr>
+        <w:t>V(n005):</w:t>
+      </w:r>
+      <w:r>
+        <w:rPr>
+          <w:b/>
+          <w:bCs/>
+        </w:rPr>
+        <w:tab/>
+        <w:t xml:space="preserve"> 1.72009</w:t>
+      </w:r>
+      <w:r>
+        <w:rPr>
+          <w:b/>
+          <w:bCs/>
+        </w:rPr>
+        <w:tab/>
+        <w:t xml:space="preserve"> voltage</w:t>
+      </w:r>
+    </w:p>
+    <w:p>
+      <w:pPr>
+        <w:rPr>
+          <w:b/>
+          <w:bCs/>
+        </w:rPr>
+      </w:pPr>
+      <w:r>
+        <w:rPr>
+          <w:b/>
+          <w:bCs/>
+        </w:rPr>
+        <w:t>V(n006):</w:t>
+      </w:r>
+      <w:r>
+        <w:rPr>
+          <w:b/>
+          <w:bCs/>
+        </w:rPr>
+        <w:tab/>
+        <w:t xml:space="preserve"> 1.0047</w:t>
+      </w:r>
+      <w:r>
+        <w:rPr>
+          <w:b/>
+          <w:bCs/>
+        </w:rPr>
+        <w:tab/>
+        <w:t xml:space="preserve"> voltage</w:t>
+      </w:r>
+    </w:p>
+    <w:p>
+      <w:pPr>
+        <w:rPr>
+          <w:b/>
+          <w:bCs/>
+        </w:rPr>
+      </w:pPr>
+      <w:r>
+        <w:rPr>
+          <w:b/>
+          <w:bCs/>
+        </w:rPr>
+        <w:t>V(n007):</w:t>
+      </w:r>
+      <w:r>
+        <w:rPr>
+          <w:b/>
+          <w:bCs/>
+        </w:rPr>
+        <w:tab/>
+        <w:t xml:space="preserve"> 1.38698</w:t>
+      </w:r>
+      <w:r>
+        <w:rPr>
+          <w:b/>
+          <w:bCs/>
+        </w:rPr>
+        <w:tab/>
+        <w:t xml:space="preserve"> voltage</w:t>
+      </w:r>
+    </w:p>
+    <w:p>
+      <w:pPr>
+        <w:rPr>
+          <w:b/>
+          <w:bCs/>
+        </w:rPr>
+      </w:pPr>
+      <w:r>
+        <w:rPr>
+          <w:b/>
+          <w:bCs/>
+        </w:rPr>
+        <w:t>V(n008):</w:t>
+      </w:r>
+      <w:r>
+        <w:rPr>
+          <w:b/>
+          <w:bCs/>
+        </w:rPr>
+        <w:tab/>
+        <w:t xml:space="preserve"> 1.0047e-13</w:t>
+      </w:r>
+      <w:r>
+        <w:rPr>
+          <w:b/>
+          <w:bCs/>
+        </w:rPr>
+        <w:tab/>
+        <w:t xml:space="preserve"> voltage</w:t>
+      </w:r>
+    </w:p>
+    <w:p>
+      <w:pPr>
+        <w:rPr>
+          <w:b/>
+          <w:bCs/>
+        </w:rPr>
+      </w:pPr>
+      <w:r>
+        <w:rPr>
+          <w:b/>
+          <w:bCs/>
+        </w:rPr>
+        <w:lastRenderedPageBreak/>
+        <w:t>I(C1):</w:t>
+      </w:r>
+      <w:r>
+        <w:rPr>
+          <w:b/>
+          <w:bCs/>
+        </w:rPr>
+        <w:tab/>
+        <w:t xml:space="preserve"> 2.05002e-17</w:t>
+      </w:r>
+      <w:r>
+        <w:rPr>
+          <w:b/>
+          <w:bCs/>
+        </w:rPr>
+        <w:tab/>
+        <w:t xml:space="preserve"> device_current</w:t>
+      </w:r>
+    </w:p>
+    <w:p>
+      <w:pPr>
+        <w:rPr>
+          <w:b/>
+          <w:bCs/>
+        </w:rPr>
+      </w:pPr>
+      <w:r>
+        <w:rPr>
+          <w:b/>
+          <w:bCs/>
+        </w:rPr>
+        <w:t>I(C2):</w:t>
+      </w:r>
+      <w:r>
+        <w:rPr>
+          <w:b/>
+          <w:bCs/>
+        </w:rPr>
+        <w:tab/>
+        <w:t xml:space="preserve"> -1.78251e-17</w:t>
+      </w:r>
+      <w:r>
+        <w:rPr>
+          <w:b/>
+          <w:bCs/>
+        </w:rPr>
+        <w:tab/>
+        <w:t xml:space="preserve"> device_current</w:t>
+      </w:r>
+    </w:p>
+    <w:p>
+      <w:pPr>
+        <w:rPr>
+          <w:b/>
+          <w:bCs/>
+        </w:rPr>
+      </w:pPr>
+      <w:r>
+        <w:rPr>
+          <w:b/>
+          <w:bCs/>
+        </w:rPr>
+        <w:t>I(C3):</w:t>
+      </w:r>
+      <w:r>
+        <w:rPr>
+          <w:b/>
+          <w:bCs/>
+        </w:rPr>
+        <w:tab/>
+        <w:t xml:space="preserve"> -1.0047e-16</w:t>
+      </w:r>
+      <w:r>
+        <w:rPr>
+          <w:b/>
+          <w:bCs/>
+        </w:rPr>
+        <w:tab/>
+        <w:t xml:space="preserve"> device_current</w:t>
+      </w:r>
+    </w:p>
+    <w:p>
+      <w:pPr>
+        <w:rPr>
+          <w:b/>
+          <w:bCs/>
+        </w:rPr>
+      </w:pPr>
+      <w:r>
+        <w:rPr>
+          <w:b/>
+          <w:bCs/>
+        </w:rPr>
+        <w:t>I(C4):</w:t>
+      </w:r>
+      <w:r>
+        <w:rPr>
+          <w:b/>
+          <w:bCs/>
+        </w:rPr>
+        <w:tab/>
+        <w:t xml:space="preserve"> 6.51882e-17</w:t>
+      </w:r>
+      <w:r>
+        <w:rPr>
+          <w:b/>
+          <w:bCs/>
+        </w:rPr>
+        <w:tab/>
+        <w:t xml:space="preserve"> device_current</w:t>
+      </w:r>
+    </w:p>
+    <w:p>
+      <w:pPr>
+        <w:rPr>
+          <w:b/>
+          <w:bCs/>
+        </w:rPr>
+      </w:pPr>
+      <w:r>
+        <w:rPr>
+          <w:b/>
+          <w:bCs/>
+        </w:rPr>
+        <w:t>I(R1):</w:t>
+      </w:r>
+      <w:r>
+        <w:rPr>
+          <w:b/>
+          <w:bCs/>
+        </w:rPr>
+        <w:tab/>
+        <w:t xml:space="preserve"> 0.000211702</w:t>
+      </w:r>
+      <w:r>
+        <w:rPr>
+          <w:b/>
+          <w:bCs/>
+        </w:rPr>
+        <w:tab/>
+        <w:t xml:space="preserve"> device_current</w:t>
+      </w:r>
+    </w:p>
+    <w:p>
+      <w:pPr>
+        <w:rPr>
+          <w:b/>
+          <w:bCs/>
+        </w:rPr>
+      </w:pPr>
+      <w:r>
+        <w:rPr>
+          <w:b/>
+          <w:bCs/>
+        </w:rPr>
+        <w:t>I(R2):</w:t>
+      </w:r>
+      <w:r>
+        <w:rPr>
+          <w:b/>
+          <w:bCs/>
+        </w:rPr>
+        <w:tab/>
+        <w:t xml:space="preserve"> 0.00138028</w:t>
+      </w:r>
+      <w:r>
+        <w:rPr>
+          <w:b/>
+          <w:bCs/>
+        </w:rPr>
+        <w:tab/>
+        <w:t xml:space="preserve"> device_current</w:t>
+      </w:r>
+    </w:p>
+    <w:p>
+      <w:pPr>
+        <w:rPr>
+          <w:b/>
+          <w:bCs/>
+        </w:rPr>
+      </w:pPr>
+      <w:r>
+        <w:rPr>
+          <w:b/>
+          <w:bCs/>
+        </w:rPr>
+        <w:t>I(R3):</w:t>
+      </w:r>
+      <w:r>
+        <w:rPr>
+          <w:b/>
+          <w:bCs/>
+        </w:rPr>
+        <w:tab/>
+        <w:t xml:space="preserve"> 0.000205002</w:t>
+      </w:r>
+      <w:r>
+        <w:rPr>
+          <w:b/>
+          <w:bCs/>
+        </w:rPr>
+        <w:tab/>
+        <w:t xml:space="preserve"> device_current</w:t>
+      </w:r>
+    </w:p>
+    <w:p>
+      <w:pPr>
+        <w:rPr>
+          <w:b/>
+          <w:bCs/>
+        </w:rPr>
+      </w:pPr>
+      <w:r>
+        <w:rPr>
+          <w:b/>
+          <w:bCs/>
+        </w:rPr>
+        <w:t>I(R4):</w:t>
+      </w:r>
+      <w:r>
+        <w:rPr>
+          <w:b/>
+          <w:bCs/>
+        </w:rPr>
+        <w:tab/>
+        <w:t xml:space="preserve"> 0.010047</w:t>
+      </w:r>
+      <w:r>
+        <w:rPr>
+          <w:b/>
+          <w:bCs/>
+        </w:rPr>
+        <w:tab/>
+        <w:t xml:space="preserve"> device_current</w:t>
+      </w:r>
+    </w:p>
+    <w:p>
+      <w:pPr>
+        <w:rPr>
+          <w:b/>
+          <w:bCs/>
+        </w:rPr>
+      </w:pPr>
+      <w:r>
+        <w:rPr>
+          <w:b/>
+          <w:bCs/>
+        </w:rPr>
+        <w:t>I(R5):</w:t>
+      </w:r>
+      <w:r>
+        <w:rPr>
+          <w:b/>
+          <w:bCs/>
+        </w:rPr>
+        <w:tab/>
+        <w:t xml:space="preserve"> 1.0047e-16</w:t>
+      </w:r>
+      <w:r>
+        <w:rPr>
+          <w:b/>
+          <w:bCs/>
+        </w:rPr>
+        <w:tab/>
+        <w:t xml:space="preserve"> device_current</w:t>
+      </w:r>
+    </w:p>
+    <w:p>
+      <w:pPr>
+        <w:rPr>
+          <w:b/>
+          <w:bCs/>
+        </w:rPr>
+      </w:pPr>
+      <w:r>
+        <w:rPr>
+          <w:b/>
+          <w:bCs/>
+        </w:rPr>
+        <w:t>I(R6):</w:t>
+      </w:r>
+      <w:r>
+        <w:rPr>
+          <w:b/>
+          <w:bCs/>
+        </w:rPr>
+        <w:tab/>
+        <w:t xml:space="preserve"> 0.00138698</w:t>
+      </w:r>
+      <w:r>
+        <w:rPr>
+          <w:b/>
+          <w:bCs/>
+        </w:rPr>
+        <w:tab/>
+        <w:t xml:space="preserve"> device_current</w:t>
+      </w:r>
+    </w:p>
+    <w:p>
+      <w:pPr>
+        <w:rPr>
+          <w:b/>
+          <w:bCs/>
+        </w:rPr>
+      </w:pPr>
+      <w:r>
+        <w:rPr>
+          <w:b/>
+          <w:bCs/>
+        </w:rPr>
+        <w:t>I(R7):</w:t>
+      </w:r>
+      <w:r>
+        <w:rPr>
+          <w:b/>
+          <w:bCs/>
+        </w:rPr>
+        <w:tab/>
+        <w:t xml:space="preserve"> 0.000218721</w:t>
+      </w:r>
+      <w:r>
+        <w:rPr>
+          <w:b/>
+          <w:bCs/>
+        </w:rPr>
+        <w:tab/>
+        <w:t xml:space="preserve"> device_current</w:t>
+      </w:r>
+    </w:p>
+    <w:p>
+      <w:pPr>
+        <w:rPr>
+          <w:b/>
+          <w:bCs/>
+        </w:rPr>
+      </w:pPr>
+      <w:r>
+        <w:rPr>
+          <w:b/>
+          <w:bCs/>
+        </w:rPr>
+        <w:t>I(R8):</w:t>
+      </w:r>
+      <w:r>
+        <w:rPr>
+          <w:b/>
+          <w:bCs/>
+        </w:rPr>
+        <w:tab/>
+        <w:t xml:space="preserve"> 0.000172009</w:t>
+      </w:r>
+      <w:r>
+        <w:rPr>
+          <w:b/>
+          <w:bCs/>
+        </w:rPr>
+        <w:tab/>
+        <w:t xml:space="preserve"> device_current</w:t>
+      </w:r>
+    </w:p>
+    <w:p>
+      <w:pPr>
+        <w:rPr>
+          <w:b/>
+          <w:bCs/>
+        </w:rPr>
+      </w:pPr>
+      <w:r>
+        <w:rPr>
+          <w:b/>
+          <w:bCs/>
+        </w:rPr>
+        <w:t>I(V1):</w:t>
+      </w:r>
+      <w:r>
+        <w:rPr>
+          <w:b/>
+          <w:bCs/>
+        </w:rPr>
+        <w:tab/>
+        <w:t xml:space="preserve"> 2.05002e-17</w:t>
+      </w:r>
+      <w:r>
+        <w:rPr>
+          <w:b/>
+          <w:bCs/>
+        </w:rPr>
+        <w:tab/>
+        <w:t xml:space="preserve"> device_current</w:t>
+      </w:r>
+    </w:p>
+    <w:p>
+      <w:pPr>
+        <w:rPr>
+          <w:b/>
+          <w:bCs/>
+        </w:rPr>
+      </w:pPr>
+      <w:r>
+        <w:rPr>
+          <w:b/>
+          <w:bCs/>
+        </w:rPr>
+        <w:t>I(V2):</w:t>
+      </w:r>
+      <w:r>
+        <w:rPr>
+          <w:b/>
+          <w:bCs/>
+        </w:rPr>
+        <w:tab/>
+        <w:t xml:space="preserve"> -0.011811</w:t>
+      </w:r>
+      <w:r>
+        <w:rPr>
+          <w:b/>
+          <w:bCs/>
+        </w:rPr>
+        <w:tab/>
+        <w:t xml:space="preserve"> device_current</w:t>
+      </w:r>
+    </w:p>
+    <w:p>
+      <w:pPr>
+        <w:rPr>
+          <w:b/>
+          <w:bCs/>
+        </w:rPr>
+      </w:pPr>
+      <w:r>
+        <w:rPr>
+          <w:b/>
+          <w:bCs/>
+        </w:rPr>
+        <w:t>Ib(Q1):</w:t>
+      </w:r>
+      <w:r>
+        <w:rPr>
+          <w:b/>
+          <w:bCs/>
+        </w:rPr>
+        <w:tab/>
+        <w:t xml:space="preserve"> 6.70012e-06</w:t>
+      </w:r>
+      <w:r>
+        <w:rPr>
+          <w:b/>
+          <w:bCs/>
+        </w:rPr>
+        <w:tab/>
+        <w:t xml:space="preserve"> device_current</w:t>
+      </w:r>
+    </w:p>
+    <w:p>
+      <w:pPr>
+        <w:rPr>
+          <w:b/>
+          <w:bCs/>
+        </w:rPr>
+      </w:pPr>
+      <w:r>
+        <w:rPr>
+          <w:b/>
+          <w:bCs/>
+        </w:rPr>
+        <w:t>Ib(Q2):</w:t>
+      </w:r>
+      <w:r>
+        <w:rPr>
+          <w:b/>
+          <w:bCs/>
+        </w:rPr>
+        <w:tab/>
+        <w:t xml:space="preserve"> 4.67121e-05</w:t>
+      </w:r>
+      <w:r>
+        <w:rPr>
+          <w:b/>
+          <w:bCs/>
+        </w:rPr>
+        <w:tab/>
+        <w:t xml:space="preserve"> device_current</w:t>
+      </w:r>
+    </w:p>
+    <w:p>
+      <w:pPr>
+        <w:rPr>
+          <w:b/>
+          <w:bCs/>
+        </w:rPr>
+      </w:pPr>
+      <w:r>
+        <w:rPr>
+          <w:b/>
+          <w:bCs/>
+        </w:rPr>
+        <w:t>Ic(Q1):</w:t>
+      </w:r>
+      <w:r>
+        <w:rPr>
+          <w:b/>
+          <w:bCs/>
+        </w:rPr>
+        <w:tab/>
+        <w:t xml:space="preserve"> 0.00138028</w:t>
+      </w:r>
+      <w:r>
+        <w:rPr>
+          <w:b/>
+          <w:bCs/>
+        </w:rPr>
+        <w:tab/>
+        <w:t xml:space="preserve"> device_current</w:t>
+      </w:r>
+    </w:p>
+    <w:p>
+      <w:pPr>
+        <w:rPr>
+          <w:b/>
+          <w:bCs/>
+        </w:rPr>
+      </w:pPr>
+      <w:r>
+        <w:rPr>
+          <w:b/>
+          <w:bCs/>
+        </w:rPr>
+        <w:t>Ic(Q2):</w:t>
+      </w:r>
+      <w:r>
+        <w:rPr>
+          <w:b/>
+          <w:bCs/>
+        </w:rPr>
+        <w:tab/>
+        <w:t xml:space="preserve"> 0.0100003</w:t>
+      </w:r>
+      <w:r>
+        <w:rPr>
+          <w:b/>
+          <w:bCs/>
+        </w:rPr>
+        <w:tab/>
+        <w:t xml:space="preserve"> device_current</w:t>
+      </w:r>
+    </w:p>
+    <w:p>
+      <w:pPr>
+        <w:rPr>
+          <w:b/>
+          <w:bCs/>
+        </w:rPr>
+      </w:pPr>
+      <w:r>
+        <w:rPr>
+          <w:b/>
+          <w:bCs/>
+        </w:rPr>
+        <w:t>Ie(Q1):</w:t>
+      </w:r>
+      <w:r>
+        <w:rPr>
+          <w:b/>
+          <w:bCs/>
+        </w:rPr>
+        <w:tab/>
+        <w:t xml:space="preserve"> -0.00138698</w:t>
+      </w:r>
+      <w:r>
+        <w:rPr>
+          <w:b/>
+          <w:bCs/>
+        </w:rPr>
+        <w:tab/>
+        <w:t xml:space="preserve"> device_current</w:t>
+      </w:r>
+    </w:p>
+    <w:p>
+      <w:pPr>
+        <w:rPr>
+          <w:b/>
+          <w:bCs/>
+        </w:rPr>
+      </w:pPr>
+      <w:r>
+        <w:rPr>
+          <w:b/>
+          <w:bCs/>
+        </w:rPr>
+        <w:t>Ie(Q2):</w:t>
+      </w:r>
+      <w:r>
+        <w:rPr>
+          <w:b/>
+          <w:bCs/>
+        </w:rPr>
+        <w:tab/>
+        <w:t xml:space="preserve"> -0.010047</w:t>
+      </w:r>
+      <w:r>
+        <w:rPr>
+          <w:b/>
+          <w:bCs/>
+        </w:rPr>
+        <w:tab/>
+        <w:t xml:space="preserve"> device_current</w:t>
+      </w:r>
+    </w:p>
+    <w:p>
+      <w:pPr>
+        <w:rPr>
+          <w:b/>
+          <w:bCs/>
+        </w:rPr>
+      </w:pPr>
+      <w:r>
+        <w:rPr>
+          <w:b/>
+          <w:bCs/>
+        </w:rPr>
+        <w:t>Is(Q1):</w:t>
+      </w:r>
+      <w:r>
+        <w:rPr>
+          <w:b/>
+          <w:bCs/>
+        </w:rPr>
+        <w:tab/>
+        <w:t xml:space="preserve"> 0</w:t>
+      </w:r>
+      <w:r>
+        <w:rPr>
+          <w:b/>
+          <w:bCs/>
+        </w:rPr>
+        <w:tab/>
+        <w:t xml:space="preserve"> device_current</w:t>
+      </w:r>
+    </w:p>
+    <w:p>
+      <w:pPr>
+        <w:rPr>
+          <w:b/>
+          <w:bCs/>
+        </w:rPr>
+      </w:pPr>
+      <w:r>
+        <w:rPr>
+          <w:b/>
+          <w:bCs/>
+        </w:rPr>
+        <w:t>Is(Q2):</w:t>
+      </w:r>
+      <w:r>
+        <w:rPr>
+          <w:b/>
+          <w:bCs/>
+        </w:rPr>
+        <w:tab/>
+        <w:t xml:space="preserve"> 0</w:t>
+      </w:r>
+      <w:r>
+        <w:rPr>
+          <w:b/>
+          <w:bCs/>
+        </w:rPr>
+        <w:tab/>
+        <w:t xml:space="preserve"> device_current</w:t>
+      </w:r>
+    </w:p>
+    <w:p>
+      <w:pPr>
+        <w:rPr>
+          <w:b/>
+          <w:bCs/>
+        </w:rPr>
+      </w:pPr>
     </w:p>
     <w:p/>
     <w:sectPr>
@@ -2508,6 +4082,155 @@
 <file path=word/numbering.xml><?xml version="1.0" encoding="utf-8"?>
 <w:numbering xmlns:wpc="http://schemas.microsoft.com/office/word/2010/wordprocessingCanvas" xmlns:cx="http://schemas.microsoft.com/office/drawing/2014/chartex" xmlns:cx1="http://schemas.microsoft.com/office/drawing/2015/9/8/chartex" xmlns:cx2="http://schemas.microsoft.com/office/drawing/2015/10/21/chartex" xmlns:cx3="http://schemas.microsoft.com/office/drawing/2016/5/9/chartex" xmlns:cx4="http://schemas.microsoft.com/office/drawing/2016/5/10/chartex" xmlns:cx5="http://schemas.microsoft.com/office/drawing/2016/5/11/chartex" xmlns:cx6="http://schemas.microsoft.com/office/drawing/2016/5/12/chartex" xmlns:cx7="http://schemas.microsoft.com/office/drawing/2016/5/13/chartex" xmlns:cx8="http://schemas.microsoft.com/office/drawing/2016/5/14/chartex" xmlns:mc="http://schemas.openxmlformats.org/markup-compatibility/2006" xmlns:aink="http://schemas.microsoft.com/office/drawing/2016/ink" xmlns:am3d="http://schemas.microsoft.com/office/drawing/2017/model3d" xmlns:o="urn:schemas-microsoft-com:office:office" xmlns:oel="http://schemas.microsoft.com/office/2019/extlst" xmlns:r="http://schemas.openxmlformats.org/officeDocument/2006/relationships" xmlns:m="http://schemas.openxmlformats.org/officeDocument/2006/math" xmlns:v="urn:schemas-microsoft-com:vml" xmlns:wp14="http://schemas.microsoft.com/office/word/2010/wordprocessingDrawing" xmlns:wp="http://schemas.openxmlformats.org/drawingml/2006/wordprocessingDrawing" xmlns:w10="urn:schemas-microsoft-com:office:word" xmlns:w="http://schemas.openxmlformats.org/wordprocessingml/2006/main" xmlns:w14="http://schemas.microsoft.com/office/word/2010/wordml" xmlns:w15="http://schemas.microsoft.com/office/word/2012/wordml" xmlns:w16cex="http://schemas.microsoft.com/office/word/2018/wordml/cex" xmlns:w16cid="http://schemas.microsoft.com/office/word/2016/wordml/cid" xmlns:w16="http://schemas.microsoft.com/office/word/2018/wordml" xmlns:w16du="http://schemas.microsoft.com/office/word/2023/wordml/word16du" xmlns:w16sdtdh="http://schemas.microsoft.com/office/word/2020/wordml/sdtdatahash" xmlns:w16sdtfl="http://schemas.microsoft.com/office/word/2024/wordml/sdtformatlock" xmlns:w16se="http://schemas.microsoft.com/office/word/2015/wordml/symex" xmlns:wpg="http://schemas.microsoft.com/office/word/2010/wordprocessingGroup" xmlns:wpi="http://schemas.microsoft.com/office/word/2010/wordprocessingInk" xmlns:wne="http://schemas.microsoft.com/office/word/2006/wordml" xmlns:wps="http://schemas.microsoft.com/office/word/2010/wordprocessingShape" mc:Ignorable="w14 w15 w16se w16cid w16 w16cex w16sdtdh w16sdtfl w16du wp14">
   <w:abstractNum w:abstractNumId="0" w15:restartNumberingAfterBreak="0">
+    <w:nsid w:val="03916DCB"/>
+    <w:multiLevelType w:val="multilevel"/>
+    <w:tmpl w:val="B330C9E2"/>
+    <w:lvl w:ilvl="0">
+      <w:start w:val="1"/>
+      <w:numFmt w:val="bullet"/>
+      <w:lvlText w:val=""/>
+      <w:lvlJc w:val="left"/>
+      <w:pPr>
+        <w:tabs>
+          <w:tab w:val="num" w:pos="720"/>
+        </w:tabs>
+        <w:ind w:left="720" w:hanging="360"/>
+      </w:pPr>
+      <w:rPr>
+        <w:rFonts w:ascii="Symbol" w:hAnsi="Symbol" w:hint="default"/>
+        <w:sz w:val="20"/>
+      </w:rPr>
+    </w:lvl>
+    <w:lvl w:ilvl="1" w:tentative="1">
+      <w:start w:val="1"/>
+      <w:numFmt w:val="bullet"/>
+      <w:lvlText w:val="o"/>
+      <w:lvlJc w:val="left"/>
+      <w:pPr>
+        <w:tabs>
+          <w:tab w:val="num" w:pos="1440"/>
+        </w:tabs>
+        <w:ind w:left="1440" w:hanging="360"/>
+      </w:pPr>
+      <w:rPr>
+        <w:rFonts w:ascii="Courier New" w:hAnsi="Courier New" w:hint="default"/>
+        <w:sz w:val="20"/>
+      </w:rPr>
+    </w:lvl>
+    <w:lvl w:ilvl="2" w:tentative="1">
+      <w:start w:val="1"/>
+      <w:numFmt w:val="bullet"/>
+      <w:lvlText w:val=""/>
+      <w:lvlJc w:val="left"/>
+      <w:pPr>
+        <w:tabs>
+          <w:tab w:val="num" w:pos="2160"/>
+        </w:tabs>
+        <w:ind w:left="2160" w:hanging="360"/>
+      </w:pPr>
+      <w:rPr>
+        <w:rFonts w:ascii="Wingdings" w:hAnsi="Wingdings" w:hint="default"/>
+        <w:sz w:val="20"/>
+      </w:rPr>
+    </w:lvl>
+    <w:lvl w:ilvl="3" w:tentative="1">
+      <w:start w:val="1"/>
+      <w:numFmt w:val="bullet"/>
+      <w:lvlText w:val=""/>
+      <w:lvlJc w:val="left"/>
+      <w:pPr>
+        <w:tabs>
+          <w:tab w:val="num" w:pos="2880"/>
+        </w:tabs>
+        <w:ind w:left="2880" w:hanging="360"/>
+      </w:pPr>
+      <w:rPr>
+        <w:rFonts w:ascii="Wingdings" w:hAnsi="Wingdings" w:hint="default"/>
+        <w:sz w:val="20"/>
+      </w:rPr>
+    </w:lvl>
+    <w:lvl w:ilvl="4" w:tentative="1">
+      <w:start w:val="1"/>
+      <w:numFmt w:val="bullet"/>
+      <w:lvlText w:val=""/>
+      <w:lvlJc w:val="left"/>
+      <w:pPr>
+        <w:tabs>
+          <w:tab w:val="num" w:pos="3600"/>
+        </w:tabs>
+        <w:ind w:left="3600" w:hanging="360"/>
+      </w:pPr>
+      <w:rPr>
+        <w:rFonts w:ascii="Wingdings" w:hAnsi="Wingdings" w:hint="default"/>
+        <w:sz w:val="20"/>
+      </w:rPr>
+    </w:lvl>
+    <w:lvl w:ilvl="5" w:tentative="1">
+      <w:start w:val="1"/>
+      <w:numFmt w:val="bullet"/>
+      <w:lvlText w:val=""/>
+      <w:lvlJc w:val="left"/>
+      <w:pPr>
+        <w:tabs>
+          <w:tab w:val="num" w:pos="4320"/>
+        </w:tabs>
+        <w:ind w:left="4320" w:hanging="360"/>
+      </w:pPr>
+      <w:rPr>
+        <w:rFonts w:ascii="Wingdings" w:hAnsi="Wingdings" w:hint="default"/>
+        <w:sz w:val="20"/>
+      </w:rPr>
+    </w:lvl>
+    <w:lvl w:ilvl="6" w:tentative="1">
+      <w:start w:val="1"/>
+      <w:numFmt w:val="bullet"/>
+      <w:lvlText w:val=""/>
+      <w:lvlJc w:val="left"/>
+      <w:pPr>
+        <w:tabs>
+          <w:tab w:val="num" w:pos="5040"/>
+        </w:tabs>
+        <w:ind w:left="5040" w:hanging="360"/>
+      </w:pPr>
+      <w:rPr>
+        <w:rFonts w:ascii="Wingdings" w:hAnsi="Wingdings" w:hint="default"/>
+        <w:sz w:val="20"/>
+      </w:rPr>
+    </w:lvl>
+    <w:lvl w:ilvl="7" w:tentative="1">
+      <w:start w:val="1"/>
+      <w:numFmt w:val="bullet"/>
+      <w:lvlText w:val=""/>
+      <w:lvlJc w:val="left"/>
+      <w:pPr>
+        <w:tabs>
+          <w:tab w:val="num" w:pos="5760"/>
+        </w:tabs>
+        <w:ind w:left="5760" w:hanging="360"/>
+      </w:pPr>
+      <w:rPr>
+        <w:rFonts w:ascii="Wingdings" w:hAnsi="Wingdings" w:hint="default"/>
+        <w:sz w:val="20"/>
+      </w:rPr>
+    </w:lvl>
+    <w:lvl w:ilvl="8" w:tentative="1">
+      <w:start w:val="1"/>
+      <w:numFmt w:val="bullet"/>
+      <w:lvlText w:val=""/>
+      <w:lvlJc w:val="left"/>
+      <w:pPr>
+        <w:tabs>
+          <w:tab w:val="num" w:pos="6480"/>
+        </w:tabs>
+        <w:ind w:left="6480" w:hanging="360"/>
+      </w:pPr>
+      <w:rPr>
+        <w:rFonts w:ascii="Wingdings" w:hAnsi="Wingdings" w:hint="default"/>
+        <w:sz w:val="20"/>
+      </w:rPr>
+    </w:lvl>
+  </w:abstractNum>
+  <w:abstractNum w:abstractNumId="1" w15:restartNumberingAfterBreak="0">
     <w:nsid w:val="16712CF6"/>
     <w:multiLevelType w:val="multilevel"/>
     <w:tmpl w:val="12DE2564"/>
@@ -2656,7 +4379,7 @@
       </w:rPr>
     </w:lvl>
   </w:abstractNum>
-  <w:abstractNum w:abstractNumId="1" w15:restartNumberingAfterBreak="0">
+  <w:abstractNum w:abstractNumId="2" w15:restartNumberingAfterBreak="0">
     <w:nsid w:val="211E4489"/>
     <w:multiLevelType w:val="multilevel"/>
     <w:tmpl w:val="01580EFC"/>
@@ -2805,7 +4528,305 @@
       </w:rPr>
     </w:lvl>
   </w:abstractNum>
-  <w:abstractNum w:abstractNumId="2" w15:restartNumberingAfterBreak="0">
+  <w:abstractNum w:abstractNumId="3" w15:restartNumberingAfterBreak="0">
+    <w:nsid w:val="22D2004D"/>
+    <w:multiLevelType w:val="multilevel"/>
+    <w:tmpl w:val="85A2010E"/>
+    <w:lvl w:ilvl="0">
+      <w:start w:val="1"/>
+      <w:numFmt w:val="bullet"/>
+      <w:lvlText w:val=""/>
+      <w:lvlJc w:val="left"/>
+      <w:pPr>
+        <w:tabs>
+          <w:tab w:val="num" w:pos="720"/>
+        </w:tabs>
+        <w:ind w:left="720" w:hanging="360"/>
+      </w:pPr>
+      <w:rPr>
+        <w:rFonts w:ascii="Symbol" w:hAnsi="Symbol" w:hint="default"/>
+        <w:sz w:val="20"/>
+      </w:rPr>
+    </w:lvl>
+    <w:lvl w:ilvl="1" w:tentative="1">
+      <w:start w:val="1"/>
+      <w:numFmt w:val="bullet"/>
+      <w:lvlText w:val="o"/>
+      <w:lvlJc w:val="left"/>
+      <w:pPr>
+        <w:tabs>
+          <w:tab w:val="num" w:pos="1440"/>
+        </w:tabs>
+        <w:ind w:left="1440" w:hanging="360"/>
+      </w:pPr>
+      <w:rPr>
+        <w:rFonts w:ascii="Courier New" w:hAnsi="Courier New" w:hint="default"/>
+        <w:sz w:val="20"/>
+      </w:rPr>
+    </w:lvl>
+    <w:lvl w:ilvl="2" w:tentative="1">
+      <w:start w:val="1"/>
+      <w:numFmt w:val="bullet"/>
+      <w:lvlText w:val=""/>
+      <w:lvlJc w:val="left"/>
+      <w:pPr>
+        <w:tabs>
+          <w:tab w:val="num" w:pos="2160"/>
+        </w:tabs>
+        <w:ind w:left="2160" w:hanging="360"/>
+      </w:pPr>
+      <w:rPr>
+        <w:rFonts w:ascii="Wingdings" w:hAnsi="Wingdings" w:hint="default"/>
+        <w:sz w:val="20"/>
+      </w:rPr>
+    </w:lvl>
+    <w:lvl w:ilvl="3" w:tentative="1">
+      <w:start w:val="1"/>
+      <w:numFmt w:val="bullet"/>
+      <w:lvlText w:val=""/>
+      <w:lvlJc w:val="left"/>
+      <w:pPr>
+        <w:tabs>
+          <w:tab w:val="num" w:pos="2880"/>
+        </w:tabs>
+        <w:ind w:left="2880" w:hanging="360"/>
+      </w:pPr>
+      <w:rPr>
+        <w:rFonts w:ascii="Wingdings" w:hAnsi="Wingdings" w:hint="default"/>
+        <w:sz w:val="20"/>
+      </w:rPr>
+    </w:lvl>
+    <w:lvl w:ilvl="4" w:tentative="1">
+      <w:start w:val="1"/>
+      <w:numFmt w:val="bullet"/>
+      <w:lvlText w:val=""/>
+      <w:lvlJc w:val="left"/>
+      <w:pPr>
+        <w:tabs>
+          <w:tab w:val="num" w:pos="3600"/>
+        </w:tabs>
+        <w:ind w:left="3600" w:hanging="360"/>
+      </w:pPr>
+      <w:rPr>
+        <w:rFonts w:ascii="Wingdings" w:hAnsi="Wingdings" w:hint="default"/>
+        <w:sz w:val="20"/>
+      </w:rPr>
+    </w:lvl>
+    <w:lvl w:ilvl="5" w:tentative="1">
+      <w:start w:val="1"/>
+      <w:numFmt w:val="bullet"/>
+      <w:lvlText w:val=""/>
+      <w:lvlJc w:val="left"/>
+      <w:pPr>
+        <w:tabs>
+          <w:tab w:val="num" w:pos="4320"/>
+        </w:tabs>
+        <w:ind w:left="4320" w:hanging="360"/>
+      </w:pPr>
+      <w:rPr>
+        <w:rFonts w:ascii="Wingdings" w:hAnsi="Wingdings" w:hint="default"/>
+        <w:sz w:val="20"/>
+      </w:rPr>
+    </w:lvl>
+    <w:lvl w:ilvl="6" w:tentative="1">
+      <w:start w:val="1"/>
+      <w:numFmt w:val="bullet"/>
+      <w:lvlText w:val=""/>
+      <w:lvlJc w:val="left"/>
+      <w:pPr>
+        <w:tabs>
+          <w:tab w:val="num" w:pos="5040"/>
+        </w:tabs>
+        <w:ind w:left="5040" w:hanging="360"/>
+      </w:pPr>
+      <w:rPr>
+        <w:rFonts w:ascii="Wingdings" w:hAnsi="Wingdings" w:hint="default"/>
+        <w:sz w:val="20"/>
+      </w:rPr>
+    </w:lvl>
+    <w:lvl w:ilvl="7" w:tentative="1">
+      <w:start w:val="1"/>
+      <w:numFmt w:val="bullet"/>
+      <w:lvlText w:val=""/>
+      <w:lvlJc w:val="left"/>
+      <w:pPr>
+        <w:tabs>
+          <w:tab w:val="num" w:pos="5760"/>
+        </w:tabs>
+        <w:ind w:left="5760" w:hanging="360"/>
+      </w:pPr>
+      <w:rPr>
+        <w:rFonts w:ascii="Wingdings" w:hAnsi="Wingdings" w:hint="default"/>
+        <w:sz w:val="20"/>
+      </w:rPr>
+    </w:lvl>
+    <w:lvl w:ilvl="8" w:tentative="1">
+      <w:start w:val="1"/>
+      <w:numFmt w:val="bullet"/>
+      <w:lvlText w:val=""/>
+      <w:lvlJc w:val="left"/>
+      <w:pPr>
+        <w:tabs>
+          <w:tab w:val="num" w:pos="6480"/>
+        </w:tabs>
+        <w:ind w:left="6480" w:hanging="360"/>
+      </w:pPr>
+      <w:rPr>
+        <w:rFonts w:ascii="Wingdings" w:hAnsi="Wingdings" w:hint="default"/>
+        <w:sz w:val="20"/>
+      </w:rPr>
+    </w:lvl>
+  </w:abstractNum>
+  <w:abstractNum w:abstractNumId="4" w15:restartNumberingAfterBreak="0">
+    <w:nsid w:val="2D7E087A"/>
+    <w:multiLevelType w:val="multilevel"/>
+    <w:tmpl w:val="BC2A4D10"/>
+    <w:lvl w:ilvl="0">
+      <w:start w:val="1"/>
+      <w:numFmt w:val="bullet"/>
+      <w:lvlText w:val=""/>
+      <w:lvlJc w:val="left"/>
+      <w:pPr>
+        <w:tabs>
+          <w:tab w:val="num" w:pos="720"/>
+        </w:tabs>
+        <w:ind w:left="720" w:hanging="360"/>
+      </w:pPr>
+      <w:rPr>
+        <w:rFonts w:ascii="Symbol" w:hAnsi="Symbol" w:hint="default"/>
+        <w:sz w:val="20"/>
+      </w:rPr>
+    </w:lvl>
+    <w:lvl w:ilvl="1" w:tentative="1">
+      <w:start w:val="1"/>
+      <w:numFmt w:val="bullet"/>
+      <w:lvlText w:val="o"/>
+      <w:lvlJc w:val="left"/>
+      <w:pPr>
+        <w:tabs>
+          <w:tab w:val="num" w:pos="1440"/>
+        </w:tabs>
+        <w:ind w:left="1440" w:hanging="360"/>
+      </w:pPr>
+      <w:rPr>
+        <w:rFonts w:ascii="Courier New" w:hAnsi="Courier New" w:hint="default"/>
+        <w:sz w:val="20"/>
+      </w:rPr>
+    </w:lvl>
+    <w:lvl w:ilvl="2" w:tentative="1">
+      <w:start w:val="1"/>
+      <w:numFmt w:val="bullet"/>
+      <w:lvlText w:val=""/>
+      <w:lvlJc w:val="left"/>
+      <w:pPr>
+        <w:tabs>
+          <w:tab w:val="num" w:pos="2160"/>
+        </w:tabs>
+        <w:ind w:left="2160" w:hanging="360"/>
+      </w:pPr>
+      <w:rPr>
+        <w:rFonts w:ascii="Wingdings" w:hAnsi="Wingdings" w:hint="default"/>
+        <w:sz w:val="20"/>
+      </w:rPr>
+    </w:lvl>
+    <w:lvl w:ilvl="3" w:tentative="1">
+      <w:start w:val="1"/>
+      <w:numFmt w:val="bullet"/>
+      <w:lvlText w:val=""/>
+      <w:lvlJc w:val="left"/>
+      <w:pPr>
+        <w:tabs>
+          <w:tab w:val="num" w:pos="2880"/>
+        </w:tabs>
+        <w:ind w:left="2880" w:hanging="360"/>
+      </w:pPr>
+      <w:rPr>
+        <w:rFonts w:ascii="Wingdings" w:hAnsi="Wingdings" w:hint="default"/>
+        <w:sz w:val="20"/>
+      </w:rPr>
+    </w:lvl>
+    <w:lvl w:ilvl="4" w:tentative="1">
+      <w:start w:val="1"/>
+      <w:numFmt w:val="bullet"/>
+      <w:lvlText w:val=""/>
+      <w:lvlJc w:val="left"/>
+      <w:pPr>
+        <w:tabs>
+          <w:tab w:val="num" w:pos="3600"/>
+        </w:tabs>
+        <w:ind w:left="3600" w:hanging="360"/>
+      </w:pPr>
+      <w:rPr>
+        <w:rFonts w:ascii="Wingdings" w:hAnsi="Wingdings" w:hint="default"/>
+        <w:sz w:val="20"/>
+      </w:rPr>
+    </w:lvl>
+    <w:lvl w:ilvl="5" w:tentative="1">
+      <w:start w:val="1"/>
+      <w:numFmt w:val="bullet"/>
+      <w:lvlText w:val=""/>
+      <w:lvlJc w:val="left"/>
+      <w:pPr>
+        <w:tabs>
+          <w:tab w:val="num" w:pos="4320"/>
+        </w:tabs>
+        <w:ind w:left="4320" w:hanging="360"/>
+      </w:pPr>
+      <w:rPr>
+        <w:rFonts w:ascii="Wingdings" w:hAnsi="Wingdings" w:hint="default"/>
+        <w:sz w:val="20"/>
+      </w:rPr>
+    </w:lvl>
+    <w:lvl w:ilvl="6" w:tentative="1">
+      <w:start w:val="1"/>
+      <w:numFmt w:val="bullet"/>
+      <w:lvlText w:val=""/>
+      <w:lvlJc w:val="left"/>
+      <w:pPr>
+        <w:tabs>
+          <w:tab w:val="num" w:pos="5040"/>
+        </w:tabs>
+        <w:ind w:left="5040" w:hanging="360"/>
+      </w:pPr>
+      <w:rPr>
+        <w:rFonts w:ascii="Wingdings" w:hAnsi="Wingdings" w:hint="default"/>
+        <w:sz w:val="20"/>
+      </w:rPr>
+    </w:lvl>
+    <w:lvl w:ilvl="7" w:tentative="1">
+      <w:start w:val="1"/>
+      <w:numFmt w:val="bullet"/>
+      <w:lvlText w:val=""/>
+      <w:lvlJc w:val="left"/>
+      <w:pPr>
+        <w:tabs>
+          <w:tab w:val="num" w:pos="5760"/>
+        </w:tabs>
+        <w:ind w:left="5760" w:hanging="360"/>
+      </w:pPr>
+      <w:rPr>
+        <w:rFonts w:ascii="Wingdings" w:hAnsi="Wingdings" w:hint="default"/>
+        <w:sz w:val="20"/>
+      </w:rPr>
+    </w:lvl>
+    <w:lvl w:ilvl="8" w:tentative="1">
+      <w:start w:val="1"/>
+      <w:numFmt w:val="bullet"/>
+      <w:lvlText w:val=""/>
+      <w:lvlJc w:val="left"/>
+      <w:pPr>
+        <w:tabs>
+          <w:tab w:val="num" w:pos="6480"/>
+        </w:tabs>
+        <w:ind w:left="6480" w:hanging="360"/>
+      </w:pPr>
+      <w:rPr>
+        <w:rFonts w:ascii="Wingdings" w:hAnsi="Wingdings" w:hint="default"/>
+        <w:sz w:val="20"/>
+      </w:rPr>
+    </w:lvl>
+  </w:abstractNum>
+  <w:abstractNum w:abstractNumId="5" w15:restartNumberingAfterBreak="0">
     <w:nsid w:val="38252712"/>
     <w:multiLevelType w:val="multilevel"/>
     <w:tmpl w:val="1BACE01C"/>
@@ -2954,7 +4975,7 @@
       </w:rPr>
     </w:lvl>
   </w:abstractNum>
-  <w:abstractNum w:abstractNumId="3" w15:restartNumberingAfterBreak="0">
+  <w:abstractNum w:abstractNumId="6" w15:restartNumberingAfterBreak="0">
     <w:nsid w:val="424D47D2"/>
     <w:multiLevelType w:val="multilevel"/>
     <w:tmpl w:val="114E598E"/>
@@ -3103,7 +5124,305 @@
       </w:rPr>
     </w:lvl>
   </w:abstractNum>
-  <w:abstractNum w:abstractNumId="4" w15:restartNumberingAfterBreak="0">
+  <w:abstractNum w:abstractNumId="7" w15:restartNumberingAfterBreak="0">
+    <w:nsid w:val="439F6F7A"/>
+    <w:multiLevelType w:val="multilevel"/>
+    <w:tmpl w:val="B0AC5594"/>
+    <w:lvl w:ilvl="0">
+      <w:start w:val="1"/>
+      <w:numFmt w:val="bullet"/>
+      <w:lvlText w:val=""/>
+      <w:lvlJc w:val="left"/>
+      <w:pPr>
+        <w:tabs>
+          <w:tab w:val="num" w:pos="720"/>
+        </w:tabs>
+        <w:ind w:left="720" w:hanging="360"/>
+      </w:pPr>
+      <w:rPr>
+        <w:rFonts w:ascii="Symbol" w:hAnsi="Symbol" w:hint="default"/>
+        <w:sz w:val="20"/>
+      </w:rPr>
+    </w:lvl>
+    <w:lvl w:ilvl="1" w:tentative="1">
+      <w:start w:val="1"/>
+      <w:numFmt w:val="bullet"/>
+      <w:lvlText w:val="o"/>
+      <w:lvlJc w:val="left"/>
+      <w:pPr>
+        <w:tabs>
+          <w:tab w:val="num" w:pos="1440"/>
+        </w:tabs>
+        <w:ind w:left="1440" w:hanging="360"/>
+      </w:pPr>
+      <w:rPr>
+        <w:rFonts w:ascii="Courier New" w:hAnsi="Courier New" w:hint="default"/>
+        <w:sz w:val="20"/>
+      </w:rPr>
+    </w:lvl>
+    <w:lvl w:ilvl="2" w:tentative="1">
+      <w:start w:val="1"/>
+      <w:numFmt w:val="bullet"/>
+      <w:lvlText w:val=""/>
+      <w:lvlJc w:val="left"/>
+      <w:pPr>
+        <w:tabs>
+          <w:tab w:val="num" w:pos="2160"/>
+        </w:tabs>
+        <w:ind w:left="2160" w:hanging="360"/>
+      </w:pPr>
+      <w:rPr>
+        <w:rFonts w:ascii="Wingdings" w:hAnsi="Wingdings" w:hint="default"/>
+        <w:sz w:val="20"/>
+      </w:rPr>
+    </w:lvl>
+    <w:lvl w:ilvl="3" w:tentative="1">
+      <w:start w:val="1"/>
+      <w:numFmt w:val="bullet"/>
+      <w:lvlText w:val=""/>
+      <w:lvlJc w:val="left"/>
+      <w:pPr>
+        <w:tabs>
+          <w:tab w:val="num" w:pos="2880"/>
+        </w:tabs>
+        <w:ind w:left="2880" w:hanging="360"/>
+      </w:pPr>
+      <w:rPr>
+        <w:rFonts w:ascii="Wingdings" w:hAnsi="Wingdings" w:hint="default"/>
+        <w:sz w:val="20"/>
+      </w:rPr>
+    </w:lvl>
+    <w:lvl w:ilvl="4" w:tentative="1">
+      <w:start w:val="1"/>
+      <w:numFmt w:val="bullet"/>
+      <w:lvlText w:val=""/>
+      <w:lvlJc w:val="left"/>
+      <w:pPr>
+        <w:tabs>
+          <w:tab w:val="num" w:pos="3600"/>
+        </w:tabs>
+        <w:ind w:left="3600" w:hanging="360"/>
+      </w:pPr>
+      <w:rPr>
+        <w:rFonts w:ascii="Wingdings" w:hAnsi="Wingdings" w:hint="default"/>
+        <w:sz w:val="20"/>
+      </w:rPr>
+    </w:lvl>
+    <w:lvl w:ilvl="5" w:tentative="1">
+      <w:start w:val="1"/>
+      <w:numFmt w:val="bullet"/>
+      <w:lvlText w:val=""/>
+      <w:lvlJc w:val="left"/>
+      <w:pPr>
+        <w:tabs>
+          <w:tab w:val="num" w:pos="4320"/>
+        </w:tabs>
+        <w:ind w:left="4320" w:hanging="360"/>
+      </w:pPr>
+      <w:rPr>
+        <w:rFonts w:ascii="Wingdings" w:hAnsi="Wingdings" w:hint="default"/>
+        <w:sz w:val="20"/>
+      </w:rPr>
+    </w:lvl>
+    <w:lvl w:ilvl="6" w:tentative="1">
+      <w:start w:val="1"/>
+      <w:numFmt w:val="bullet"/>
+      <w:lvlText w:val=""/>
+      <w:lvlJc w:val="left"/>
+      <w:pPr>
+        <w:tabs>
+          <w:tab w:val="num" w:pos="5040"/>
+        </w:tabs>
+        <w:ind w:left="5040" w:hanging="360"/>
+      </w:pPr>
+      <w:rPr>
+        <w:rFonts w:ascii="Wingdings" w:hAnsi="Wingdings" w:hint="default"/>
+        <w:sz w:val="20"/>
+      </w:rPr>
+    </w:lvl>
+    <w:lvl w:ilvl="7" w:tentative="1">
+      <w:start w:val="1"/>
+      <w:numFmt w:val="bullet"/>
+      <w:lvlText w:val=""/>
+      <w:lvlJc w:val="left"/>
+      <w:pPr>
+        <w:tabs>
+          <w:tab w:val="num" w:pos="5760"/>
+        </w:tabs>
+        <w:ind w:left="5760" w:hanging="360"/>
+      </w:pPr>
+      <w:rPr>
+        <w:rFonts w:ascii="Wingdings" w:hAnsi="Wingdings" w:hint="default"/>
+        <w:sz w:val="20"/>
+      </w:rPr>
+    </w:lvl>
+    <w:lvl w:ilvl="8" w:tentative="1">
+      <w:start w:val="1"/>
+      <w:numFmt w:val="bullet"/>
+      <w:lvlText w:val=""/>
+      <w:lvlJc w:val="left"/>
+      <w:pPr>
+        <w:tabs>
+          <w:tab w:val="num" w:pos="6480"/>
+        </w:tabs>
+        <w:ind w:left="6480" w:hanging="360"/>
+      </w:pPr>
+      <w:rPr>
+        <w:rFonts w:ascii="Wingdings" w:hAnsi="Wingdings" w:hint="default"/>
+        <w:sz w:val="20"/>
+      </w:rPr>
+    </w:lvl>
+  </w:abstractNum>
+  <w:abstractNum w:abstractNumId="8" w15:restartNumberingAfterBreak="0">
+    <w:nsid w:val="4AA71D57"/>
+    <w:multiLevelType w:val="multilevel"/>
+    <w:tmpl w:val="B8BA2D96"/>
+    <w:lvl w:ilvl="0">
+      <w:start w:val="1"/>
+      <w:numFmt w:val="bullet"/>
+      <w:lvlText w:val=""/>
+      <w:lvlJc w:val="left"/>
+      <w:pPr>
+        <w:tabs>
+          <w:tab w:val="num" w:pos="720"/>
+        </w:tabs>
+        <w:ind w:left="720" w:hanging="360"/>
+      </w:pPr>
+      <w:rPr>
+        <w:rFonts w:ascii="Symbol" w:hAnsi="Symbol" w:hint="default"/>
+        <w:sz w:val="20"/>
+      </w:rPr>
+    </w:lvl>
+    <w:lvl w:ilvl="1" w:tentative="1">
+      <w:start w:val="1"/>
+      <w:numFmt w:val="bullet"/>
+      <w:lvlText w:val="o"/>
+      <w:lvlJc w:val="left"/>
+      <w:pPr>
+        <w:tabs>
+          <w:tab w:val="num" w:pos="1440"/>
+        </w:tabs>
+        <w:ind w:left="1440" w:hanging="360"/>
+      </w:pPr>
+      <w:rPr>
+        <w:rFonts w:ascii="Courier New" w:hAnsi="Courier New" w:hint="default"/>
+        <w:sz w:val="20"/>
+      </w:rPr>
+    </w:lvl>
+    <w:lvl w:ilvl="2" w:tentative="1">
+      <w:start w:val="1"/>
+      <w:numFmt w:val="bullet"/>
+      <w:lvlText w:val=""/>
+      <w:lvlJc w:val="left"/>
+      <w:pPr>
+        <w:tabs>
+          <w:tab w:val="num" w:pos="2160"/>
+        </w:tabs>
+        <w:ind w:left="2160" w:hanging="360"/>
+      </w:pPr>
+      <w:rPr>
+        <w:rFonts w:ascii="Wingdings" w:hAnsi="Wingdings" w:hint="default"/>
+        <w:sz w:val="20"/>
+      </w:rPr>
+    </w:lvl>
+    <w:lvl w:ilvl="3" w:tentative="1">
+      <w:start w:val="1"/>
+      <w:numFmt w:val="bullet"/>
+      <w:lvlText w:val=""/>
+      <w:lvlJc w:val="left"/>
+      <w:pPr>
+        <w:tabs>
+          <w:tab w:val="num" w:pos="2880"/>
+        </w:tabs>
+        <w:ind w:left="2880" w:hanging="360"/>
+      </w:pPr>
+      <w:rPr>
+        <w:rFonts w:ascii="Wingdings" w:hAnsi="Wingdings" w:hint="default"/>
+        <w:sz w:val="20"/>
+      </w:rPr>
+    </w:lvl>
+    <w:lvl w:ilvl="4" w:tentative="1">
+      <w:start w:val="1"/>
+      <w:numFmt w:val="bullet"/>
+      <w:lvlText w:val=""/>
+      <w:lvlJc w:val="left"/>
+      <w:pPr>
+        <w:tabs>
+          <w:tab w:val="num" w:pos="3600"/>
+        </w:tabs>
+        <w:ind w:left="3600" w:hanging="360"/>
+      </w:pPr>
+      <w:rPr>
+        <w:rFonts w:ascii="Wingdings" w:hAnsi="Wingdings" w:hint="default"/>
+        <w:sz w:val="20"/>
+      </w:rPr>
+    </w:lvl>
+    <w:lvl w:ilvl="5" w:tentative="1">
+      <w:start w:val="1"/>
+      <w:numFmt w:val="bullet"/>
+      <w:lvlText w:val=""/>
+      <w:lvlJc w:val="left"/>
+      <w:pPr>
+        <w:tabs>
+          <w:tab w:val="num" w:pos="4320"/>
+        </w:tabs>
+        <w:ind w:left="4320" w:hanging="360"/>
+      </w:pPr>
+      <w:rPr>
+        <w:rFonts w:ascii="Wingdings" w:hAnsi="Wingdings" w:hint="default"/>
+        <w:sz w:val="20"/>
+      </w:rPr>
+    </w:lvl>
+    <w:lvl w:ilvl="6" w:tentative="1">
+      <w:start w:val="1"/>
+      <w:numFmt w:val="bullet"/>
+      <w:lvlText w:val=""/>
+      <w:lvlJc w:val="left"/>
+      <w:pPr>
+        <w:tabs>
+          <w:tab w:val="num" w:pos="5040"/>
+        </w:tabs>
+        <w:ind w:left="5040" w:hanging="360"/>
+      </w:pPr>
+      <w:rPr>
+        <w:rFonts w:ascii="Wingdings" w:hAnsi="Wingdings" w:hint="default"/>
+        <w:sz w:val="20"/>
+      </w:rPr>
+    </w:lvl>
+    <w:lvl w:ilvl="7" w:tentative="1">
+      <w:start w:val="1"/>
+      <w:numFmt w:val="bullet"/>
+      <w:lvlText w:val=""/>
+      <w:lvlJc w:val="left"/>
+      <w:pPr>
+        <w:tabs>
+          <w:tab w:val="num" w:pos="5760"/>
+        </w:tabs>
+        <w:ind w:left="5760" w:hanging="360"/>
+      </w:pPr>
+      <w:rPr>
+        <w:rFonts w:ascii="Wingdings" w:hAnsi="Wingdings" w:hint="default"/>
+        <w:sz w:val="20"/>
+      </w:rPr>
+    </w:lvl>
+    <w:lvl w:ilvl="8" w:tentative="1">
+      <w:start w:val="1"/>
+      <w:numFmt w:val="bullet"/>
+      <w:lvlText w:val=""/>
+      <w:lvlJc w:val="left"/>
+      <w:pPr>
+        <w:tabs>
+          <w:tab w:val="num" w:pos="6480"/>
+        </w:tabs>
+        <w:ind w:left="6480" w:hanging="360"/>
+      </w:pPr>
+      <w:rPr>
+        <w:rFonts w:ascii="Wingdings" w:hAnsi="Wingdings" w:hint="default"/>
+        <w:sz w:val="20"/>
+      </w:rPr>
+    </w:lvl>
+  </w:abstractNum>
+  <w:abstractNum w:abstractNumId="9" w15:restartNumberingAfterBreak="0">
     <w:nsid w:val="4E5F45BA"/>
     <w:multiLevelType w:val="multilevel"/>
     <w:tmpl w:val="4CCC82FA"/>
@@ -3252,7 +5571,156 @@
       </w:rPr>
     </w:lvl>
   </w:abstractNum>
-  <w:abstractNum w:abstractNumId="5" w15:restartNumberingAfterBreak="0">
+  <w:abstractNum w:abstractNumId="10" w15:restartNumberingAfterBreak="0">
+    <w:nsid w:val="53330855"/>
+    <w:multiLevelType w:val="multilevel"/>
+    <w:tmpl w:val="BA200500"/>
+    <w:lvl w:ilvl="0">
+      <w:start w:val="1"/>
+      <w:numFmt w:val="bullet"/>
+      <w:lvlText w:val=""/>
+      <w:lvlJc w:val="left"/>
+      <w:pPr>
+        <w:tabs>
+          <w:tab w:val="num" w:pos="720"/>
+        </w:tabs>
+        <w:ind w:left="720" w:hanging="360"/>
+      </w:pPr>
+      <w:rPr>
+        <w:rFonts w:ascii="Symbol" w:hAnsi="Symbol" w:hint="default"/>
+        <w:sz w:val="20"/>
+      </w:rPr>
+    </w:lvl>
+    <w:lvl w:ilvl="1" w:tentative="1">
+      <w:start w:val="1"/>
+      <w:numFmt w:val="bullet"/>
+      <w:lvlText w:val="o"/>
+      <w:lvlJc w:val="left"/>
+      <w:pPr>
+        <w:tabs>
+          <w:tab w:val="num" w:pos="1440"/>
+        </w:tabs>
+        <w:ind w:left="1440" w:hanging="360"/>
+      </w:pPr>
+      <w:rPr>
+        <w:rFonts w:ascii="Courier New" w:hAnsi="Courier New" w:hint="default"/>
+        <w:sz w:val="20"/>
+      </w:rPr>
+    </w:lvl>
+    <w:lvl w:ilvl="2" w:tentative="1">
+      <w:start w:val="1"/>
+      <w:numFmt w:val="bullet"/>
+      <w:lvlText w:val=""/>
+      <w:lvlJc w:val="left"/>
+      <w:pPr>
+        <w:tabs>
+          <w:tab w:val="num" w:pos="2160"/>
+        </w:tabs>
+        <w:ind w:left="2160" w:hanging="360"/>
+      </w:pPr>
+      <w:rPr>
+        <w:rFonts w:ascii="Wingdings" w:hAnsi="Wingdings" w:hint="default"/>
+        <w:sz w:val="20"/>
+      </w:rPr>
+    </w:lvl>
+    <w:lvl w:ilvl="3" w:tentative="1">
+      <w:start w:val="1"/>
+      <w:numFmt w:val="bullet"/>
+      <w:lvlText w:val=""/>
+      <w:lvlJc w:val="left"/>
+      <w:pPr>
+        <w:tabs>
+          <w:tab w:val="num" w:pos="2880"/>
+        </w:tabs>
+        <w:ind w:left="2880" w:hanging="360"/>
+      </w:pPr>
+      <w:rPr>
+        <w:rFonts w:ascii="Wingdings" w:hAnsi="Wingdings" w:hint="default"/>
+        <w:sz w:val="20"/>
+      </w:rPr>
+    </w:lvl>
+    <w:lvl w:ilvl="4" w:tentative="1">
+      <w:start w:val="1"/>
+      <w:numFmt w:val="bullet"/>
+      <w:lvlText w:val=""/>
+      <w:lvlJc w:val="left"/>
+      <w:pPr>
+        <w:tabs>
+          <w:tab w:val="num" w:pos="3600"/>
+        </w:tabs>
+        <w:ind w:left="3600" w:hanging="360"/>
+      </w:pPr>
+      <w:rPr>
+        <w:rFonts w:ascii="Wingdings" w:hAnsi="Wingdings" w:hint="default"/>
+        <w:sz w:val="20"/>
+      </w:rPr>
+    </w:lvl>
+    <w:lvl w:ilvl="5" w:tentative="1">
+      <w:start w:val="1"/>
+      <w:numFmt w:val="bullet"/>
+      <w:lvlText w:val=""/>
+      <w:lvlJc w:val="left"/>
+      <w:pPr>
+        <w:tabs>
+          <w:tab w:val="num" w:pos="4320"/>
+        </w:tabs>
+        <w:ind w:left="4320" w:hanging="360"/>
+      </w:pPr>
+      <w:rPr>
+        <w:rFonts w:ascii="Wingdings" w:hAnsi="Wingdings" w:hint="default"/>
+        <w:sz w:val="20"/>
+      </w:rPr>
+    </w:lvl>
+    <w:lvl w:ilvl="6" w:tentative="1">
+      <w:start w:val="1"/>
+      <w:numFmt w:val="bullet"/>
+      <w:lvlText w:val=""/>
+      <w:lvlJc w:val="left"/>
+      <w:pPr>
+        <w:tabs>
+          <w:tab w:val="num" w:pos="5040"/>
+        </w:tabs>
+        <w:ind w:left="5040" w:hanging="360"/>
+      </w:pPr>
+      <w:rPr>
+        <w:rFonts w:ascii="Wingdings" w:hAnsi="Wingdings" w:hint="default"/>
+        <w:sz w:val="20"/>
+      </w:rPr>
+    </w:lvl>
+    <w:lvl w:ilvl="7" w:tentative="1">
+      <w:start w:val="1"/>
+      <w:numFmt w:val="bullet"/>
+      <w:lvlText w:val=""/>
+      <w:lvlJc w:val="left"/>
+      <w:pPr>
+        <w:tabs>
+          <w:tab w:val="num" w:pos="5760"/>
+        </w:tabs>
+        <w:ind w:left="5760" w:hanging="360"/>
+      </w:pPr>
+      <w:rPr>
+        <w:rFonts w:ascii="Wingdings" w:hAnsi="Wingdings" w:hint="default"/>
+        <w:sz w:val="20"/>
+      </w:rPr>
+    </w:lvl>
+    <w:lvl w:ilvl="8" w:tentative="1">
+      <w:start w:val="1"/>
+      <w:numFmt w:val="bullet"/>
+      <w:lvlText w:val=""/>
+      <w:lvlJc w:val="left"/>
+      <w:pPr>
+        <w:tabs>
+          <w:tab w:val="num" w:pos="6480"/>
+        </w:tabs>
+        <w:ind w:left="6480" w:hanging="360"/>
+      </w:pPr>
+      <w:rPr>
+        <w:rFonts w:ascii="Wingdings" w:hAnsi="Wingdings" w:hint="default"/>
+        <w:sz w:val="20"/>
+      </w:rPr>
+    </w:lvl>
+  </w:abstractNum>
+  <w:abstractNum w:abstractNumId="11" w15:restartNumberingAfterBreak="0">
     <w:nsid w:val="563900D1"/>
     <w:multiLevelType w:val="multilevel"/>
     <w:tmpl w:val="06A89ECA"/>
@@ -3401,7 +5869,156 @@
       </w:rPr>
     </w:lvl>
   </w:abstractNum>
-  <w:abstractNum w:abstractNumId="6" w15:restartNumberingAfterBreak="0">
+  <w:abstractNum w:abstractNumId="12" w15:restartNumberingAfterBreak="0">
+    <w:nsid w:val="5E4B2D1C"/>
+    <w:multiLevelType w:val="multilevel"/>
+    <w:tmpl w:val="768C58D2"/>
+    <w:lvl w:ilvl="0">
+      <w:start w:val="1"/>
+      <w:numFmt w:val="bullet"/>
+      <w:lvlText w:val=""/>
+      <w:lvlJc w:val="left"/>
+      <w:pPr>
+        <w:tabs>
+          <w:tab w:val="num" w:pos="720"/>
+        </w:tabs>
+        <w:ind w:left="720" w:hanging="360"/>
+      </w:pPr>
+      <w:rPr>
+        <w:rFonts w:ascii="Symbol" w:hAnsi="Symbol" w:hint="default"/>
+        <w:sz w:val="20"/>
+      </w:rPr>
+    </w:lvl>
+    <w:lvl w:ilvl="1" w:tentative="1">
+      <w:start w:val="1"/>
+      <w:numFmt w:val="bullet"/>
+      <w:lvlText w:val="o"/>
+      <w:lvlJc w:val="left"/>
+      <w:pPr>
+        <w:tabs>
+          <w:tab w:val="num" w:pos="1440"/>
+        </w:tabs>
+        <w:ind w:left="1440" w:hanging="360"/>
+      </w:pPr>
+      <w:rPr>
+        <w:rFonts w:ascii="Courier New" w:hAnsi="Courier New" w:hint="default"/>
+        <w:sz w:val="20"/>
+      </w:rPr>
+    </w:lvl>
+    <w:lvl w:ilvl="2" w:tentative="1">
+      <w:start w:val="1"/>
+      <w:numFmt w:val="bullet"/>
+      <w:lvlText w:val=""/>
+      <w:lvlJc w:val="left"/>
+      <w:pPr>
+        <w:tabs>
+          <w:tab w:val="num" w:pos="2160"/>
+        </w:tabs>
+        <w:ind w:left="2160" w:hanging="360"/>
+      </w:pPr>
+      <w:rPr>
+        <w:rFonts w:ascii="Wingdings" w:hAnsi="Wingdings" w:hint="default"/>
+        <w:sz w:val="20"/>
+      </w:rPr>
+    </w:lvl>
+    <w:lvl w:ilvl="3" w:tentative="1">
+      <w:start w:val="1"/>
+      <w:numFmt w:val="bullet"/>
+      <w:lvlText w:val=""/>
+      <w:lvlJc w:val="left"/>
+      <w:pPr>
+        <w:tabs>
+          <w:tab w:val="num" w:pos="2880"/>
+        </w:tabs>
+        <w:ind w:left="2880" w:hanging="360"/>
+      </w:pPr>
+      <w:rPr>
+        <w:rFonts w:ascii="Wingdings" w:hAnsi="Wingdings" w:hint="default"/>
+        <w:sz w:val="20"/>
+      </w:rPr>
+    </w:lvl>
+    <w:lvl w:ilvl="4" w:tentative="1">
+      <w:start w:val="1"/>
+      <w:numFmt w:val="bullet"/>
+      <w:lvlText w:val=""/>
+      <w:lvlJc w:val="left"/>
+      <w:pPr>
+        <w:tabs>
+          <w:tab w:val="num" w:pos="3600"/>
+        </w:tabs>
+        <w:ind w:left="3600" w:hanging="360"/>
+      </w:pPr>
+      <w:rPr>
+        <w:rFonts w:ascii="Wingdings" w:hAnsi="Wingdings" w:hint="default"/>
+        <w:sz w:val="20"/>
+      </w:rPr>
+    </w:lvl>
+    <w:lvl w:ilvl="5" w:tentative="1">
+      <w:start w:val="1"/>
+      <w:numFmt w:val="bullet"/>
+      <w:lvlText w:val=""/>
+      <w:lvlJc w:val="left"/>
+      <w:pPr>
+        <w:tabs>
+          <w:tab w:val="num" w:pos="4320"/>
+        </w:tabs>
+        <w:ind w:left="4320" w:hanging="360"/>
+      </w:pPr>
+      <w:rPr>
+        <w:rFonts w:ascii="Wingdings" w:hAnsi="Wingdings" w:hint="default"/>
+        <w:sz w:val="20"/>
+      </w:rPr>
+    </w:lvl>
+    <w:lvl w:ilvl="6" w:tentative="1">
+      <w:start w:val="1"/>
+      <w:numFmt w:val="bullet"/>
+      <w:lvlText w:val=""/>
+      <w:lvlJc w:val="left"/>
+      <w:pPr>
+        <w:tabs>
+          <w:tab w:val="num" w:pos="5040"/>
+        </w:tabs>
+        <w:ind w:left="5040" w:hanging="360"/>
+      </w:pPr>
+      <w:rPr>
+        <w:rFonts w:ascii="Wingdings" w:hAnsi="Wingdings" w:hint="default"/>
+        <w:sz w:val="20"/>
+      </w:rPr>
+    </w:lvl>
+    <w:lvl w:ilvl="7" w:tentative="1">
+      <w:start w:val="1"/>
+      <w:numFmt w:val="bullet"/>
+      <w:lvlText w:val=""/>
+      <w:lvlJc w:val="left"/>
+      <w:pPr>
+        <w:tabs>
+          <w:tab w:val="num" w:pos="5760"/>
+        </w:tabs>
+        <w:ind w:left="5760" w:hanging="360"/>
+      </w:pPr>
+      <w:rPr>
+        <w:rFonts w:ascii="Wingdings" w:hAnsi="Wingdings" w:hint="default"/>
+        <w:sz w:val="20"/>
+      </w:rPr>
+    </w:lvl>
+    <w:lvl w:ilvl="8" w:tentative="1">
+      <w:start w:val="1"/>
+      <w:numFmt w:val="bullet"/>
+      <w:lvlText w:val=""/>
+      <w:lvlJc w:val="left"/>
+      <w:pPr>
+        <w:tabs>
+          <w:tab w:val="num" w:pos="6480"/>
+        </w:tabs>
+        <w:ind w:left="6480" w:hanging="360"/>
+      </w:pPr>
+      <w:rPr>
+        <w:rFonts w:ascii="Wingdings" w:hAnsi="Wingdings" w:hint="default"/>
+        <w:sz w:val="20"/>
+      </w:rPr>
+    </w:lvl>
+  </w:abstractNum>
+  <w:abstractNum w:abstractNumId="13" w15:restartNumberingAfterBreak="0">
     <w:nsid w:val="61524A92"/>
     <w:multiLevelType w:val="multilevel"/>
     <w:tmpl w:val="FACC0D5C"/>
@@ -3550,7 +6167,156 @@
       </w:rPr>
     </w:lvl>
   </w:abstractNum>
-  <w:abstractNum w:abstractNumId="7" w15:restartNumberingAfterBreak="0">
+  <w:abstractNum w:abstractNumId="14" w15:restartNumberingAfterBreak="0">
+    <w:nsid w:val="65581E16"/>
+    <w:multiLevelType w:val="multilevel"/>
+    <w:tmpl w:val="CF74520A"/>
+    <w:lvl w:ilvl="0">
+      <w:start w:val="1"/>
+      <w:numFmt w:val="bullet"/>
+      <w:lvlText w:val=""/>
+      <w:lvlJc w:val="left"/>
+      <w:pPr>
+        <w:tabs>
+          <w:tab w:val="num" w:pos="720"/>
+        </w:tabs>
+        <w:ind w:left="720" w:hanging="360"/>
+      </w:pPr>
+      <w:rPr>
+        <w:rFonts w:ascii="Symbol" w:hAnsi="Symbol" w:hint="default"/>
+        <w:sz w:val="20"/>
+      </w:rPr>
+    </w:lvl>
+    <w:lvl w:ilvl="1" w:tentative="1">
+      <w:start w:val="1"/>
+      <w:numFmt w:val="bullet"/>
+      <w:lvlText w:val="o"/>
+      <w:lvlJc w:val="left"/>
+      <w:pPr>
+        <w:tabs>
+          <w:tab w:val="num" w:pos="1440"/>
+        </w:tabs>
+        <w:ind w:left="1440" w:hanging="360"/>
+      </w:pPr>
+      <w:rPr>
+        <w:rFonts w:ascii="Courier New" w:hAnsi="Courier New" w:hint="default"/>
+        <w:sz w:val="20"/>
+      </w:rPr>
+    </w:lvl>
+    <w:lvl w:ilvl="2" w:tentative="1">
+      <w:start w:val="1"/>
+      <w:numFmt w:val="bullet"/>
+      <w:lvlText w:val=""/>
+      <w:lvlJc w:val="left"/>
+      <w:pPr>
+        <w:tabs>
+          <w:tab w:val="num" w:pos="2160"/>
+        </w:tabs>
+        <w:ind w:left="2160" w:hanging="360"/>
+      </w:pPr>
+      <w:rPr>
+        <w:rFonts w:ascii="Wingdings" w:hAnsi="Wingdings" w:hint="default"/>
+        <w:sz w:val="20"/>
+      </w:rPr>
+    </w:lvl>
+    <w:lvl w:ilvl="3" w:tentative="1">
+      <w:start w:val="1"/>
+      <w:numFmt w:val="bullet"/>
+      <w:lvlText w:val=""/>
+      <w:lvlJc w:val="left"/>
+      <w:pPr>
+        <w:tabs>
+          <w:tab w:val="num" w:pos="2880"/>
+        </w:tabs>
+        <w:ind w:left="2880" w:hanging="360"/>
+      </w:pPr>
+      <w:rPr>
+        <w:rFonts w:ascii="Wingdings" w:hAnsi="Wingdings" w:hint="default"/>
+        <w:sz w:val="20"/>
+      </w:rPr>
+    </w:lvl>
+    <w:lvl w:ilvl="4" w:tentative="1">
+      <w:start w:val="1"/>
+      <w:numFmt w:val="bullet"/>
+      <w:lvlText w:val=""/>
+      <w:lvlJc w:val="left"/>
+      <w:pPr>
+        <w:tabs>
+          <w:tab w:val="num" w:pos="3600"/>
+        </w:tabs>
+        <w:ind w:left="3600" w:hanging="360"/>
+      </w:pPr>
+      <w:rPr>
+        <w:rFonts w:ascii="Wingdings" w:hAnsi="Wingdings" w:hint="default"/>
+        <w:sz w:val="20"/>
+      </w:rPr>
+    </w:lvl>
+    <w:lvl w:ilvl="5" w:tentative="1">
+      <w:start w:val="1"/>
+      <w:numFmt w:val="bullet"/>
+      <w:lvlText w:val=""/>
+      <w:lvlJc w:val="left"/>
+      <w:pPr>
+        <w:tabs>
+          <w:tab w:val="num" w:pos="4320"/>
+        </w:tabs>
+        <w:ind w:left="4320" w:hanging="360"/>
+      </w:pPr>
+      <w:rPr>
+        <w:rFonts w:ascii="Wingdings" w:hAnsi="Wingdings" w:hint="default"/>
+        <w:sz w:val="20"/>
+      </w:rPr>
+    </w:lvl>
+    <w:lvl w:ilvl="6" w:tentative="1">
+      <w:start w:val="1"/>
+      <w:numFmt w:val="bullet"/>
+      <w:lvlText w:val=""/>
+      <w:lvlJc w:val="left"/>
+      <w:pPr>
+        <w:tabs>
+          <w:tab w:val="num" w:pos="5040"/>
+        </w:tabs>
+        <w:ind w:left="5040" w:hanging="360"/>
+      </w:pPr>
+      <w:rPr>
+        <w:rFonts w:ascii="Wingdings" w:hAnsi="Wingdings" w:hint="default"/>
+        <w:sz w:val="20"/>
+      </w:rPr>
+    </w:lvl>
+    <w:lvl w:ilvl="7" w:tentative="1">
+      <w:start w:val="1"/>
+      <w:numFmt w:val="bullet"/>
+      <w:lvlText w:val=""/>
+      <w:lvlJc w:val="left"/>
+      <w:pPr>
+        <w:tabs>
+          <w:tab w:val="num" w:pos="5760"/>
+        </w:tabs>
+        <w:ind w:left="5760" w:hanging="360"/>
+      </w:pPr>
+      <w:rPr>
+        <w:rFonts w:ascii="Wingdings" w:hAnsi="Wingdings" w:hint="default"/>
+        <w:sz w:val="20"/>
+      </w:rPr>
+    </w:lvl>
+    <w:lvl w:ilvl="8" w:tentative="1">
+      <w:start w:val="1"/>
+      <w:numFmt w:val="bullet"/>
+      <w:lvlText w:val=""/>
+      <w:lvlJc w:val="left"/>
+      <w:pPr>
+        <w:tabs>
+          <w:tab w:val="num" w:pos="6480"/>
+        </w:tabs>
+        <w:ind w:left="6480" w:hanging="360"/>
+      </w:pPr>
+      <w:rPr>
+        <w:rFonts w:ascii="Wingdings" w:hAnsi="Wingdings" w:hint="default"/>
+        <w:sz w:val="20"/>
+      </w:rPr>
+    </w:lvl>
+  </w:abstractNum>
+  <w:abstractNum w:abstractNumId="15" w15:restartNumberingAfterBreak="0">
     <w:nsid w:val="70B93B44"/>
     <w:multiLevelType w:val="multilevel"/>
     <w:tmpl w:val="DF60ED56"/>
@@ -3699,7 +6465,156 @@
       </w:rPr>
     </w:lvl>
   </w:abstractNum>
-  <w:abstractNum w:abstractNumId="8" w15:restartNumberingAfterBreak="0">
+  <w:abstractNum w:abstractNumId="16" w15:restartNumberingAfterBreak="0">
+    <w:nsid w:val="71521F8E"/>
+    <w:multiLevelType w:val="multilevel"/>
+    <w:tmpl w:val="80A49D40"/>
+    <w:lvl w:ilvl="0">
+      <w:start w:val="1"/>
+      <w:numFmt w:val="bullet"/>
+      <w:lvlText w:val=""/>
+      <w:lvlJc w:val="left"/>
+      <w:pPr>
+        <w:tabs>
+          <w:tab w:val="num" w:pos="720"/>
+        </w:tabs>
+        <w:ind w:left="720" w:hanging="360"/>
+      </w:pPr>
+      <w:rPr>
+        <w:rFonts w:ascii="Symbol" w:hAnsi="Symbol" w:hint="default"/>
+        <w:sz w:val="20"/>
+      </w:rPr>
+    </w:lvl>
+    <w:lvl w:ilvl="1" w:tentative="1">
+      <w:start w:val="1"/>
+      <w:numFmt w:val="bullet"/>
+      <w:lvlText w:val="o"/>
+      <w:lvlJc w:val="left"/>
+      <w:pPr>
+        <w:tabs>
+          <w:tab w:val="num" w:pos="1440"/>
+        </w:tabs>
+        <w:ind w:left="1440" w:hanging="360"/>
+      </w:pPr>
+      <w:rPr>
+        <w:rFonts w:ascii="Courier New" w:hAnsi="Courier New" w:hint="default"/>
+        <w:sz w:val="20"/>
+      </w:rPr>
+    </w:lvl>
+    <w:lvl w:ilvl="2" w:tentative="1">
+      <w:start w:val="1"/>
+      <w:numFmt w:val="bullet"/>
+      <w:lvlText w:val=""/>
+      <w:lvlJc w:val="left"/>
+      <w:pPr>
+        <w:tabs>
+          <w:tab w:val="num" w:pos="2160"/>
+        </w:tabs>
+        <w:ind w:left="2160" w:hanging="360"/>
+      </w:pPr>
+      <w:rPr>
+        <w:rFonts w:ascii="Wingdings" w:hAnsi="Wingdings" w:hint="default"/>
+        <w:sz w:val="20"/>
+      </w:rPr>
+    </w:lvl>
+    <w:lvl w:ilvl="3" w:tentative="1">
+      <w:start w:val="1"/>
+      <w:numFmt w:val="bullet"/>
+      <w:lvlText w:val=""/>
+      <w:lvlJc w:val="left"/>
+      <w:pPr>
+        <w:tabs>
+          <w:tab w:val="num" w:pos="2880"/>
+        </w:tabs>
+        <w:ind w:left="2880" w:hanging="360"/>
+      </w:pPr>
+      <w:rPr>
+        <w:rFonts w:ascii="Wingdings" w:hAnsi="Wingdings" w:hint="default"/>
+        <w:sz w:val="20"/>
+      </w:rPr>
+    </w:lvl>
+    <w:lvl w:ilvl="4" w:tentative="1">
+      <w:start w:val="1"/>
+      <w:numFmt w:val="bullet"/>
+      <w:lvlText w:val=""/>
+      <w:lvlJc w:val="left"/>
+      <w:pPr>
+        <w:tabs>
+          <w:tab w:val="num" w:pos="3600"/>
+        </w:tabs>
+        <w:ind w:left="3600" w:hanging="360"/>
+      </w:pPr>
+      <w:rPr>
+        <w:rFonts w:ascii="Wingdings" w:hAnsi="Wingdings" w:hint="default"/>
+        <w:sz w:val="20"/>
+      </w:rPr>
+    </w:lvl>
+    <w:lvl w:ilvl="5" w:tentative="1">
+      <w:start w:val="1"/>
+      <w:numFmt w:val="bullet"/>
+      <w:lvlText w:val=""/>
+      <w:lvlJc w:val="left"/>
+      <w:pPr>
+        <w:tabs>
+          <w:tab w:val="num" w:pos="4320"/>
+        </w:tabs>
+        <w:ind w:left="4320" w:hanging="360"/>
+      </w:pPr>
+      <w:rPr>
+        <w:rFonts w:ascii="Wingdings" w:hAnsi="Wingdings" w:hint="default"/>
+        <w:sz w:val="20"/>
+      </w:rPr>
+    </w:lvl>
+    <w:lvl w:ilvl="6" w:tentative="1">
+      <w:start w:val="1"/>
+      <w:numFmt w:val="bullet"/>
+      <w:lvlText w:val=""/>
+      <w:lvlJc w:val="left"/>
+      <w:pPr>
+        <w:tabs>
+          <w:tab w:val="num" w:pos="5040"/>
+        </w:tabs>
+        <w:ind w:left="5040" w:hanging="360"/>
+      </w:pPr>
+      <w:rPr>
+        <w:rFonts w:ascii="Wingdings" w:hAnsi="Wingdings" w:hint="default"/>
+        <w:sz w:val="20"/>
+      </w:rPr>
+    </w:lvl>
+    <w:lvl w:ilvl="7" w:tentative="1">
+      <w:start w:val="1"/>
+      <w:numFmt w:val="bullet"/>
+      <w:lvlText w:val=""/>
+      <w:lvlJc w:val="left"/>
+      <w:pPr>
+        <w:tabs>
+          <w:tab w:val="num" w:pos="5760"/>
+        </w:tabs>
+        <w:ind w:left="5760" w:hanging="360"/>
+      </w:pPr>
+      <w:rPr>
+        <w:rFonts w:ascii="Wingdings" w:hAnsi="Wingdings" w:hint="default"/>
+        <w:sz w:val="20"/>
+      </w:rPr>
+    </w:lvl>
+    <w:lvl w:ilvl="8" w:tentative="1">
+      <w:start w:val="1"/>
+      <w:numFmt w:val="bullet"/>
+      <w:lvlText w:val=""/>
+      <w:lvlJc w:val="left"/>
+      <w:pPr>
+        <w:tabs>
+          <w:tab w:val="num" w:pos="6480"/>
+        </w:tabs>
+        <w:ind w:left="6480" w:hanging="360"/>
+      </w:pPr>
+      <w:rPr>
+        <w:rFonts w:ascii="Wingdings" w:hAnsi="Wingdings" w:hint="default"/>
+        <w:sz w:val="20"/>
+      </w:rPr>
+    </w:lvl>
+  </w:abstractNum>
+  <w:abstractNum w:abstractNumId="17" w15:restartNumberingAfterBreak="0">
     <w:nsid w:val="739B446C"/>
     <w:multiLevelType w:val="multilevel"/>
     <w:tmpl w:val="5600A75A"/>
@@ -3848,7 +6763,7 @@
       </w:rPr>
     </w:lvl>
   </w:abstractNum>
-  <w:abstractNum w:abstractNumId="9" w15:restartNumberingAfterBreak="0">
+  <w:abstractNum w:abstractNumId="18" w15:restartNumberingAfterBreak="0">
     <w:nsid w:val="7DDE7040"/>
     <w:multiLevelType w:val="multilevel"/>
     <w:tmpl w:val="50B0CD1A"/>
@@ -3998,34 +6913,61 @@
     </w:lvl>
   </w:abstractNum>
   <w:num w:numId="1" w16cid:durableId="350884524">
+    <w:abstractNumId w:val="2"/>
+  </w:num>
+  <w:num w:numId="2" w16cid:durableId="378750866">
+    <w:abstractNumId w:val="6"/>
+  </w:num>
+  <w:num w:numId="3" w16cid:durableId="1994096526">
+    <w:abstractNumId w:val="18"/>
+  </w:num>
+  <w:num w:numId="4" w16cid:durableId="335233769">
+    <w:abstractNumId w:val="9"/>
+  </w:num>
+  <w:num w:numId="5" w16cid:durableId="393285597">
+    <w:abstractNumId w:val="5"/>
+  </w:num>
+  <w:num w:numId="6" w16cid:durableId="410352494">
+    <w:abstractNumId w:val="11"/>
+  </w:num>
+  <w:num w:numId="7" w16cid:durableId="1949241657">
     <w:abstractNumId w:val="1"/>
   </w:num>
-  <w:num w:numId="2" w16cid:durableId="378750866">
+  <w:num w:numId="8" w16cid:durableId="1424912325">
+    <w:abstractNumId w:val="17"/>
+  </w:num>
+  <w:num w:numId="9" w16cid:durableId="1271815459">
+    <w:abstractNumId w:val="15"/>
+  </w:num>
+  <w:num w:numId="10" w16cid:durableId="72971102">
+    <w:abstractNumId w:val="13"/>
+  </w:num>
+  <w:num w:numId="11" w16cid:durableId="1510027599">
+    <w:abstractNumId w:val="14"/>
+  </w:num>
+  <w:num w:numId="12" w16cid:durableId="267667793">
+    <w:abstractNumId w:val="16"/>
+  </w:num>
+  <w:num w:numId="13" w16cid:durableId="93013707">
+    <w:abstractNumId w:val="12"/>
+  </w:num>
+  <w:num w:numId="14" w16cid:durableId="2035879187">
+    <w:abstractNumId w:val="4"/>
+  </w:num>
+  <w:num w:numId="15" w16cid:durableId="530342342">
+    <w:abstractNumId w:val="8"/>
+  </w:num>
+  <w:num w:numId="16" w16cid:durableId="1957253892">
     <w:abstractNumId w:val="3"/>
   </w:num>
-  <w:num w:numId="3" w16cid:durableId="1994096526">
-    <w:abstractNumId w:val="9"/>
-  </w:num>
-  <w:num w:numId="4" w16cid:durableId="335233769">
-    <w:abstractNumId w:val="4"/>
-  </w:num>
-  <w:num w:numId="5" w16cid:durableId="393285597">
-    <w:abstractNumId w:val="2"/>
-  </w:num>
-  <w:num w:numId="6" w16cid:durableId="410352494">
-    <w:abstractNumId w:val="5"/>
-  </w:num>
-  <w:num w:numId="7" w16cid:durableId="1949241657">
+  <w:num w:numId="17" w16cid:durableId="1003974214">
     <w:abstractNumId w:val="0"/>
   </w:num>
-  <w:num w:numId="8" w16cid:durableId="1424912325">
-    <w:abstractNumId w:val="8"/>
+  <w:num w:numId="18" w16cid:durableId="520777163">
+    <w:abstractNumId w:val="10"/>
   </w:num>
-  <w:num w:numId="9" w16cid:durableId="1271815459">
+  <w:num w:numId="19" w16cid:durableId="1283423073">
     <w:abstractNumId w:val="7"/>
-  </w:num>
-  <w:num w:numId="10" w16cid:durableId="72971102">
-    <w:abstractNumId w:val="6"/>
   </w:num>
 </w:numbering>
 </file>

</xml_diff>